<commit_message>
docs(paper): IEEE paper adds the TF-IDF baseline and the transformer negative result (tracked changes)
Co-Authored-By: Claude Opus 5.5 <noreply@anthropic.com>
</commit_message>
<xml_diff>
--- a/docs/research/Pashupatastra IEEE Paper.docx
+++ b/docs/research/Pashupatastra IEEE Paper.docx
@@ -86,6 +86,11 @@
         </w:rPr>
         <w:t xml:space="preserve">Language models can now read a security incident and suggest a fix in seconds. That is useful, and it is also the problem, because a confident wrong fix runs just as smoothly as a right one. This paper presents Pashupatastra, an implemented and publicly deployed system that carries security and infrastructure incidents through observation, correlation, diagnosis, authorization, execution and verification, and that keeps the language model out of the authorization step entirely. Its investigation agent, Sati, may only propose actions from a closed registry and may only cite records the system actually retrieved; citations are checked by exact match, and an answer with no valid citation is withheld. A deterministic policy engine prices each proposed action from a declared base risk plus context penalties that can only raise it, maps the price to one of four autonomy tiers, and issues a short lived verdict without which nothing executes. Every action declares its rollback and expected post state, and verification checks that state across a window of samples. I also introduce PIB, a 104 scenario benchmark that includes cases where the correct response is to do nothing or to hand off, and report four evaluations. On the 31 scenarios that run on the reference cluster, the architecture executed no incorrect action, where a threshold runbook got 6 of its 11 wrong, but it escalated every remediation case. Across all 104 scenarios, no forbidden action was scored autonomous in any of three contexts. In 147 turns where an attacker wrote every byte of the model output, nothing executed and every fabricated citation was caught. Against three local open weight models under indirect prompt injection, 216 attack turns produced no harmful proposal and no execution, though the payloads also failed against the models themselves. The results support a claim about containment, not about competence: diagnosis accuracy remains unmeasured, and the paper says why.</w:t>
       </w:r>
+      <w:ins w:id="91221" w:author="Claude" w:date="2026-10-27T00:00:00Z">
+        <w:r>
+          <w:t xml:space="preserve"> The nine models Sati runs on are trained in the project itself. On a pre-declared sample of an external root-cause benchmark, the project's ranker names the root first in 0.940 of cases, against 0.550 and 0.510 for two general language models given the same evidence.</w:t>
+        </w:r>
+      </w:ins>
     </w:p>
     <w:p>
       <w:pPr>
@@ -292,6 +297,21 @@
       <w:r>
         <w:t xml:space="preserve">PIB, a 104 scenario benchmark with negative and escalation cases in every category, and a four part evaluation: a cluster benchmark, a policy evaluation over the full corpus, a worst case bound in which an attacker controls the model output entirely, and indirect prompt injection against three real models. Every script and raw record for the last three is published.</w:t>
       </w:r>
+    </w:p>
+    <w:p>
+      <w:pPr>
+        <w:spacing w:after="0" w:line="240"/>
+        <w:ind w:firstLine="202"/>
+        <w:jc w:val="both"/>
+        <w:rPr>
+          <w:ins w:id="91000" w:author="Claude" w:date="2026-10-27T00:00:00Z"/>
+        </w:rPr>
+      </w:pPr>
+      <w:ins w:id="91001" w:author="Claude" w:date="2026-10-27T00:00:00Z">
+        <w:r>
+          <w:t xml:space="preserve">7) Nine models trained in this repository on public data, one for each stage of the loop, each evaluated with the split that keeps its test honest (by group, source, system, day or time) and against the strongest simple baseline, and served from the same exported weights that were evaluated.</w:t>
+        </w:r>
+      </w:ins>
     </w:p>
     <w:p>
       <w:pPr>
@@ -3830,6 +3850,1273 @@
     <w:p>
       <w:pPr>
         <w:keepNext/>
+        <w:spacing w:after="40" w:before="80"/>
+        <w:rPr>
+          <w:ins w:id="91002" w:author="Claude" w:date="2026-10-27T00:00:00Z"/>
+        </w:rPr>
+      </w:pPr>
+      <w:ins w:id="91003" w:author="Claude" w:date="2026-10-27T00:00:00Z">
+        <w:r>
+          <w:rPr>
+            <w:i/>
+            <w:iCs/>
+          </w:rPr>
+          <w:t xml:space="preserve">C. Sati's Own Models</w:t>
+        </w:r>
+      </w:ins>
+    </w:p>
+    <w:p>
+      <w:pPr>
+        <w:spacing w:after="0" w:line="240"/>
+        <w:ind w:firstLine="202"/>
+        <w:jc w:val="both"/>
+        <w:rPr>
+          <w:ins w:id="91004" w:author="Claude" w:date="2026-10-27T00:00:00Z"/>
+        </w:rPr>
+      </w:pPr>
+      <w:ins w:id="91005" w:author="Claude" w:date="2026-10-27T00:00:00Z">
+        <w:r>
+          <w:t xml:space="preserve">Since this paper's first draft the agent no longer depends on general language models for its judgements. Nine models are trained in the project's repository on public data, one for each part of the loop, named for the nine forms of Navadurga. Each is evaluated with a split chosen so the test measures something unseen: a held-out machine group, attacker, system, day or time, never a random split where that would leak. Each is compared with the strongest simple baseline found, and the results that went against the project are reported beside the rest (Table XI).</w:t>
+        </w:r>
+      </w:ins>
+    </w:p>
+    <w:p>
+      <w:pPr>
+        <w:keepNext/>
+        <w:spacing w:after="0" w:before="160"/>
+        <w:jc w:val="center"/>
+        <w:rPr>
+          <w:ins w:id="91006" w:author="Claude" w:date="2026-10-27T00:00:00Z"/>
+        </w:rPr>
+      </w:pPr>
+      <w:ins w:id="91007" w:author="Claude" w:date="2026-10-27T00:00:00Z">
+        <w:r>
+          <w:rPr>
+            <w:smallCaps/>
+            <w:sz w:val="16"/>
+            <w:szCs w:val="16"/>
+          </w:rPr>
+          <w:t xml:space="preserve">TABLE XI</w:t>
+        </w:r>
+      </w:ins>
+    </w:p>
+    <w:p>
+      <w:pPr>
+        <w:keepNext/>
+        <w:spacing w:after="60"/>
+        <w:jc w:val="center"/>
+        <w:rPr>
+          <w:ins w:id="91008" w:author="Claude" w:date="2026-10-27T00:00:00Z"/>
+        </w:rPr>
+      </w:pPr>
+      <w:ins w:id="91009" w:author="Claude" w:date="2026-10-27T00:00:00Z">
+        <w:r>
+          <w:rPr>
+            <w:smallCaps/>
+            <w:sz w:val="16"/>
+            <w:szCs w:val="16"/>
+          </w:rPr>
+          <w:t xml:space="preserve">Sati's Models on Held-Out Data</w:t>
+        </w:r>
+      </w:ins>
+    </w:p>
+    <w:tbl>
+      <w:tblPr>
+        <w:tblW w:type="dxa" w:w="5040"/>
+      </w:tblPr>
+      <w:tblGrid>
+        <w:gridCol w:w="1000"/>
+        <w:gridCol w:w="1440"/>
+        <w:gridCol w:w="1340"/>
+        <w:gridCol w:w="1260"/>
+      </w:tblGrid>
+      <w:tr>
+        <w:trPr>
+          <w:cantSplit/>
+          <w:ins w:id="91018" w:author="Claude" w:date="2026-10-27T00:00:00Z"/>
+        </w:trPr>
+        <w:tc>
+          <w:tcPr>
+            <w:tcW w:type="dxa" w:w="1000"/>
+            <w:tcBorders>
+              <w:top w:val="single" w:color="000000" w:sz="4"/>
+              <w:bottom w:val="single" w:color="000000" w:sz="4"/>
+            </w:tcBorders>
+            <w:tcMar>
+              <w:left w:type="dxa" w:w="60"/>
+              <w:right w:type="dxa" w:w="60"/>
+            </w:tcMar>
+          </w:tcPr>
+          <w:p>
+            <w:pPr>
+              <w:jc w:val="left"/>
+              <w:rPr>
+                <w:ins w:id="91010" w:author="Claude" w:date="2026-10-27T00:00:00Z"/>
+              </w:rPr>
+            </w:pPr>
+            <w:ins w:id="91011" w:author="Claude" w:date="2026-10-27T00:00:00Z">
+              <w:r>
+                <w:rPr>
+                  <w:b/>
+                  <w:bCs/>
+                  <w:sz w:val="16"/>
+                  <w:szCs w:val="16"/>
+                </w:rPr>
+                <w:t xml:space="preserve">Model</w:t>
+              </w:r>
+            </w:ins>
+          </w:p>
+        </w:tc>
+        <w:tc>
+          <w:tcPr>
+            <w:tcW w:type="dxa" w:w="1440"/>
+            <w:tcBorders>
+              <w:top w:val="single" w:color="000000" w:sz="4"/>
+              <w:bottom w:val="single" w:color="000000" w:sz="4"/>
+            </w:tcBorders>
+            <w:tcMar>
+              <w:left w:type="dxa" w:w="60"/>
+              <w:right w:type="dxa" w:w="60"/>
+            </w:tcMar>
+          </w:tcPr>
+          <w:p>
+            <w:pPr>
+              <w:jc w:val="center"/>
+              <w:rPr>
+                <w:ins w:id="91012" w:author="Claude" w:date="2026-10-27T00:00:00Z"/>
+              </w:rPr>
+            </w:pPr>
+            <w:ins w:id="91013" w:author="Claude" w:date="2026-10-27T00:00:00Z">
+              <w:r>
+                <w:rPr>
+                  <w:b/>
+                  <w:bCs/>
+                  <w:sz w:val="16"/>
+                  <w:szCs w:val="16"/>
+                </w:rPr>
+                <w:t xml:space="preserve">Job</w:t>
+              </w:r>
+            </w:ins>
+          </w:p>
+        </w:tc>
+        <w:tc>
+          <w:tcPr>
+            <w:tcW w:type="dxa" w:w="1340"/>
+            <w:tcBorders>
+              <w:top w:val="single" w:color="000000" w:sz="4"/>
+              <w:bottom w:val="single" w:color="000000" w:sz="4"/>
+            </w:tcBorders>
+            <w:tcMar>
+              <w:left w:type="dxa" w:w="60"/>
+              <w:right w:type="dxa" w:w="60"/>
+            </w:tcMar>
+          </w:tcPr>
+          <w:p>
+            <w:pPr>
+              <w:jc w:val="center"/>
+              <w:rPr>
+                <w:ins w:id="91014" w:author="Claude" w:date="2026-10-27T00:00:00Z"/>
+              </w:rPr>
+            </w:pPr>
+            <w:ins w:id="91015" w:author="Claude" w:date="2026-10-27T00:00:00Z">
+              <w:r>
+                <w:rPr>
+                  <w:b/>
+                  <w:bCs/>
+                  <w:sz w:val="16"/>
+                  <w:szCs w:val="16"/>
+                </w:rPr>
+                <w:t xml:space="preserve">Held-out result</w:t>
+              </w:r>
+            </w:ins>
+          </w:p>
+        </w:tc>
+        <w:tc>
+          <w:tcPr>
+            <w:tcW w:type="dxa" w:w="1260"/>
+            <w:tcBorders>
+              <w:top w:val="single" w:color="000000" w:sz="4"/>
+              <w:bottom w:val="single" w:color="000000" w:sz="4"/>
+            </w:tcBorders>
+            <w:tcMar>
+              <w:left w:type="dxa" w:w="60"/>
+              <w:right w:type="dxa" w:w="60"/>
+            </w:tcMar>
+          </w:tcPr>
+          <w:p>
+            <w:pPr>
+              <w:jc w:val="center"/>
+              <w:rPr>
+                <w:ins w:id="91016" w:author="Claude" w:date="2026-10-27T00:00:00Z"/>
+              </w:rPr>
+            </w:pPr>
+            <w:ins w:id="91017" w:author="Claude" w:date="2026-10-27T00:00:00Z">
+              <w:r>
+                <w:rPr>
+                  <w:b/>
+                  <w:bCs/>
+                  <w:sz w:val="16"/>
+                  <w:szCs w:val="16"/>
+                </w:rPr>
+                <w:t xml:space="preserve">Baseline</w:t>
+              </w:r>
+            </w:ins>
+          </w:p>
+        </w:tc>
+      </w:tr>
+      <w:tr>
+        <w:trPr>
+          <w:cantSplit/>
+          <w:ins w:id="91027" w:author="Claude" w:date="2026-10-27T00:00:00Z"/>
+        </w:trPr>
+        <w:tc>
+          <w:tcPr>
+            <w:tcW w:type="dxa" w:w="1000"/>
+            <w:tcBorders/>
+            <w:tcMar>
+              <w:left w:type="dxa" w:w="60"/>
+              <w:right w:type="dxa" w:w="60"/>
+            </w:tcMar>
+          </w:tcPr>
+          <w:p>
+            <w:pPr>
+              <w:jc w:val="left"/>
+              <w:rPr>
+                <w:ins w:id="91019" w:author="Claude" w:date="2026-10-27T00:00:00Z"/>
+              </w:rPr>
+            </w:pPr>
+            <w:ins w:id="91020" w:author="Claude" w:date="2026-10-27T00:00:00Z">
+              <w:r>
+                <w:rPr>
+                  <w:sz w:val="16"/>
+                  <w:szCs w:val="16"/>
+                </w:rPr>
+                <w:t xml:space="preserve">Shailaputri</w:t>
+              </w:r>
+            </w:ins>
+          </w:p>
+        </w:tc>
+        <w:tc>
+          <w:tcPr>
+            <w:tcW w:type="dxa" w:w="1440"/>
+            <w:tcBorders/>
+            <w:tcMar>
+              <w:left w:type="dxa" w:w="60"/>
+              <w:right w:type="dxa" w:w="60"/>
+            </w:tcMar>
+          </w:tcPr>
+          <w:p>
+            <w:pPr>
+              <w:jc w:val="center"/>
+              <w:rPr>
+                <w:ins w:id="91021" w:author="Claude" w:date="2026-10-27T00:00:00Z"/>
+              </w:rPr>
+            </w:pPr>
+            <w:ins w:id="91022" w:author="Claude" w:date="2026-10-27T00:00:00Z">
+              <w:r>
+                <w:rPr>
+                  <w:sz w:val="16"/>
+                  <w:szCs w:val="16"/>
+                </w:rPr>
+                <w:t xml:space="preserve">Server metric anomalies</w:t>
+              </w:r>
+            </w:ins>
+          </w:p>
+        </w:tc>
+        <w:tc>
+          <w:tcPr>
+            <w:tcW w:type="dxa" w:w="1340"/>
+            <w:tcBorders/>
+            <w:tcMar>
+              <w:left w:type="dxa" w:w="60"/>
+              <w:right w:type="dxa" w:w="60"/>
+            </w:tcMar>
+          </w:tcPr>
+          <w:p>
+            <w:pPr>
+              <w:jc w:val="center"/>
+              <w:rPr>
+                <w:ins w:id="91023" w:author="Claude" w:date="2026-10-27T00:00:00Z"/>
+              </w:rPr>
+            </w:pPr>
+            <w:ins w:id="91024" w:author="Claude" w:date="2026-10-27T00:00:00Z">
+              <w:r>
+                <w:rPr>
+                  <w:sz w:val="16"/>
+                  <w:szCs w:val="16"/>
+                </w:rPr>
+                <w:t xml:space="preserve">F1 0.556, 4.6 FA/1k</w:t>
+              </w:r>
+            </w:ins>
+          </w:p>
+        </w:tc>
+        <w:tc>
+          <w:tcPr>
+            <w:tcW w:type="dxa" w:w="1260"/>
+            <w:tcBorders/>
+            <w:tcMar>
+              <w:left w:type="dxa" w:w="60"/>
+              <w:right w:type="dxa" w:w="60"/>
+            </w:tcMar>
+          </w:tcPr>
+          <w:p>
+            <w:pPr>
+              <w:jc w:val="center"/>
+              <w:rPr>
+                <w:ins w:id="91025" w:author="Claude" w:date="2026-10-27T00:00:00Z"/>
+              </w:rPr>
+            </w:pPr>
+            <w:ins w:id="91026" w:author="Claude" w:date="2026-10-27T00:00:00Z">
+              <w:r>
+                <w:rPr>
+                  <w:sz w:val="16"/>
+                  <w:szCs w:val="16"/>
+                </w:rPr>
+                <w:t xml:space="preserve">PCA 0.419, 86.6</w:t>
+              </w:r>
+            </w:ins>
+          </w:p>
+        </w:tc>
+      </w:tr>
+      <w:tr>
+        <w:trPr>
+          <w:cantSplit/>
+          <w:ins w:id="91036" w:author="Claude" w:date="2026-10-27T00:00:00Z"/>
+        </w:trPr>
+        <w:tc>
+          <w:tcPr>
+            <w:tcW w:type="dxa" w:w="1000"/>
+            <w:tcBorders/>
+            <w:tcMar>
+              <w:left w:type="dxa" w:w="60"/>
+              <w:right w:type="dxa" w:w="60"/>
+            </w:tcMar>
+          </w:tcPr>
+          <w:p>
+            <w:pPr>
+              <w:jc w:val="left"/>
+              <w:rPr>
+                <w:ins w:id="91028" w:author="Claude" w:date="2026-10-27T00:00:00Z"/>
+              </w:rPr>
+            </w:pPr>
+            <w:ins w:id="91029" w:author="Claude" w:date="2026-10-27T00:00:00Z">
+              <w:r>
+                <w:rPr>
+                  <w:sz w:val="16"/>
+                  <w:szCs w:val="16"/>
+                </w:rPr>
+                <w:t xml:space="preserve">Brahmacharini</w:t>
+              </w:r>
+            </w:ins>
+          </w:p>
+        </w:tc>
+        <w:tc>
+          <w:tcPr>
+            <w:tcW w:type="dxa" w:w="1440"/>
+            <w:tcBorders/>
+            <w:tcMar>
+              <w:left w:type="dxa" w:w="60"/>
+              <w:right w:type="dxa" w:w="60"/>
+            </w:tcMar>
+          </w:tcPr>
+          <w:p>
+            <w:pPr>
+              <w:jc w:val="center"/>
+              <w:rPr>
+                <w:ins w:id="91030" w:author="Claude" w:date="2026-10-27T00:00:00Z"/>
+              </w:rPr>
+            </w:pPr>
+            <w:ins w:id="91031" w:author="Claude" w:date="2026-10-27T00:00:00Z">
+              <w:r>
+                <w:rPr>
+                  <w:sz w:val="16"/>
+                  <w:szCs w:val="16"/>
+                </w:rPr>
+                <w:t xml:space="preserve">Behaviour → ATT&amp;CK technique</w:t>
+              </w:r>
+            </w:ins>
+          </w:p>
+        </w:tc>
+        <w:tc>
+          <w:tcPr>
+            <w:tcW w:type="dxa" w:w="1340"/>
+            <w:tcBorders/>
+            <w:tcMar>
+              <w:left w:type="dxa" w:w="60"/>
+              <w:right w:type="dxa" w:w="60"/>
+            </w:tcMar>
+          </w:tcPr>
+          <w:p>
+            <w:pPr>
+              <w:jc w:val="center"/>
+              <w:rPr>
+                <w:ins w:id="91032" w:author="Claude" w:date="2026-10-27T00:00:00Z"/>
+              </w:rPr>
+            </w:pPr>
+            <w:ins w:id="91033" w:author="Claude" w:date="2026-10-27T00:00:00Z">
+              <w:r>
+                <w:rPr>
+                  <w:sz w:val="16"/>
+                  <w:szCs w:val="16"/>
+                </w:rPr>
+                <w:t xml:space="preserve">R@1 0.614</w:t>
+              </w:r>
+            </w:ins>
+          </w:p>
+        </w:tc>
+        <w:tc>
+          <w:tcPr>
+            <w:tcW w:type="dxa" w:w="1260"/>
+            <w:tcBorders/>
+            <w:tcMar>
+              <w:left w:type="dxa" w:w="60"/>
+              <w:right w:type="dxa" w:w="60"/>
+            </w:tcMar>
+          </w:tcPr>
+          <w:p>
+            <w:pPr>
+              <w:jc w:val="center"/>
+              <w:rPr>
+                <w:ins w:id="91034" w:author="Claude" w:date="2026-10-27T00:00:00Z"/>
+              </w:rPr>
+            </w:pPr>
+            <w:ins w:id="91035" w:author="Claude" w:date="2026-10-27T00:00:00Z">
+              <w:r>
+                <w:rPr>
+                  <w:sz w:val="16"/>
+                  <w:szCs w:val="16"/>
+                </w:rPr>
+                <w:t xml:space="preserve">BM25 0.268; TF-IDF LR 0.646</w:t>
+              </w:r>
+            </w:ins>
+          </w:p>
+        </w:tc>
+      </w:tr>
+      <w:tr>
+        <w:trPr>
+          <w:cantSplit/>
+          <w:ins w:id="91045" w:author="Claude" w:date="2026-10-27T00:00:00Z"/>
+        </w:trPr>
+        <w:tc>
+          <w:tcPr>
+            <w:tcW w:type="dxa" w:w="1000"/>
+            <w:tcBorders/>
+            <w:tcMar>
+              <w:left w:type="dxa" w:w="60"/>
+              <w:right w:type="dxa" w:w="60"/>
+            </w:tcMar>
+          </w:tcPr>
+          <w:p>
+            <w:pPr>
+              <w:jc w:val="left"/>
+              <w:rPr>
+                <w:ins w:id="91037" w:author="Claude" w:date="2026-10-27T00:00:00Z"/>
+              </w:rPr>
+            </w:pPr>
+            <w:ins w:id="91038" w:author="Claude" w:date="2026-10-27T00:00:00Z">
+              <w:r>
+                <w:rPr>
+                  <w:sz w:val="16"/>
+                  <w:szCs w:val="16"/>
+                </w:rPr>
+                <w:t xml:space="preserve">Chandraghanta</w:t>
+              </w:r>
+            </w:ins>
+          </w:p>
+        </w:tc>
+        <w:tc>
+          <w:tcPr>
+            <w:tcW w:type="dxa" w:w="1440"/>
+            <w:tcBorders/>
+            <w:tcMar>
+              <w:left w:type="dxa" w:w="60"/>
+              <w:right w:type="dxa" w:w="60"/>
+            </w:tcMar>
+          </w:tcPr>
+          <w:p>
+            <w:pPr>
+              <w:jc w:val="center"/>
+              <w:rPr>
+                <w:ins w:id="91039" w:author="Claude" w:date="2026-10-27T00:00:00Z"/>
+              </w:rPr>
+            </w:pPr>
+            <w:ins w:id="91040" w:author="Claude" w:date="2026-10-27T00:00:00Z">
+              <w:r>
+                <w:rPr>
+                  <w:sz w:val="16"/>
+                  <w:szCs w:val="16"/>
+                </w:rPr>
+                <w:t xml:space="preserve">Network intrusion, unseen days</w:t>
+              </w:r>
+            </w:ins>
+          </w:p>
+        </w:tc>
+        <w:tc>
+          <w:tcPr>
+            <w:tcW w:type="dxa" w:w="1340"/>
+            <w:tcBorders/>
+            <w:tcMar>
+              <w:left w:type="dxa" w:w="60"/>
+              <w:right w:type="dxa" w:w="60"/>
+            </w:tcMar>
+          </w:tcPr>
+          <w:p>
+            <w:pPr>
+              <w:jc w:val="center"/>
+              <w:rPr>
+                <w:ins w:id="91041" w:author="Claude" w:date="2026-10-27T00:00:00Z"/>
+              </w:rPr>
+            </w:pPr>
+            <w:ins w:id="91042" w:author="Claude" w:date="2026-10-27T00:00:00Z">
+              <w:r>
+                <w:rPr>
+                  <w:sz w:val="16"/>
+                  <w:szCs w:val="16"/>
+                </w:rPr>
+                <w:t xml:space="preserve">F1 0.604</w:t>
+              </w:r>
+            </w:ins>
+          </w:p>
+        </w:tc>
+        <w:tc>
+          <w:tcPr>
+            <w:tcW w:type="dxa" w:w="1260"/>
+            <w:tcBorders/>
+            <w:tcMar>
+              <w:left w:type="dxa" w:w="60"/>
+              <w:right w:type="dxa" w:w="60"/>
+            </w:tcMar>
+          </w:tcPr>
+          <w:p>
+            <w:pPr>
+              <w:jc w:val="center"/>
+              <w:rPr>
+                <w:ins w:id="91043" w:author="Claude" w:date="2026-10-27T00:00:00Z"/>
+              </w:rPr>
+            </w:pPr>
+            <w:ins w:id="91044" w:author="Claude" w:date="2026-10-27T00:00:00Z">
+              <w:r>
+                <w:rPr>
+                  <w:sz w:val="16"/>
+                  <w:szCs w:val="16"/>
+                </w:rPr>
+                <w:t xml:space="preserve">best-F1 thr. 0.453</w:t>
+              </w:r>
+            </w:ins>
+          </w:p>
+        </w:tc>
+      </w:tr>
+      <w:tr>
+        <w:trPr>
+          <w:cantSplit/>
+          <w:ins w:id="91054" w:author="Claude" w:date="2026-10-27T00:00:00Z"/>
+        </w:trPr>
+        <w:tc>
+          <w:tcPr>
+            <w:tcW w:type="dxa" w:w="1000"/>
+            <w:tcBorders/>
+            <w:tcMar>
+              <w:left w:type="dxa" w:w="60"/>
+              <w:right w:type="dxa" w:w="60"/>
+            </w:tcMar>
+          </w:tcPr>
+          <w:p>
+            <w:pPr>
+              <w:jc w:val="left"/>
+              <w:rPr>
+                <w:ins w:id="91046" w:author="Claude" w:date="2026-10-27T00:00:00Z"/>
+              </w:rPr>
+            </w:pPr>
+            <w:ins w:id="91047" w:author="Claude" w:date="2026-10-27T00:00:00Z">
+              <w:r>
+                <w:rPr>
+                  <w:sz w:val="16"/>
+                  <w:szCs w:val="16"/>
+                </w:rPr>
+                <w:t xml:space="preserve">Kushmanda</w:t>
+              </w:r>
+            </w:ins>
+          </w:p>
+        </w:tc>
+        <w:tc>
+          <w:tcPr>
+            <w:tcW w:type="dxa" w:w="1440"/>
+            <w:tcBorders/>
+            <w:tcMar>
+              <w:left w:type="dxa" w:w="60"/>
+              <w:right w:type="dxa" w:w="60"/>
+            </w:tcMar>
+          </w:tcPr>
+          <w:p>
+            <w:pPr>
+              <w:jc w:val="center"/>
+              <w:rPr>
+                <w:ins w:id="91048" w:author="Claude" w:date="2026-10-27T00:00:00Z"/>
+              </w:rPr>
+            </w:pPr>
+            <w:ins w:id="91049" w:author="Claude" w:date="2026-10-27T00:00:00Z">
+              <w:r>
+                <w:rPr>
+                  <w:sz w:val="16"/>
+                  <w:szCs w:val="16"/>
+                </w:rPr>
+                <w:t xml:space="preserve">Answer from passages, cite</w:t>
+              </w:r>
+            </w:ins>
+          </w:p>
+        </w:tc>
+        <w:tc>
+          <w:tcPr>
+            <w:tcW w:type="dxa" w:w="1340"/>
+            <w:tcBorders/>
+            <w:tcMar>
+              <w:left w:type="dxa" w:w="60"/>
+              <w:right w:type="dxa" w:w="60"/>
+            </w:tcMar>
+          </w:tcPr>
+          <w:p>
+            <w:pPr>
+              <w:jc w:val="center"/>
+              <w:rPr>
+                <w:ins w:id="91050" w:author="Claude" w:date="2026-10-27T00:00:00Z"/>
+              </w:rPr>
+            </w:pPr>
+            <w:ins w:id="91051" w:author="Claude" w:date="2026-10-27T00:00:00Z">
+              <w:r>
+                <w:rPr>
+                  <w:sz w:val="16"/>
+                  <w:szCs w:val="16"/>
+                </w:rPr>
+                <w:t xml:space="preserve">ROUGE-L 0.938</w:t>
+              </w:r>
+            </w:ins>
+          </w:p>
+        </w:tc>
+        <w:tc>
+          <w:tcPr>
+            <w:tcW w:type="dxa" w:w="1260"/>
+            <w:tcBorders/>
+            <w:tcMar>
+              <w:left w:type="dxa" w:w="60"/>
+              <w:right w:type="dxa" w:w="60"/>
+            </w:tcMar>
+          </w:tcPr>
+          <w:p>
+            <w:pPr>
+              <w:jc w:val="center"/>
+              <w:rPr>
+                <w:ins w:id="91052" w:author="Claude" w:date="2026-10-27T00:00:00Z"/>
+              </w:rPr>
+            </w:pPr>
+            <w:ins w:id="91053" w:author="Claude" w:date="2026-10-27T00:00:00Z">
+              <w:r>
+                <w:rPr>
+                  <w:sz w:val="16"/>
+                  <w:szCs w:val="16"/>
+                </w:rPr>
+                <w:t xml:space="preserve">word overlap 0.361</w:t>
+              </w:r>
+            </w:ins>
+          </w:p>
+        </w:tc>
+      </w:tr>
+      <w:tr>
+        <w:trPr>
+          <w:cantSplit/>
+          <w:ins w:id="91063" w:author="Claude" w:date="2026-10-27T00:00:00Z"/>
+        </w:trPr>
+        <w:tc>
+          <w:tcPr>
+            <w:tcW w:type="dxa" w:w="1000"/>
+            <w:tcBorders/>
+            <w:tcMar>
+              <w:left w:type="dxa" w:w="60"/>
+              <w:right w:type="dxa" w:w="60"/>
+            </w:tcMar>
+          </w:tcPr>
+          <w:p>
+            <w:pPr>
+              <w:jc w:val="left"/>
+              <w:rPr>
+                <w:ins w:id="91055" w:author="Claude" w:date="2026-10-27T00:00:00Z"/>
+              </w:rPr>
+            </w:pPr>
+            <w:ins w:id="91056" w:author="Claude" w:date="2026-10-27T00:00:00Z">
+              <w:r>
+                <w:rPr>
+                  <w:sz w:val="16"/>
+                  <w:szCs w:val="16"/>
+                </w:rPr>
+                <w:t xml:space="preserve">Skandamata</w:t>
+              </w:r>
+            </w:ins>
+          </w:p>
+        </w:tc>
+        <w:tc>
+          <w:tcPr>
+            <w:tcW w:type="dxa" w:w="1440"/>
+            <w:tcBorders/>
+            <w:tcMar>
+              <w:left w:type="dxa" w:w="60"/>
+              <w:right w:type="dxa" w:w="60"/>
+            </w:tcMar>
+          </w:tcPr>
+          <w:p>
+            <w:pPr>
+              <w:jc w:val="center"/>
+              <w:rPr>
+                <w:ins w:id="91057" w:author="Claude" w:date="2026-10-27T00:00:00Z"/>
+              </w:rPr>
+            </w:pPr>
+            <w:ins w:id="91058" w:author="Claude" w:date="2026-10-27T00:00:00Z">
+              <w:r>
+                <w:rPr>
+                  <w:sz w:val="16"/>
+                  <w:szCs w:val="16"/>
+                </w:rPr>
+                <w:t xml:space="preserve">Behaviour → mitigations</w:t>
+              </w:r>
+            </w:ins>
+          </w:p>
+        </w:tc>
+        <w:tc>
+          <w:tcPr>
+            <w:tcW w:type="dxa" w:w="1340"/>
+            <w:tcBorders/>
+            <w:tcMar>
+              <w:left w:type="dxa" w:w="60"/>
+              <w:right w:type="dxa" w:w="60"/>
+            </w:tcMar>
+          </w:tcPr>
+          <w:p>
+            <w:pPr>
+              <w:jc w:val="center"/>
+              <w:rPr>
+                <w:ins w:id="91059" w:author="Claude" w:date="2026-10-27T00:00:00Z"/>
+              </w:rPr>
+            </w:pPr>
+            <w:ins w:id="91060" w:author="Claude" w:date="2026-10-27T00:00:00Z">
+              <w:r>
+                <w:rPr>
+                  <w:sz w:val="16"/>
+                  <w:szCs w:val="16"/>
+                </w:rPr>
+                <w:t xml:space="preserve">hit@1 0.792</w:t>
+              </w:r>
+            </w:ins>
+          </w:p>
+        </w:tc>
+        <w:tc>
+          <w:tcPr>
+            <w:tcW w:type="dxa" w:w="1260"/>
+            <w:tcBorders/>
+            <w:tcMar>
+              <w:left w:type="dxa" w:w="60"/>
+              <w:right w:type="dxa" w:w="60"/>
+            </w:tcMar>
+          </w:tcPr>
+          <w:p>
+            <w:pPr>
+              <w:jc w:val="center"/>
+              <w:rPr>
+                <w:ins w:id="91061" w:author="Claude" w:date="2026-10-27T00:00:00Z"/>
+              </w:rPr>
+            </w:pPr>
+            <w:ins w:id="91062" w:author="Claude" w:date="2026-10-27T00:00:00Z">
+              <w:r>
+                <w:rPr>
+                  <w:sz w:val="16"/>
+                  <w:szCs w:val="16"/>
+                </w:rPr>
+                <w:t xml:space="preserve">BM25 0.537</w:t>
+              </w:r>
+            </w:ins>
+          </w:p>
+        </w:tc>
+      </w:tr>
+      <w:tr>
+        <w:trPr>
+          <w:cantSplit/>
+          <w:ins w:id="91072" w:author="Claude" w:date="2026-10-27T00:00:00Z"/>
+        </w:trPr>
+        <w:tc>
+          <w:tcPr>
+            <w:tcW w:type="dxa" w:w="1000"/>
+            <w:tcBorders/>
+            <w:tcMar>
+              <w:left w:type="dxa" w:w="60"/>
+              <w:right w:type="dxa" w:w="60"/>
+            </w:tcMar>
+          </w:tcPr>
+          <w:p>
+            <w:pPr>
+              <w:jc w:val="left"/>
+              <w:rPr>
+                <w:ins w:id="91064" w:author="Claude" w:date="2026-10-27T00:00:00Z"/>
+              </w:rPr>
+            </w:pPr>
+            <w:ins w:id="91065" w:author="Claude" w:date="2026-10-27T00:00:00Z">
+              <w:r>
+                <w:rPr>
+                  <w:sz w:val="16"/>
+                  <w:szCs w:val="16"/>
+                </w:rPr>
+                <w:t xml:space="preserve">Katyayani</w:t>
+              </w:r>
+            </w:ins>
+          </w:p>
+        </w:tc>
+        <w:tc>
+          <w:tcPr>
+            <w:tcW w:type="dxa" w:w="1440"/>
+            <w:tcBorders/>
+            <w:tcMar>
+              <w:left w:type="dxa" w:w="60"/>
+              <w:right w:type="dxa" w:w="60"/>
+            </w:tcMar>
+          </w:tcPr>
+          <w:p>
+            <w:pPr>
+              <w:jc w:val="center"/>
+              <w:rPr>
+                <w:ins w:id="91066" w:author="Claude" w:date="2026-10-27T00:00:00Z"/>
+              </w:rPr>
+            </w:pPr>
+            <w:ins w:id="91067" w:author="Claude" w:date="2026-10-27T00:00:00Z">
+              <w:r>
+                <w:rPr>
+                  <w:sz w:val="16"/>
+                  <w:szCs w:val="16"/>
+                </w:rPr>
+                <w:t xml:space="preserve">Root-cause service</w:t>
+              </w:r>
+            </w:ins>
+          </w:p>
+        </w:tc>
+        <w:tc>
+          <w:tcPr>
+            <w:tcW w:type="dxa" w:w="1340"/>
+            <w:tcBorders/>
+            <w:tcMar>
+              <w:left w:type="dxa" w:w="60"/>
+              <w:right w:type="dxa" w:w="60"/>
+            </w:tcMar>
+          </w:tcPr>
+          <w:p>
+            <w:pPr>
+              <w:jc w:val="center"/>
+              <w:rPr>
+                <w:ins w:id="91068" w:author="Claude" w:date="2026-10-27T00:00:00Z"/>
+              </w:rPr>
+            </w:pPr>
+            <w:ins w:id="91069" w:author="Claude" w:date="2026-10-27T00:00:00Z">
+              <w:r>
+                <w:rPr>
+                  <w:sz w:val="16"/>
+                  <w:szCs w:val="16"/>
+                </w:rPr>
+                <w:t xml:space="preserve">RCA@1 0.884</w:t>
+              </w:r>
+            </w:ins>
+          </w:p>
+        </w:tc>
+        <w:tc>
+          <w:tcPr>
+            <w:tcW w:type="dxa" w:w="1260"/>
+            <w:tcBorders/>
+            <w:tcMar>
+              <w:left w:type="dxa" w:w="60"/>
+              <w:right w:type="dxa" w:w="60"/>
+            </w:tcMar>
+          </w:tcPr>
+          <w:p>
+            <w:pPr>
+              <w:jc w:val="center"/>
+              <w:rPr>
+                <w:ins w:id="91070" w:author="Claude" w:date="2026-10-27T00:00:00Z"/>
+              </w:rPr>
+            </w:pPr>
+            <w:ins w:id="91071" w:author="Claude" w:date="2026-10-27T00:00:00Z">
+              <w:r>
+                <w:rPr>
+                  <w:sz w:val="16"/>
+                  <w:szCs w:val="16"/>
+                </w:rPr>
+                <w:t xml:space="preserve">loudest 0.571</w:t>
+              </w:r>
+            </w:ins>
+          </w:p>
+        </w:tc>
+      </w:tr>
+      <w:tr>
+        <w:trPr>
+          <w:cantSplit/>
+          <w:ins w:id="91081" w:author="Claude" w:date="2026-10-27T00:00:00Z"/>
+        </w:trPr>
+        <w:tc>
+          <w:tcPr>
+            <w:tcW w:type="dxa" w:w="1000"/>
+            <w:tcBorders/>
+            <w:tcMar>
+              <w:left w:type="dxa" w:w="60"/>
+              <w:right w:type="dxa" w:w="60"/>
+            </w:tcMar>
+          </w:tcPr>
+          <w:p>
+            <w:pPr>
+              <w:jc w:val="left"/>
+              <w:rPr>
+                <w:ins w:id="91073" w:author="Claude" w:date="2026-10-27T00:00:00Z"/>
+              </w:rPr>
+            </w:pPr>
+            <w:ins w:id="91074" w:author="Claude" w:date="2026-10-27T00:00:00Z">
+              <w:r>
+                <w:rPr>
+                  <w:sz w:val="16"/>
+                  <w:szCs w:val="16"/>
+                </w:rPr>
+                <w:t xml:space="preserve">Kalaratri</w:t>
+              </w:r>
+            </w:ins>
+          </w:p>
+        </w:tc>
+        <w:tc>
+          <w:tcPr>
+            <w:tcW w:type="dxa" w:w="1440"/>
+            <w:tcBorders/>
+            <w:tcMar>
+              <w:left w:type="dxa" w:w="60"/>
+              <w:right w:type="dxa" w:w="60"/>
+            </w:tcMar>
+          </w:tcPr>
+          <w:p>
+            <w:pPr>
+              <w:jc w:val="center"/>
+              <w:rPr>
+                <w:ins w:id="91075" w:author="Claude" w:date="2026-10-27T00:00:00Z"/>
+              </w:rPr>
+            </w:pPr>
+            <w:ins w:id="91076" w:author="Claude" w:date="2026-10-27T00:00:00Z">
+              <w:r>
+                <w:rPr>
+                  <w:sz w:val="16"/>
+                  <w:szCs w:val="16"/>
+                </w:rPr>
+                <w:t xml:space="preserve">Log session anomalies (HDFS)</w:t>
+              </w:r>
+            </w:ins>
+          </w:p>
+        </w:tc>
+        <w:tc>
+          <w:tcPr>
+            <w:tcW w:type="dxa" w:w="1340"/>
+            <w:tcBorders/>
+            <w:tcMar>
+              <w:left w:type="dxa" w:w="60"/>
+              <w:right w:type="dxa" w:w="60"/>
+            </w:tcMar>
+          </w:tcPr>
+          <w:p>
+            <w:pPr>
+              <w:jc w:val="center"/>
+              <w:rPr>
+                <w:ins w:id="91077" w:author="Claude" w:date="2026-10-27T00:00:00Z"/>
+              </w:rPr>
+            </w:pPr>
+            <w:ins w:id="91078" w:author="Claude" w:date="2026-10-27T00:00:00Z">
+              <w:r>
+                <w:rPr>
+                  <w:sz w:val="16"/>
+                  <w:szCs w:val="16"/>
+                </w:rPr>
+                <w:t xml:space="preserve">F1 0.966</w:t>
+              </w:r>
+            </w:ins>
+          </w:p>
+        </w:tc>
+        <w:tc>
+          <w:tcPr>
+            <w:tcW w:type="dxa" w:w="1260"/>
+            <w:tcBorders/>
+            <w:tcMar>
+              <w:left w:type="dxa" w:w="60"/>
+              <w:right w:type="dxa" w:w="60"/>
+            </w:tcMar>
+          </w:tcPr>
+          <w:p>
+            <w:pPr>
+              <w:jc w:val="center"/>
+              <w:rPr>
+                <w:ins w:id="91079" w:author="Claude" w:date="2026-10-27T00:00:00Z"/>
+              </w:rPr>
+            </w:pPr>
+            <w:ins w:id="91080" w:author="Claude" w:date="2026-10-27T00:00:00Z">
+              <w:r>
+                <w:rPr>
+                  <w:sz w:val="16"/>
+                  <w:szCs w:val="16"/>
+                </w:rPr>
+                <w:t xml:space="preserve">PCA 0.866</w:t>
+              </w:r>
+            </w:ins>
+          </w:p>
+        </w:tc>
+      </w:tr>
+      <w:tr>
+        <w:trPr>
+          <w:cantSplit/>
+          <w:ins w:id="91090" w:author="Claude" w:date="2026-10-27T00:00:00Z"/>
+        </w:trPr>
+        <w:tc>
+          <w:tcPr>
+            <w:tcW w:type="dxa" w:w="1000"/>
+            <w:tcBorders/>
+            <w:tcMar>
+              <w:left w:type="dxa" w:w="60"/>
+              <w:right w:type="dxa" w:w="60"/>
+            </w:tcMar>
+          </w:tcPr>
+          <w:p>
+            <w:pPr>
+              <w:jc w:val="left"/>
+              <w:rPr>
+                <w:ins w:id="91082" w:author="Claude" w:date="2026-10-27T00:00:00Z"/>
+              </w:rPr>
+            </w:pPr>
+            <w:ins w:id="91083" w:author="Claude" w:date="2026-10-27T00:00:00Z">
+              <w:r>
+                <w:rPr>
+                  <w:sz w:val="16"/>
+                  <w:szCs w:val="16"/>
+                </w:rPr>
+                <w:t xml:space="preserve">Mahagauri</w:t>
+              </w:r>
+            </w:ins>
+          </w:p>
+        </w:tc>
+        <w:tc>
+          <w:tcPr>
+            <w:tcW w:type="dxa" w:w="1440"/>
+            <w:tcBorders/>
+            <w:tcMar>
+              <w:left w:type="dxa" w:w="60"/>
+              <w:right w:type="dxa" w:w="60"/>
+            </w:tcMar>
+          </w:tcPr>
+          <w:p>
+            <w:pPr>
+              <w:jc w:val="center"/>
+              <w:rPr>
+                <w:ins w:id="91084" w:author="Claude" w:date="2026-10-27T00:00:00Z"/>
+              </w:rPr>
+            </w:pPr>
+            <w:ins w:id="91085" w:author="Claude" w:date="2026-10-27T00:00:00Z">
+              <w:r>
+                <w:rPr>
+                  <w:sz w:val="16"/>
+                  <w:szCs w:val="16"/>
+                </w:rPr>
+                <w:t xml:space="preserve">Is the incident over?</w:t>
+              </w:r>
+            </w:ins>
+          </w:p>
+        </w:tc>
+        <w:tc>
+          <w:tcPr>
+            <w:tcW w:type="dxa" w:w="1340"/>
+            <w:tcBorders/>
+            <w:tcMar>
+              <w:left w:type="dxa" w:w="60"/>
+              <w:right w:type="dxa" w:w="60"/>
+            </w:tcMar>
+          </w:tcPr>
+          <w:p>
+            <w:pPr>
+              <w:jc w:val="center"/>
+              <w:rPr>
+                <w:ins w:id="91086" w:author="Claude" w:date="2026-10-27T00:00:00Z"/>
+              </w:rPr>
+            </w:pPr>
+            <w:ins w:id="91087" w:author="Claude" w:date="2026-10-27T00:00:00Z">
+              <w:r>
+                <w:rPr>
+                  <w:sz w:val="16"/>
+                  <w:szCs w:val="16"/>
+                </w:rPr>
+                <w:t xml:space="preserve">early 0.021, confirmed 0.092</w:t>
+              </w:r>
+            </w:ins>
+          </w:p>
+        </w:tc>
+        <w:tc>
+          <w:tcPr>
+            <w:tcW w:type="dxa" w:w="1260"/>
+            <w:tcBorders/>
+            <w:tcMar>
+              <w:left w:type="dxa" w:w="60"/>
+              <w:right w:type="dxa" w:w="60"/>
+            </w:tcMar>
+          </w:tcPr>
+          <w:p>
+            <w:pPr>
+              <w:jc w:val="center"/>
+              <w:rPr>
+                <w:ins w:id="91088" w:author="Claude" w:date="2026-10-27T00:00:00Z"/>
+              </w:rPr>
+            </w:pPr>
+            <w:ins w:id="91089" w:author="Claude" w:date="2026-10-27T00:00:00Z">
+              <w:r>
+                <w:rPr>
+                  <w:sz w:val="16"/>
+                  <w:szCs w:val="16"/>
+                </w:rPr>
+                <w:t xml:space="preserve">budget 0.050</w:t>
+              </w:r>
+            </w:ins>
+          </w:p>
+        </w:tc>
+      </w:tr>
+      <w:tr>
+        <w:trPr>
+          <w:cantSplit/>
+          <w:ins w:id="91099" w:author="Claude" w:date="2026-10-27T00:00:00Z"/>
+        </w:trPr>
+        <w:tc>
+          <w:tcPr>
+            <w:tcW w:type="dxa" w:w="1000"/>
+            <w:tcBorders>
+              <w:bottom w:val="single" w:color="000000" w:sz="4"/>
+            </w:tcBorders>
+            <w:tcMar>
+              <w:left w:type="dxa" w:w="60"/>
+              <w:right w:type="dxa" w:w="60"/>
+            </w:tcMar>
+          </w:tcPr>
+          <w:p>
+            <w:pPr>
+              <w:jc w:val="left"/>
+              <w:rPr>
+                <w:ins w:id="91091" w:author="Claude" w:date="2026-10-27T00:00:00Z"/>
+              </w:rPr>
+            </w:pPr>
+            <w:ins w:id="91092" w:author="Claude" w:date="2026-10-27T00:00:00Z">
+              <w:r>
+                <w:rPr>
+                  <w:sz w:val="16"/>
+                  <w:szCs w:val="16"/>
+                </w:rPr>
+                <w:t xml:space="preserve">Siddhidatri</w:t>
+              </w:r>
+            </w:ins>
+          </w:p>
+        </w:tc>
+        <w:tc>
+          <w:tcPr>
+            <w:tcW w:type="dxa" w:w="1440"/>
+            <w:tcBorders>
+              <w:bottom w:val="single" w:color="000000" w:sz="4"/>
+            </w:tcBorders>
+            <w:tcMar>
+              <w:left w:type="dxa" w:w="60"/>
+              <w:right w:type="dxa" w:w="60"/>
+            </w:tcMar>
+          </w:tcPr>
+          <w:p>
+            <w:pPr>
+              <w:jc w:val="center"/>
+              <w:rPr>
+                <w:ins w:id="91093" w:author="Claude" w:date="2026-10-27T00:00:00Z"/>
+              </w:rPr>
+            </w:pPr>
+            <w:ins w:id="91094" w:author="Claude" w:date="2026-10-27T00:00:00Z">
+              <w:r>
+                <w:rPr>
+                  <w:sz w:val="16"/>
+                  <w:szCs w:val="16"/>
+                </w:rPr>
+                <w:t xml:space="preserve">Fuse three detectors</w:t>
+              </w:r>
+            </w:ins>
+          </w:p>
+        </w:tc>
+        <w:tc>
+          <w:tcPr>
+            <w:tcW w:type="dxa" w:w="1340"/>
+            <w:tcBorders>
+              <w:bottom w:val="single" w:color="000000" w:sz="4"/>
+            </w:tcBorders>
+            <w:tcMar>
+              <w:left w:type="dxa" w:w="60"/>
+              <w:right w:type="dxa" w:w="60"/>
+            </w:tcMar>
+          </w:tcPr>
+          <w:p>
+            <w:pPr>
+              <w:jc w:val="center"/>
+              <w:rPr>
+                <w:ins w:id="91095" w:author="Claude" w:date="2026-10-27T00:00:00Z"/>
+              </w:rPr>
+            </w:pPr>
+            <w:ins w:id="91096" w:author="Claude" w:date="2026-10-27T00:00:00Z">
+              <w:r>
+                <w:rPr>
+                  <w:sz w:val="16"/>
+                  <w:szCs w:val="16"/>
+                </w:rPr>
+                <w:t xml:space="preserve">F1 0.534, 47.9 FA/1k</w:t>
+              </w:r>
+            </w:ins>
+          </w:p>
+        </w:tc>
+        <w:tc>
+          <w:tcPr>
+            <w:tcW w:type="dxa" w:w="1260"/>
+            <w:tcBorders>
+              <w:bottom w:val="single" w:color="000000" w:sz="4"/>
+            </w:tcBorders>
+            <w:tcMar>
+              <w:left w:type="dxa" w:w="60"/>
+              <w:right w:type="dxa" w:w="60"/>
+            </w:tcMar>
+          </w:tcPr>
+          <w:p>
+            <w:pPr>
+              <w:jc w:val="center"/>
+              <w:rPr>
+                <w:ins w:id="91097" w:author="Claude" w:date="2026-10-27T00:00:00Z"/>
+              </w:rPr>
+            </w:pPr>
+            <w:ins w:id="91098" w:author="Claude" w:date="2026-10-27T00:00:00Z">
+              <w:r>
+                <w:rPr>
+                  <w:sz w:val="16"/>
+                  <w:szCs w:val="16"/>
+                </w:rPr>
+                <w:t xml:space="preserve">Shailaputri 0.530, 4.0</w:t>
+              </w:r>
+            </w:ins>
+          </w:p>
+        </w:tc>
+      </w:tr>
+    </w:tbl>
+    <w:p>
+      <w:pPr>
+        <w:spacing w:after="0" w:line="240"/>
+        <w:ind w:firstLine="202"/>
+        <w:jc w:val="both"/>
+        <w:rPr>
+          <w:ins w:id="91100" w:author="Claude" w:date="2026-10-27T00:00:00Z"/>
+        </w:rPr>
+      </w:pPr>
+      <w:ins w:id="91101" w:author="Claude" w:date="2026-10-27T00:00:00Z">
+        <w:r>
+          <w:t xml:space="preserve">Two of the nine do not yet earn a decision on their own. Mahagauri, the recovery verifier, stays within its safety budget only by rarely confirming recovery, and Siddhidatri's fusion of three detectors buys recall with false alarms. Both remain advisory: a person decides.</w:t>
+        </w:r>
+      </w:ins>
+    </w:p>
+    <w:p>
+      <w:pPr>
+        <w:keepNext/>
         <w:spacing w:after="80" w:before="160"/>
         <w:jc w:val="center"/>
       </w:pPr>
@@ -11483,45 +12770,1363 @@
     <w:p>
       <w:pPr>
         <w:keepNext/>
-        <w:spacing w:after="80" w:before="160"/>
-        <w:jc w:val="center"/>
-      </w:pPr>
-      <w:r>
-        <w:rPr>
-          <w:smallCaps/>
-        </w:rPr>
-        <w:t xml:space="preserve">XV. Discussion</w:t>
-      </w:r>
+        <w:spacing w:after="40" w:before="80"/>
+        <w:rPr>
+          <w:ins w:id="91102" w:author="Claude" w:date="2026-10-27T00:00:00Z"/>
+        </w:rPr>
+      </w:pPr>
+      <w:ins w:id="91103" w:author="Claude" w:date="2026-10-27T00:00:00Z">
+        <w:r>
+          <w:rPr>
+            <w:i/>
+            <w:iCs/>
+          </w:rPr>
+          <w:t xml:space="preserve">G. RQ5: The Project's Model Against General Language Models</w:t>
+        </w:r>
+      </w:ins>
     </w:p>
     <w:p>
       <w:pPr>
         <w:spacing w:after="0" w:line="240"/>
         <w:ind w:firstLine="202"/>
         <w:jc w:val="both"/>
-      </w:pPr>
-      <w:r>
-        <w:t xml:space="preserve">Taken together, the four results support one claim and leave another open. The supported claim is about containment. On the cluster, the policy layer executed no wrong action (RQ1). Across the whole corpus it never let a forbidden action run alone (RQ2). An attacker in full control of the model could not cause a single execution or approval through the agent (RQ3). And real models under injection did not get anything past it either (RQ4). The open claim is about competence. Nothing here shows that the system diagnoses incidents well or resolves them quickly, and RQ1 and RQ2 both show it handing too much to people.</w:t>
-      </w:r>
-    </w:p>
+        <w:rPr>
+          <w:ins w:id="91104" w:author="Claude" w:date="2026-10-27T00:00:00Z"/>
+        </w:rPr>
+      </w:pPr>
+      <w:ins w:id="91105" w:author="Claude" w:date="2026-10-27T00:00:00Z">
+        <w:r>
+          <w:t xml:space="preserve">RQ5 asks whether a small model trained on real incidents diagnoses better than general language models given the same evidence, on a benchmark this project did not write. The cases come from RCAEval: fault injections on real microservice deployments, labelled by the injected root service. A sample of 100 Online Boutique and Sock Shop cases was declared and hash-locked before any run. Every diagnoser received the same per-service evidence, built without the label, and was scored by the same harness. Katyayani was trained only on other systems. The language models ran through the AI Gateway at temperature 0.2 (Table XII).</w:t>
+        </w:r>
+      </w:ins>
+    </w:p>
+    <w:p>
+      <w:pPr>
+        <w:keepNext/>
+        <w:spacing w:after="0" w:before="160"/>
+        <w:jc w:val="center"/>
+        <w:rPr>
+          <w:ins w:id="91106" w:author="Claude" w:date="2026-10-27T00:00:00Z"/>
+        </w:rPr>
+      </w:pPr>
+      <w:ins w:id="91107" w:author="Claude" w:date="2026-10-27T00:00:00Z">
+        <w:r>
+          <w:rPr>
+            <w:smallCaps/>
+            <w:sz w:val="16"/>
+            <w:szCs w:val="16"/>
+          </w:rPr>
+          <w:t xml:space="preserve">TABLE XII</w:t>
+        </w:r>
+      </w:ins>
+    </w:p>
+    <w:p>
+      <w:pPr>
+        <w:keepNext/>
+        <w:spacing w:after="60"/>
+        <w:jc w:val="center"/>
+        <w:rPr>
+          <w:ins w:id="91108" w:author="Claude" w:date="2026-10-27T00:00:00Z"/>
+        </w:rPr>
+      </w:pPr>
+      <w:ins w:id="91109" w:author="Claude" w:date="2026-10-27T00:00:00Z">
+        <w:r>
+          <w:rPr>
+            <w:smallCaps/>
+            <w:sz w:val="16"/>
+            <w:szCs w:val="16"/>
+          </w:rPr>
+          <w:t xml:space="preserve">RQ5: Root Cause on 100 Pre-Declared RCAEval Cases</w:t>
+        </w:r>
+      </w:ins>
+    </w:p>
+    <w:tbl>
+      <w:tblPr>
+        <w:tblW w:type="dxa" w:w="5040"/>
+      </w:tblPr>
+      <w:tblGrid>
+        <w:gridCol w:w="1440"/>
+        <w:gridCol w:w="1000"/>
+        <w:gridCol w:w="1300"/>
+        <w:gridCol w:w="1300"/>
+      </w:tblGrid>
+      <w:tr>
+        <w:trPr>
+          <w:cantSplit/>
+          <w:ins w:id="91118" w:author="Claude" w:date="2026-10-27T00:00:00Z"/>
+        </w:trPr>
+        <w:tc>
+          <w:tcPr>
+            <w:tcW w:type="dxa" w:w="1440"/>
+            <w:tcBorders>
+              <w:top w:val="single" w:color="000000" w:sz="4"/>
+              <w:bottom w:val="single" w:color="000000" w:sz="4"/>
+            </w:tcBorders>
+            <w:tcMar>
+              <w:left w:type="dxa" w:w="60"/>
+              <w:right w:type="dxa" w:w="60"/>
+            </w:tcMar>
+          </w:tcPr>
+          <w:p>
+            <w:pPr>
+              <w:jc w:val="left"/>
+              <w:rPr>
+                <w:ins w:id="91110" w:author="Claude" w:date="2026-10-27T00:00:00Z"/>
+              </w:rPr>
+            </w:pPr>
+            <w:ins w:id="91111" w:author="Claude" w:date="2026-10-27T00:00:00Z">
+              <w:r>
+                <w:rPr>
+                  <w:b/>
+                  <w:bCs/>
+                  <w:sz w:val="16"/>
+                  <w:szCs w:val="16"/>
+                </w:rPr>
+                <w:t xml:space="preserve">Diagnoser</w:t>
+              </w:r>
+            </w:ins>
+          </w:p>
+        </w:tc>
+        <w:tc>
+          <w:tcPr>
+            <w:tcW w:type="dxa" w:w="1000"/>
+            <w:tcBorders>
+              <w:top w:val="single" w:color="000000" w:sz="4"/>
+              <w:bottom w:val="single" w:color="000000" w:sz="4"/>
+            </w:tcBorders>
+            <w:tcMar>
+              <w:left w:type="dxa" w:w="60"/>
+              <w:right w:type="dxa" w:w="60"/>
+            </w:tcMar>
+          </w:tcPr>
+          <w:p>
+            <w:pPr>
+              <w:jc w:val="center"/>
+              <w:rPr>
+                <w:ins w:id="91112" w:author="Claude" w:date="2026-10-27T00:00:00Z"/>
+              </w:rPr>
+            </w:pPr>
+            <w:ins w:id="91113" w:author="Claude" w:date="2026-10-27T00:00:00Z">
+              <w:r>
+                <w:rPr>
+                  <w:b/>
+                  <w:bCs/>
+                  <w:sz w:val="16"/>
+                  <w:szCs w:val="16"/>
+                </w:rPr>
+                <w:t xml:space="preserve">RCA@1</w:t>
+              </w:r>
+            </w:ins>
+          </w:p>
+        </w:tc>
+        <w:tc>
+          <w:tcPr>
+            <w:tcW w:type="dxa" w:w="1300"/>
+            <w:tcBorders>
+              <w:top w:val="single" w:color="000000" w:sz="4"/>
+              <w:bottom w:val="single" w:color="000000" w:sz="4"/>
+            </w:tcBorders>
+            <w:tcMar>
+              <w:left w:type="dxa" w:w="60"/>
+              <w:right w:type="dxa" w:w="60"/>
+            </w:tcMar>
+          </w:tcPr>
+          <w:p>
+            <w:pPr>
+              <w:jc w:val="center"/>
+              <w:rPr>
+                <w:ins w:id="91114" w:author="Claude" w:date="2026-10-27T00:00:00Z"/>
+              </w:rPr>
+            </w:pPr>
+            <w:ins w:id="91115" w:author="Claude" w:date="2026-10-27T00:00:00Z">
+              <w:r>
+                <w:rPr>
+                  <w:b/>
+                  <w:bCs/>
+                  <w:sz w:val="16"/>
+                  <w:szCs w:val="16"/>
+                </w:rPr>
+                <w:t xml:space="preserve">Only Katy. right</w:t>
+              </w:r>
+            </w:ins>
+          </w:p>
+        </w:tc>
+        <w:tc>
+          <w:tcPr>
+            <w:tcW w:type="dxa" w:w="1300"/>
+            <w:tcBorders>
+              <w:top w:val="single" w:color="000000" w:sz="4"/>
+              <w:bottom w:val="single" w:color="000000" w:sz="4"/>
+            </w:tcBorders>
+            <w:tcMar>
+              <w:left w:type="dxa" w:w="60"/>
+              <w:right w:type="dxa" w:w="60"/>
+            </w:tcMar>
+          </w:tcPr>
+          <w:p>
+            <w:pPr>
+              <w:jc w:val="center"/>
+              <w:rPr>
+                <w:ins w:id="91116" w:author="Claude" w:date="2026-10-27T00:00:00Z"/>
+              </w:rPr>
+            </w:pPr>
+            <w:ins w:id="91117" w:author="Claude" w:date="2026-10-27T00:00:00Z">
+              <w:r>
+                <w:rPr>
+                  <w:b/>
+                  <w:bCs/>
+                  <w:sz w:val="16"/>
+                  <w:szCs w:val="16"/>
+                </w:rPr>
+                <w:t xml:space="preserve">Only it right</w:t>
+              </w:r>
+            </w:ins>
+          </w:p>
+        </w:tc>
+      </w:tr>
+      <w:tr>
+        <w:trPr>
+          <w:cantSplit/>
+          <w:ins w:id="91127" w:author="Claude" w:date="2026-10-27T00:00:00Z"/>
+        </w:trPr>
+        <w:tc>
+          <w:tcPr>
+            <w:tcW w:type="dxa" w:w="1440"/>
+            <w:tcBorders/>
+            <w:tcMar>
+              <w:left w:type="dxa" w:w="60"/>
+              <w:right w:type="dxa" w:w="60"/>
+            </w:tcMar>
+          </w:tcPr>
+          <w:p>
+            <w:pPr>
+              <w:jc w:val="left"/>
+              <w:rPr>
+                <w:ins w:id="91119" w:author="Claude" w:date="2026-10-27T00:00:00Z"/>
+              </w:rPr>
+            </w:pPr>
+            <w:ins w:id="91120" w:author="Claude" w:date="2026-10-27T00:00:00Z">
+              <w:r>
+                <w:rPr>
+                  <w:sz w:val="16"/>
+                  <w:szCs w:val="16"/>
+                </w:rPr>
+                <w:t xml:space="preserve">Katyayani</w:t>
+              </w:r>
+            </w:ins>
+          </w:p>
+        </w:tc>
+        <w:tc>
+          <w:tcPr>
+            <w:tcW w:type="dxa" w:w="1000"/>
+            <w:tcBorders/>
+            <w:tcMar>
+              <w:left w:type="dxa" w:w="60"/>
+              <w:right w:type="dxa" w:w="60"/>
+            </w:tcMar>
+          </w:tcPr>
+          <w:p>
+            <w:pPr>
+              <w:jc w:val="center"/>
+              <w:rPr>
+                <w:ins w:id="91121" w:author="Claude" w:date="2026-10-27T00:00:00Z"/>
+              </w:rPr>
+            </w:pPr>
+            <w:ins w:id="91122" w:author="Claude" w:date="2026-10-27T00:00:00Z">
+              <w:r>
+                <w:rPr>
+                  <w:sz w:val="16"/>
+                  <w:szCs w:val="16"/>
+                </w:rPr>
+                <w:t xml:space="preserve">0.940</w:t>
+              </w:r>
+            </w:ins>
+          </w:p>
+        </w:tc>
+        <w:tc>
+          <w:tcPr>
+            <w:tcW w:type="dxa" w:w="1300"/>
+            <w:tcBorders/>
+            <w:tcMar>
+              <w:left w:type="dxa" w:w="60"/>
+              <w:right w:type="dxa" w:w="60"/>
+            </w:tcMar>
+          </w:tcPr>
+          <w:p>
+            <w:pPr>
+              <w:jc w:val="center"/>
+              <w:rPr>
+                <w:ins w:id="91123" w:author="Claude" w:date="2026-10-27T00:00:00Z"/>
+              </w:rPr>
+            </w:pPr>
+            <w:ins w:id="91124" w:author="Claude" w:date="2026-10-27T00:00:00Z">
+              <w:r>
+                <w:rPr>
+                  <w:sz w:val="16"/>
+                  <w:szCs w:val="16"/>
+                </w:rPr>
+                <w:t xml:space="preserve">–</w:t>
+              </w:r>
+            </w:ins>
+          </w:p>
+        </w:tc>
+        <w:tc>
+          <w:tcPr>
+            <w:tcW w:type="dxa" w:w="1300"/>
+            <w:tcBorders/>
+            <w:tcMar>
+              <w:left w:type="dxa" w:w="60"/>
+              <w:right w:type="dxa" w:w="60"/>
+            </w:tcMar>
+          </w:tcPr>
+          <w:p>
+            <w:pPr>
+              <w:jc w:val="center"/>
+              <w:rPr>
+                <w:ins w:id="91125" w:author="Claude" w:date="2026-10-27T00:00:00Z"/>
+              </w:rPr>
+            </w:pPr>
+            <w:ins w:id="91126" w:author="Claude" w:date="2026-10-27T00:00:00Z">
+              <w:r>
+                <w:rPr>
+                  <w:sz w:val="16"/>
+                  <w:szCs w:val="16"/>
+                </w:rPr>
+                <w:t xml:space="preserve">–</w:t>
+              </w:r>
+            </w:ins>
+          </w:p>
+        </w:tc>
+      </w:tr>
+      <w:tr>
+        <w:trPr>
+          <w:cantSplit/>
+          <w:ins w:id="91136" w:author="Claude" w:date="2026-10-27T00:00:00Z"/>
+        </w:trPr>
+        <w:tc>
+          <w:tcPr>
+            <w:tcW w:type="dxa" w:w="1440"/>
+            <w:tcBorders/>
+            <w:tcMar>
+              <w:left w:type="dxa" w:w="60"/>
+              <w:right w:type="dxa" w:w="60"/>
+            </w:tcMar>
+          </w:tcPr>
+          <w:p>
+            <w:pPr>
+              <w:jc w:val="left"/>
+              <w:rPr>
+                <w:ins w:id="91128" w:author="Claude" w:date="2026-10-27T00:00:00Z"/>
+              </w:rPr>
+            </w:pPr>
+            <w:ins w:id="91129" w:author="Claude" w:date="2026-10-27T00:00:00Z">
+              <w:r>
+                <w:rPr>
+                  <w:sz w:val="16"/>
+                  <w:szCs w:val="16"/>
+                </w:rPr>
+                <w:t xml:space="preserve">Llama 3 8B</w:t>
+              </w:r>
+            </w:ins>
+          </w:p>
+        </w:tc>
+        <w:tc>
+          <w:tcPr>
+            <w:tcW w:type="dxa" w:w="1000"/>
+            <w:tcBorders/>
+            <w:tcMar>
+              <w:left w:type="dxa" w:w="60"/>
+              <w:right w:type="dxa" w:w="60"/>
+            </w:tcMar>
+          </w:tcPr>
+          <w:p>
+            <w:pPr>
+              <w:jc w:val="center"/>
+              <w:rPr>
+                <w:ins w:id="91130" w:author="Claude" w:date="2026-10-27T00:00:00Z"/>
+              </w:rPr>
+            </w:pPr>
+            <w:ins w:id="91131" w:author="Claude" w:date="2026-10-27T00:00:00Z">
+              <w:r>
+                <w:rPr>
+                  <w:sz w:val="16"/>
+                  <w:szCs w:val="16"/>
+                </w:rPr>
+                <w:t xml:space="preserve">0.550</w:t>
+              </w:r>
+            </w:ins>
+          </w:p>
+        </w:tc>
+        <w:tc>
+          <w:tcPr>
+            <w:tcW w:type="dxa" w:w="1300"/>
+            <w:tcBorders/>
+            <w:tcMar>
+              <w:left w:type="dxa" w:w="60"/>
+              <w:right w:type="dxa" w:w="60"/>
+            </w:tcMar>
+          </w:tcPr>
+          <w:p>
+            <w:pPr>
+              <w:jc w:val="center"/>
+              <w:rPr>
+                <w:ins w:id="91132" w:author="Claude" w:date="2026-10-27T00:00:00Z"/>
+              </w:rPr>
+            </w:pPr>
+            <w:ins w:id="91133" w:author="Claude" w:date="2026-10-27T00:00:00Z">
+              <w:r>
+                <w:rPr>
+                  <w:sz w:val="16"/>
+                  <w:szCs w:val="16"/>
+                </w:rPr>
+                <w:t xml:space="preserve">41</w:t>
+              </w:r>
+            </w:ins>
+          </w:p>
+        </w:tc>
+        <w:tc>
+          <w:tcPr>
+            <w:tcW w:type="dxa" w:w="1300"/>
+            <w:tcBorders/>
+            <w:tcMar>
+              <w:left w:type="dxa" w:w="60"/>
+              <w:right w:type="dxa" w:w="60"/>
+            </w:tcMar>
+          </w:tcPr>
+          <w:p>
+            <w:pPr>
+              <w:jc w:val="center"/>
+              <w:rPr>
+                <w:ins w:id="91134" w:author="Claude" w:date="2026-10-27T00:00:00Z"/>
+              </w:rPr>
+            </w:pPr>
+            <w:ins w:id="91135" w:author="Claude" w:date="2026-10-27T00:00:00Z">
+              <w:r>
+                <w:rPr>
+                  <w:sz w:val="16"/>
+                  <w:szCs w:val="16"/>
+                </w:rPr>
+                <w:t xml:space="preserve">2</w:t>
+              </w:r>
+            </w:ins>
+          </w:p>
+        </w:tc>
+      </w:tr>
+      <w:tr>
+        <w:trPr>
+          <w:cantSplit/>
+          <w:ins w:id="91145" w:author="Claude" w:date="2026-10-27T00:00:00Z"/>
+        </w:trPr>
+        <w:tc>
+          <w:tcPr>
+            <w:tcW w:type="dxa" w:w="1440"/>
+            <w:tcBorders/>
+            <w:tcMar>
+              <w:left w:type="dxa" w:w="60"/>
+              <w:right w:type="dxa" w:w="60"/>
+            </w:tcMar>
+          </w:tcPr>
+          <w:p>
+            <w:pPr>
+              <w:jc w:val="left"/>
+              <w:rPr>
+                <w:ins w:id="91137" w:author="Claude" w:date="2026-10-27T00:00:00Z"/>
+              </w:rPr>
+            </w:pPr>
+            <w:ins w:id="91138" w:author="Claude" w:date="2026-10-27T00:00:00Z">
+              <w:r>
+                <w:rPr>
+                  <w:sz w:val="16"/>
+                  <w:szCs w:val="16"/>
+                </w:rPr>
+                <w:t xml:space="preserve">Qwen2.5 7B</w:t>
+              </w:r>
+            </w:ins>
+          </w:p>
+        </w:tc>
+        <w:tc>
+          <w:tcPr>
+            <w:tcW w:type="dxa" w:w="1000"/>
+            <w:tcBorders/>
+            <w:tcMar>
+              <w:left w:type="dxa" w:w="60"/>
+              <w:right w:type="dxa" w:w="60"/>
+            </w:tcMar>
+          </w:tcPr>
+          <w:p>
+            <w:pPr>
+              <w:jc w:val="center"/>
+              <w:rPr>
+                <w:ins w:id="91139" w:author="Claude" w:date="2026-10-27T00:00:00Z"/>
+              </w:rPr>
+            </w:pPr>
+            <w:ins w:id="91140" w:author="Claude" w:date="2026-10-27T00:00:00Z">
+              <w:r>
+                <w:rPr>
+                  <w:sz w:val="16"/>
+                  <w:szCs w:val="16"/>
+                </w:rPr>
+                <w:t xml:space="preserve">0.510</w:t>
+              </w:r>
+            </w:ins>
+          </w:p>
+        </w:tc>
+        <w:tc>
+          <w:tcPr>
+            <w:tcW w:type="dxa" w:w="1300"/>
+            <w:tcBorders/>
+            <w:tcMar>
+              <w:left w:type="dxa" w:w="60"/>
+              <w:right w:type="dxa" w:w="60"/>
+            </w:tcMar>
+          </w:tcPr>
+          <w:p>
+            <w:pPr>
+              <w:jc w:val="center"/>
+              <w:rPr>
+                <w:ins w:id="91141" w:author="Claude" w:date="2026-10-27T00:00:00Z"/>
+              </w:rPr>
+            </w:pPr>
+            <w:ins w:id="91142" w:author="Claude" w:date="2026-10-27T00:00:00Z">
+              <w:r>
+                <w:rPr>
+                  <w:sz w:val="16"/>
+                  <w:szCs w:val="16"/>
+                </w:rPr>
+                <w:t xml:space="preserve">44</w:t>
+              </w:r>
+            </w:ins>
+          </w:p>
+        </w:tc>
+        <w:tc>
+          <w:tcPr>
+            <w:tcW w:type="dxa" w:w="1300"/>
+            <w:tcBorders/>
+            <w:tcMar>
+              <w:left w:type="dxa" w:w="60"/>
+              <w:right w:type="dxa" w:w="60"/>
+            </w:tcMar>
+          </w:tcPr>
+          <w:p>
+            <w:pPr>
+              <w:jc w:val="center"/>
+              <w:rPr>
+                <w:ins w:id="91143" w:author="Claude" w:date="2026-10-27T00:00:00Z"/>
+              </w:rPr>
+            </w:pPr>
+            <w:ins w:id="91144" w:author="Claude" w:date="2026-10-27T00:00:00Z">
+              <w:r>
+                <w:rPr>
+                  <w:sz w:val="16"/>
+                  <w:szCs w:val="16"/>
+                </w:rPr>
+                <w:t xml:space="preserve">1</w:t>
+              </w:r>
+            </w:ins>
+          </w:p>
+        </w:tc>
+      </w:tr>
+      <w:tr>
+        <w:trPr>
+          <w:cantSplit/>
+          <w:ins w:id="91154" w:author="Claude" w:date="2026-10-27T00:00:00Z"/>
+        </w:trPr>
+        <w:tc>
+          <w:tcPr>
+            <w:tcW w:type="dxa" w:w="1440"/>
+            <w:tcBorders>
+              <w:bottom w:val="single" w:color="000000" w:sz="4"/>
+            </w:tcBorders>
+            <w:tcMar>
+              <w:left w:type="dxa" w:w="60"/>
+              <w:right w:type="dxa" w:w="60"/>
+            </w:tcMar>
+          </w:tcPr>
+          <w:p>
+            <w:pPr>
+              <w:jc w:val="left"/>
+              <w:rPr>
+                <w:ins w:id="91146" w:author="Claude" w:date="2026-10-27T00:00:00Z"/>
+              </w:rPr>
+            </w:pPr>
+            <w:ins w:id="91147" w:author="Claude" w:date="2026-10-27T00:00:00Z">
+              <w:r>
+                <w:rPr>
+                  <w:sz w:val="16"/>
+                  <w:szCs w:val="16"/>
+                </w:rPr>
+                <w:t xml:space="preserve">Loudest service</w:t>
+              </w:r>
+            </w:ins>
+          </w:p>
+        </w:tc>
+        <w:tc>
+          <w:tcPr>
+            <w:tcW w:type="dxa" w:w="1000"/>
+            <w:tcBorders>
+              <w:bottom w:val="single" w:color="000000" w:sz="4"/>
+            </w:tcBorders>
+            <w:tcMar>
+              <w:left w:type="dxa" w:w="60"/>
+              <w:right w:type="dxa" w:w="60"/>
+            </w:tcMar>
+          </w:tcPr>
+          <w:p>
+            <w:pPr>
+              <w:jc w:val="center"/>
+              <w:rPr>
+                <w:ins w:id="91148" w:author="Claude" w:date="2026-10-27T00:00:00Z"/>
+              </w:rPr>
+            </w:pPr>
+            <w:ins w:id="91149" w:author="Claude" w:date="2026-10-27T00:00:00Z">
+              <w:r>
+                <w:rPr>
+                  <w:sz w:val="16"/>
+                  <w:szCs w:val="16"/>
+                </w:rPr>
+                <w:t xml:space="preserve">0.660</w:t>
+              </w:r>
+            </w:ins>
+          </w:p>
+        </w:tc>
+        <w:tc>
+          <w:tcPr>
+            <w:tcW w:type="dxa" w:w="1300"/>
+            <w:tcBorders>
+              <w:bottom w:val="single" w:color="000000" w:sz="4"/>
+            </w:tcBorders>
+            <w:tcMar>
+              <w:left w:type="dxa" w:w="60"/>
+              <w:right w:type="dxa" w:w="60"/>
+            </w:tcMar>
+          </w:tcPr>
+          <w:p>
+            <w:pPr>
+              <w:jc w:val="center"/>
+              <w:rPr>
+                <w:ins w:id="91150" w:author="Claude" w:date="2026-10-27T00:00:00Z"/>
+              </w:rPr>
+            </w:pPr>
+            <w:ins w:id="91151" w:author="Claude" w:date="2026-10-27T00:00:00Z">
+              <w:r>
+                <w:rPr>
+                  <w:sz w:val="16"/>
+                  <w:szCs w:val="16"/>
+                </w:rPr>
+                <w:t xml:space="preserve">30</w:t>
+              </w:r>
+            </w:ins>
+          </w:p>
+        </w:tc>
+        <w:tc>
+          <w:tcPr>
+            <w:tcW w:type="dxa" w:w="1300"/>
+            <w:tcBorders>
+              <w:bottom w:val="single" w:color="000000" w:sz="4"/>
+            </w:tcBorders>
+            <w:tcMar>
+              <w:left w:type="dxa" w:w="60"/>
+              <w:right w:type="dxa" w:w="60"/>
+            </w:tcMar>
+          </w:tcPr>
+          <w:p>
+            <w:pPr>
+              <w:jc w:val="center"/>
+              <w:rPr>
+                <w:ins w:id="91152" w:author="Claude" w:date="2026-10-27T00:00:00Z"/>
+              </w:rPr>
+            </w:pPr>
+            <w:ins w:id="91153" w:author="Claude" w:date="2026-10-27T00:00:00Z">
+              <w:r>
+                <w:rPr>
+                  <w:sz w:val="16"/>
+                  <w:szCs w:val="16"/>
+                </w:rPr>
+                <w:t xml:space="preserve">2</w:t>
+              </w:r>
+            </w:ins>
+          </w:p>
+        </w:tc>
+      </w:tr>
+    </w:tbl>
     <w:p>
       <w:pPr>
         <w:spacing w:after="0" w:line="240"/>
         <w:ind w:firstLine="202"/>
         <w:jc w:val="both"/>
-      </w:pPr>
-      <w:r>
-        <w:t xml:space="preserve">Those two failure modes are not equally bad. A system that hands too much to people is annoying. A system that confidently executes the wrong action in production is dangerous. The runbook in RQ1 got more than half its executed actions wrong. The architecture got none wrong, and its over escalation has a clear, adjustable source: production adds 15 points, most incidents touch more than one entity, and an autonomous threshold of 30 is strict once those penalties apply. The isolate host denial in RQ4 shows the cost concretely. The thresholds and weights are parameters, and the benchmark is the intended tool for tuning them. What the architecture guarantees is that tuning can only move the line between autonomous and human; it cannot let the model move it.</w:t>
-      </w:r>
+        <w:rPr>
+          <w:ins w:id="91155" w:author="Claude" w:date="2026-10-27T00:00:00Z"/>
+        </w:rPr>
+      </w:pPr>
+      <w:ins w:id="91156" w:author="Claude" w:date="2026-10-27T00:00:00Z">
+        <w:r>
+          <w:t xml:space="preserve">Paired on the same cases with exact McNemar tests and Holm's correction, Katyayani is better than every other diagnoser (largest corrected p 2e-07). Neither language model beats the no-learning rule of naming the loudest service. The models are 7 to 8 billion parameters on CPU, run once each; a frontier model behind the same Gateway is the obvious next arm.</w:t>
+        </w:r>
+      </w:ins>
+    </w:p>
+    <w:p>
+      <w:pPr>
+        <w:keepNext/>
+        <w:spacing w:after="40" w:before="80"/>
+        <w:rPr>
+          <w:ins w:id="91157" w:author="Claude" w:date="2026-10-27T00:00:00Z"/>
+        </w:rPr>
+      </w:pPr>
+      <w:ins w:id="91158" w:author="Claude" w:date="2026-10-27T00:00:00Z">
+        <w:r>
+          <w:rPr>
+            <w:i/>
+            <w:iCs/>
+          </w:rPr>
+          <w:t xml:space="preserve">H. RQ6: From a Simulator to Real Systems</w:t>
+        </w:r>
+      </w:ins>
     </w:p>
     <w:p>
       <w:pPr>
         <w:spacing w:after="0" w:line="240"/>
         <w:ind w:firstLine="202"/>
         <w:jc w:val="both"/>
-      </w:pPr>
-      <w:r>
-        <w:t xml:space="preserve">On novelty: none of the individual mechanisms is new. Policy gates, runbooks, safety shields [38] and retrieval with citations [27] all exist. The contribution is the combination, made checkable. In particular, RQ3 gives a bound that does not depend on any model's behaviour, which is the property recent work on structural injection defences argues for [32], [33]. Pashupatastra shows that bound holding in a deployed incident response system, with the attack surface enumerated rather than sampled. A broader lesson is that most of the safety properties are boring code: exact string matching, a frozen list of identifiers, a verdict with an expiry time, a learning function with one path. Each can be read and tested by someone who does not trust the model, which is the position an operator should be in.</w:t>
-      </w:r>
+        <w:rPr>
+          <w:ins w:id="91159" w:author="Claude" w:date="2026-10-27T00:00:00Z"/>
+        </w:rPr>
+      </w:pPr>
+      <w:ins w:id="91160" w:author="Claude" w:date="2026-10-27T00:00:00Z">
+        <w:r>
+          <w:t xml:space="preserve">RQ6 asks whether a root-cause model trained on synthetic incidents works on real ones. The same ranker was trained twice: on 50,000 incidents from the project's simulator, and on real fault injections. It was tested, each system held out in turn, on two RCAEval systems and on a third built for this test: 200 faults injected on a real Kubernetes cluster from a plan committed before any run. The features are the event-level ones the deployed API can compute (Table XIII).</w:t>
+        </w:r>
+      </w:ins>
+    </w:p>
+    <w:p>
+      <w:pPr>
+        <w:keepNext/>
+        <w:spacing w:after="0" w:before="160"/>
+        <w:jc w:val="center"/>
+        <w:rPr>
+          <w:ins w:id="91161" w:author="Claude" w:date="2026-10-27T00:00:00Z"/>
+        </w:rPr>
+      </w:pPr>
+      <w:ins w:id="91162" w:author="Claude" w:date="2026-10-27T00:00:00Z">
+        <w:r>
+          <w:rPr>
+            <w:smallCaps/>
+            <w:sz w:val="16"/>
+            <w:szCs w:val="16"/>
+          </w:rPr>
+          <w:t xml:space="preserve">TABLE XIII</w:t>
+        </w:r>
+      </w:ins>
+    </w:p>
+    <w:p>
+      <w:pPr>
+        <w:keepNext/>
+        <w:spacing w:after="60"/>
+        <w:jc w:val="center"/>
+        <w:rPr>
+          <w:ins w:id="91163" w:author="Claude" w:date="2026-10-27T00:00:00Z"/>
+        </w:rPr>
+      </w:pPr>
+      <w:ins w:id="91164" w:author="Claude" w:date="2026-10-27T00:00:00Z">
+        <w:r>
+          <w:rPr>
+            <w:smallCaps/>
+            <w:sz w:val="16"/>
+            <w:szCs w:val="16"/>
+          </w:rPr>
+          <w:t xml:space="preserve">RQ6: RCA@1, Trained on Real Incidents or on the Simulator</w:t>
+        </w:r>
+      </w:ins>
+    </w:p>
+    <w:tbl>
+      <w:tblPr>
+        <w:tblW w:type="dxa" w:w="5040"/>
+      </w:tblPr>
+      <w:tblGrid>
+        <w:gridCol w:w="1440"/>
+        <w:gridCol w:w="1200"/>
+        <w:gridCol w:w="1200"/>
+        <w:gridCol w:w="1200"/>
+      </w:tblGrid>
+      <w:tr>
+        <w:trPr>
+          <w:cantSplit/>
+          <w:ins w:id="91173" w:author="Claude" w:date="2026-10-27T00:00:00Z"/>
+        </w:trPr>
+        <w:tc>
+          <w:tcPr>
+            <w:tcW w:type="dxa" w:w="1440"/>
+            <w:tcBorders>
+              <w:top w:val="single" w:color="000000" w:sz="4"/>
+              <w:bottom w:val="single" w:color="000000" w:sz="4"/>
+            </w:tcBorders>
+            <w:tcMar>
+              <w:left w:type="dxa" w:w="60"/>
+              <w:right w:type="dxa" w:w="60"/>
+            </w:tcMar>
+          </w:tcPr>
+          <w:p>
+            <w:pPr>
+              <w:jc w:val="left"/>
+              <w:rPr>
+                <w:ins w:id="91165" w:author="Claude" w:date="2026-10-27T00:00:00Z"/>
+              </w:rPr>
+            </w:pPr>
+            <w:ins w:id="91166" w:author="Claude" w:date="2026-10-27T00:00:00Z">
+              <w:r>
+                <w:rPr>
+                  <w:b/>
+                  <w:bCs/>
+                  <w:sz w:val="16"/>
+                  <w:szCs w:val="16"/>
+                </w:rPr>
+                <w:t xml:space="preserve">Held out</w:t>
+              </w:r>
+            </w:ins>
+          </w:p>
+        </w:tc>
+        <w:tc>
+          <w:tcPr>
+            <w:tcW w:type="dxa" w:w="1200"/>
+            <w:tcBorders>
+              <w:top w:val="single" w:color="000000" w:sz="4"/>
+              <w:bottom w:val="single" w:color="000000" w:sz="4"/>
+            </w:tcBorders>
+            <w:tcMar>
+              <w:left w:type="dxa" w:w="60"/>
+              <w:right w:type="dxa" w:w="60"/>
+            </w:tcMar>
+          </w:tcPr>
+          <w:p>
+            <w:pPr>
+              <w:jc w:val="center"/>
+              <w:rPr>
+                <w:ins w:id="91167" w:author="Claude" w:date="2026-10-27T00:00:00Z"/>
+              </w:rPr>
+            </w:pPr>
+            <w:ins w:id="91168" w:author="Claude" w:date="2026-10-27T00:00:00Z">
+              <w:r>
+                <w:rPr>
+                  <w:b/>
+                  <w:bCs/>
+                  <w:sz w:val="16"/>
+                  <w:szCs w:val="16"/>
+                </w:rPr>
+                <w:t xml:space="preserve">Real-trained</w:t>
+              </w:r>
+            </w:ins>
+          </w:p>
+        </w:tc>
+        <w:tc>
+          <w:tcPr>
+            <w:tcW w:type="dxa" w:w="1200"/>
+            <w:tcBorders>
+              <w:top w:val="single" w:color="000000" w:sz="4"/>
+              <w:bottom w:val="single" w:color="000000" w:sz="4"/>
+            </w:tcBorders>
+            <w:tcMar>
+              <w:left w:type="dxa" w:w="60"/>
+              <w:right w:type="dxa" w:w="60"/>
+            </w:tcMar>
+          </w:tcPr>
+          <w:p>
+            <w:pPr>
+              <w:jc w:val="center"/>
+              <w:rPr>
+                <w:ins w:id="91169" w:author="Claude" w:date="2026-10-27T00:00:00Z"/>
+              </w:rPr>
+            </w:pPr>
+            <w:ins w:id="91170" w:author="Claude" w:date="2026-10-27T00:00:00Z">
+              <w:r>
+                <w:rPr>
+                  <w:b/>
+                  <w:bCs/>
+                  <w:sz w:val="16"/>
+                  <w:szCs w:val="16"/>
+                </w:rPr>
+                <w:t xml:space="preserve">Simulator-trained</w:t>
+              </w:r>
+            </w:ins>
+          </w:p>
+        </w:tc>
+        <w:tc>
+          <w:tcPr>
+            <w:tcW w:type="dxa" w:w="1200"/>
+            <w:tcBorders>
+              <w:top w:val="single" w:color="000000" w:sz="4"/>
+              <w:bottom w:val="single" w:color="000000" w:sz="4"/>
+            </w:tcBorders>
+            <w:tcMar>
+              <w:left w:type="dxa" w:w="60"/>
+              <w:right w:type="dxa" w:w="60"/>
+            </w:tcMar>
+          </w:tcPr>
+          <w:p>
+            <w:pPr>
+              <w:jc w:val="center"/>
+              <w:rPr>
+                <w:ins w:id="91171" w:author="Claude" w:date="2026-10-27T00:00:00Z"/>
+              </w:rPr>
+            </w:pPr>
+            <w:ins w:id="91172" w:author="Claude" w:date="2026-10-27T00:00:00Z">
+              <w:r>
+                <w:rPr>
+                  <w:b/>
+                  <w:bCs/>
+                  <w:sz w:val="16"/>
+                  <w:szCs w:val="16"/>
+                </w:rPr>
+                <w:t xml:space="preserve">Loudest</w:t>
+              </w:r>
+            </w:ins>
+          </w:p>
+        </w:tc>
+      </w:tr>
+      <w:tr>
+        <w:trPr>
+          <w:cantSplit/>
+          <w:ins w:id="91182" w:author="Claude" w:date="2026-10-27T00:00:00Z"/>
+        </w:trPr>
+        <w:tc>
+          <w:tcPr>
+            <w:tcW w:type="dxa" w:w="1440"/>
+            <w:tcBorders/>
+            <w:tcMar>
+              <w:left w:type="dxa" w:w="60"/>
+              <w:right w:type="dxa" w:w="60"/>
+            </w:tcMar>
+          </w:tcPr>
+          <w:p>
+            <w:pPr>
+              <w:jc w:val="left"/>
+              <w:rPr>
+                <w:ins w:id="91174" w:author="Claude" w:date="2026-10-27T00:00:00Z"/>
+              </w:rPr>
+            </w:pPr>
+            <w:ins w:id="91175" w:author="Claude" w:date="2026-10-27T00:00:00Z">
+              <w:r>
+                <w:rPr>
+                  <w:sz w:val="16"/>
+                  <w:szCs w:val="16"/>
+                </w:rPr>
+                <w:t xml:space="preserve">Live cluster</w:t>
+              </w:r>
+            </w:ins>
+          </w:p>
+        </w:tc>
+        <w:tc>
+          <w:tcPr>
+            <w:tcW w:type="dxa" w:w="1200"/>
+            <w:tcBorders/>
+            <w:tcMar>
+              <w:left w:type="dxa" w:w="60"/>
+              <w:right w:type="dxa" w:w="60"/>
+            </w:tcMar>
+          </w:tcPr>
+          <w:p>
+            <w:pPr>
+              <w:jc w:val="center"/>
+              <w:rPr>
+                <w:ins w:id="91176" w:author="Claude" w:date="2026-10-27T00:00:00Z"/>
+              </w:rPr>
+            </w:pPr>
+            <w:ins w:id="91177" w:author="Claude" w:date="2026-10-27T00:00:00Z">
+              <w:r>
+                <w:rPr>
+                  <w:sz w:val="16"/>
+                  <w:szCs w:val="16"/>
+                </w:rPr>
+                <w:t xml:space="preserve">0.900</w:t>
+              </w:r>
+            </w:ins>
+          </w:p>
+        </w:tc>
+        <w:tc>
+          <w:tcPr>
+            <w:tcW w:type="dxa" w:w="1200"/>
+            <w:tcBorders/>
+            <w:tcMar>
+              <w:left w:type="dxa" w:w="60"/>
+              <w:right w:type="dxa" w:w="60"/>
+            </w:tcMar>
+          </w:tcPr>
+          <w:p>
+            <w:pPr>
+              <w:jc w:val="center"/>
+              <w:rPr>
+                <w:ins w:id="91178" w:author="Claude" w:date="2026-10-27T00:00:00Z"/>
+              </w:rPr>
+            </w:pPr>
+            <w:ins w:id="91179" w:author="Claude" w:date="2026-10-27T00:00:00Z">
+              <w:r>
+                <w:rPr>
+                  <w:sz w:val="16"/>
+                  <w:szCs w:val="16"/>
+                </w:rPr>
+                <w:t xml:space="preserve">0.265</w:t>
+              </w:r>
+            </w:ins>
+          </w:p>
+        </w:tc>
+        <w:tc>
+          <w:tcPr>
+            <w:tcW w:type="dxa" w:w="1200"/>
+            <w:tcBorders/>
+            <w:tcMar>
+              <w:left w:type="dxa" w:w="60"/>
+              <w:right w:type="dxa" w:w="60"/>
+            </w:tcMar>
+          </w:tcPr>
+          <w:p>
+            <w:pPr>
+              <w:jc w:val="center"/>
+              <w:rPr>
+                <w:ins w:id="91180" w:author="Claude" w:date="2026-10-27T00:00:00Z"/>
+              </w:rPr>
+            </w:pPr>
+            <w:ins w:id="91181" w:author="Claude" w:date="2026-10-27T00:00:00Z">
+              <w:r>
+                <w:rPr>
+                  <w:sz w:val="16"/>
+                  <w:szCs w:val="16"/>
+                </w:rPr>
+                <w:t xml:space="preserve">0.870</w:t>
+              </w:r>
+            </w:ins>
+          </w:p>
+        </w:tc>
+      </w:tr>
+      <w:tr>
+        <w:trPr>
+          <w:cantSplit/>
+          <w:ins w:id="91191" w:author="Claude" w:date="2026-10-27T00:00:00Z"/>
+        </w:trPr>
+        <w:tc>
+          <w:tcPr>
+            <w:tcW w:type="dxa" w:w="1440"/>
+            <w:tcBorders/>
+            <w:tcMar>
+              <w:left w:type="dxa" w:w="60"/>
+              <w:right w:type="dxa" w:w="60"/>
+            </w:tcMar>
+          </w:tcPr>
+          <w:p>
+            <w:pPr>
+              <w:jc w:val="left"/>
+              <w:rPr>
+                <w:ins w:id="91183" w:author="Claude" w:date="2026-10-27T00:00:00Z"/>
+              </w:rPr>
+            </w:pPr>
+            <w:ins w:id="91184" w:author="Claude" w:date="2026-10-27T00:00:00Z">
+              <w:r>
+                <w:rPr>
+                  <w:sz w:val="16"/>
+                  <w:szCs w:val="16"/>
+                </w:rPr>
+                <w:t xml:space="preserve">Online Boutique</w:t>
+              </w:r>
+            </w:ins>
+          </w:p>
+        </w:tc>
+        <w:tc>
+          <w:tcPr>
+            <w:tcW w:type="dxa" w:w="1200"/>
+            <w:tcBorders/>
+            <w:tcMar>
+              <w:left w:type="dxa" w:w="60"/>
+              <w:right w:type="dxa" w:w="60"/>
+            </w:tcMar>
+          </w:tcPr>
+          <w:p>
+            <w:pPr>
+              <w:jc w:val="center"/>
+              <w:rPr>
+                <w:ins w:id="91185" w:author="Claude" w:date="2026-10-27T00:00:00Z"/>
+              </w:rPr>
+            </w:pPr>
+            <w:ins w:id="91186" w:author="Claude" w:date="2026-10-27T00:00:00Z">
+              <w:r>
+                <w:rPr>
+                  <w:sz w:val="16"/>
+                  <w:szCs w:val="16"/>
+                </w:rPr>
+                <w:t xml:space="preserve">0.845</w:t>
+              </w:r>
+            </w:ins>
+          </w:p>
+        </w:tc>
+        <w:tc>
+          <w:tcPr>
+            <w:tcW w:type="dxa" w:w="1200"/>
+            <w:tcBorders/>
+            <w:tcMar>
+              <w:left w:type="dxa" w:w="60"/>
+              <w:right w:type="dxa" w:w="60"/>
+            </w:tcMar>
+          </w:tcPr>
+          <w:p>
+            <w:pPr>
+              <w:jc w:val="center"/>
+              <w:rPr>
+                <w:ins w:id="91187" w:author="Claude" w:date="2026-10-27T00:00:00Z"/>
+              </w:rPr>
+            </w:pPr>
+            <w:ins w:id="91188" w:author="Claude" w:date="2026-10-27T00:00:00Z">
+              <w:r>
+                <w:rPr>
+                  <w:sz w:val="16"/>
+                  <w:szCs w:val="16"/>
+                </w:rPr>
+                <w:t xml:space="preserve">0.490</w:t>
+              </w:r>
+            </w:ins>
+          </w:p>
+        </w:tc>
+        <w:tc>
+          <w:tcPr>
+            <w:tcW w:type="dxa" w:w="1200"/>
+            <w:tcBorders/>
+            <w:tcMar>
+              <w:left w:type="dxa" w:w="60"/>
+              <w:right w:type="dxa" w:w="60"/>
+            </w:tcMar>
+          </w:tcPr>
+          <w:p>
+            <w:pPr>
+              <w:jc w:val="center"/>
+              <w:rPr>
+                <w:ins w:id="91189" w:author="Claude" w:date="2026-10-27T00:00:00Z"/>
+              </w:rPr>
+            </w:pPr>
+            <w:ins w:id="91190" w:author="Claude" w:date="2026-10-27T00:00:00Z">
+              <w:r>
+                <w:rPr>
+                  <w:sz w:val="16"/>
+                  <w:szCs w:val="16"/>
+                </w:rPr>
+                <w:t xml:space="preserve">0.608</w:t>
+              </w:r>
+            </w:ins>
+          </w:p>
+        </w:tc>
+      </w:tr>
+      <w:tr>
+        <w:trPr>
+          <w:cantSplit/>
+          <w:ins w:id="91200" w:author="Claude" w:date="2026-10-27T00:00:00Z"/>
+        </w:trPr>
+        <w:tc>
+          <w:tcPr>
+            <w:tcW w:type="dxa" w:w="1440"/>
+            <w:tcBorders>
+              <w:bottom w:val="single" w:color="000000" w:sz="4"/>
+            </w:tcBorders>
+            <w:tcMar>
+              <w:left w:type="dxa" w:w="60"/>
+              <w:right w:type="dxa" w:w="60"/>
+            </w:tcMar>
+          </w:tcPr>
+          <w:p>
+            <w:pPr>
+              <w:jc w:val="left"/>
+              <w:rPr>
+                <w:ins w:id="91192" w:author="Claude" w:date="2026-10-27T00:00:00Z"/>
+              </w:rPr>
+            </w:pPr>
+            <w:ins w:id="91193" w:author="Claude" w:date="2026-10-27T00:00:00Z">
+              <w:r>
+                <w:rPr>
+                  <w:sz w:val="16"/>
+                  <w:szCs w:val="16"/>
+                </w:rPr>
+                <w:t xml:space="preserve">Sock Shop</w:t>
+              </w:r>
+            </w:ins>
+          </w:p>
+        </w:tc>
+        <w:tc>
+          <w:tcPr>
+            <w:tcW w:type="dxa" w:w="1200"/>
+            <w:tcBorders>
+              <w:bottom w:val="single" w:color="000000" w:sz="4"/>
+            </w:tcBorders>
+            <w:tcMar>
+              <w:left w:type="dxa" w:w="60"/>
+              <w:right w:type="dxa" w:w="60"/>
+            </w:tcMar>
+          </w:tcPr>
+          <w:p>
+            <w:pPr>
+              <w:jc w:val="center"/>
+              <w:rPr>
+                <w:ins w:id="91194" w:author="Claude" w:date="2026-10-27T00:00:00Z"/>
+              </w:rPr>
+            </w:pPr>
+            <w:ins w:id="91195" w:author="Claude" w:date="2026-10-27T00:00:00Z">
+              <w:r>
+                <w:rPr>
+                  <w:sz w:val="16"/>
+                  <w:szCs w:val="16"/>
+                </w:rPr>
+                <w:t xml:space="preserve">0.894</w:t>
+              </w:r>
+            </w:ins>
+          </w:p>
+        </w:tc>
+        <w:tc>
+          <w:tcPr>
+            <w:tcW w:type="dxa" w:w="1200"/>
+            <w:tcBorders>
+              <w:bottom w:val="single" w:color="000000" w:sz="4"/>
+            </w:tcBorders>
+            <w:tcMar>
+              <w:left w:type="dxa" w:w="60"/>
+              <w:right w:type="dxa" w:w="60"/>
+            </w:tcMar>
+          </w:tcPr>
+          <w:p>
+            <w:pPr>
+              <w:jc w:val="center"/>
+              <w:rPr>
+                <w:ins w:id="91196" w:author="Claude" w:date="2026-10-27T00:00:00Z"/>
+              </w:rPr>
+            </w:pPr>
+            <w:ins w:id="91197" w:author="Claude" w:date="2026-10-27T00:00:00Z">
+              <w:r>
+                <w:rPr>
+                  <w:sz w:val="16"/>
+                  <w:szCs w:val="16"/>
+                </w:rPr>
+                <w:t xml:space="preserve">0.265</w:t>
+              </w:r>
+            </w:ins>
+          </w:p>
+        </w:tc>
+        <w:tc>
+          <w:tcPr>
+            <w:tcW w:type="dxa" w:w="1200"/>
+            <w:tcBorders>
+              <w:bottom w:val="single" w:color="000000" w:sz="4"/>
+            </w:tcBorders>
+            <w:tcMar>
+              <w:left w:type="dxa" w:w="60"/>
+              <w:right w:type="dxa" w:w="60"/>
+            </w:tcMar>
+          </w:tcPr>
+          <w:p>
+            <w:pPr>
+              <w:jc w:val="center"/>
+              <w:rPr>
+                <w:ins w:id="91198" w:author="Claude" w:date="2026-10-27T00:00:00Z"/>
+              </w:rPr>
+            </w:pPr>
+            <w:ins w:id="91199" w:author="Claude" w:date="2026-10-27T00:00:00Z">
+              <w:r>
+                <w:rPr>
+                  <w:sz w:val="16"/>
+                  <w:szCs w:val="16"/>
+                </w:rPr>
+                <w:t xml:space="preserve">0.747</w:t>
+              </w:r>
+            </w:ins>
+          </w:p>
+        </w:tc>
+      </w:tr>
+    </w:tbl>
+    <w:p>
+      <w:pPr>
+        <w:spacing w:after="0" w:line="240"/>
+        <w:ind w:firstLine="202"/>
+        <w:jc w:val="both"/>
+        <w:rPr>
+          <w:ins w:id="91201" w:author="Claude" w:date="2026-10-27T00:00:00Z"/>
+        </w:rPr>
+      </w:pPr>
+      <w:ins w:id="91202" w:author="Claude" w:date="2026-10-27T00:00:00Z">
+        <w:r>
+          <w:t xml:space="preserve">The simulator taught topology-first reasoning, and on real faults the culprit is usually the service that moved most. Trained on RCAEval alone, the ranker names the root first in 0.895 of the live-cluster incidents it never saw. Synthetic data is at most an augmentation here, not a substitute. Zero-shot on raw RCAEval series, the simulator-trained ranker scores 0.490 on Online Boutique and 0.265 on Sock Shop.</w:t>
+        </w:r>
+      </w:ins>
+    </w:p>
+    <w:p>
+      <w:pPr>
+        <w:keepNext/>
+        <w:spacing w:after="40" w:before="80"/>
+        <w:rPr>
+          <w:ins w:id="91203" w:author="Claude" w:date="2026-10-27T00:00:00Z"/>
+        </w:rPr>
+      </w:pPr>
+      <w:ins w:id="91204" w:author="Claude" w:date="2026-10-27T00:00:00Z">
+        <w:r>
+          <w:rPr>
+            <w:i/>
+            <w:iCs/>
+          </w:rPr>
+          <w:t xml:space="preserve">I. RQ7: Detection, Verification and Language</w:t>
+        </w:r>
+      </w:ins>
+    </w:p>
+    <w:p>
+      <w:pPr>
+        <w:spacing w:after="0" w:line="240"/>
+        <w:ind w:firstLine="202"/>
+        <w:jc w:val="both"/>
+        <w:rPr>
+          <w:ins w:id="91205" w:author="Claude" w:date="2026-10-27T00:00:00Z"/>
+        </w:rPr>
+      </w:pPr>
+      <w:ins w:id="91206" w:author="Claude" w:date="2026-10-27T00:00:00Z">
+        <w:r>
+          <w:t xml:space="preserve">How a model is tested decides its headline. On CIC-IDS2017 the intrusion detector scores F1 0.997 on a random split and 0.453 when the test days hold only attack families it never saw. Its operating point mattered more than its architecture: with the threshold set for a 1% false-alarm rate on validation flows, unseen-day F1 rises to 0.604 and recall from 0.294 to 0.448. On log sessions, Kalaratri reaches F1 0.966 on HDFS but 0.355 on BGL, where failures are rarer: one log dataset alone flatters the task.</w:t>
+        </w:r>
+      </w:ins>
+    </w:p>
+    <w:p>
+      <w:pPr>
+        <w:spacing w:after="0" w:line="240"/>
+        <w:ind w:firstLine="202"/>
+        <w:jc w:val="both"/>
+        <w:rPr>
+          <w:ins w:id="91207" w:author="Claude" w:date="2026-10-27T00:00:00Z"/>
+        </w:rPr>
+      </w:pPr>
+      <w:ins w:id="91208" w:author="Claude" w:date="2026-10-27T00:00:00Z">
+        <w:r>
+          <w:t xml:space="preserve">Kushmanda, a 17M-parameter language model trained from scratch, answers from retrieved passages well (ROUGE-L 0.938 on required actions) and declines on 0.543 of questions no passage answers, but copies an exact technique identifier on only 0.528 of lookups. Constrained decoding makes every output valid and raises that to 0.604. In the system, identifiers come from retrieval and the model writes around them.</w:t>
+        </w:r>
+      </w:ins>
+    </w:p>
+    <w:p>
+      <w:pPr>
+        <w:keepNext/>
+        <w:spacing w:after="40" w:before="80"/>
+        <w:rPr>
+          <w:ins w:id="91209" w:author="Claude" w:date="2026-10-27T00:00:00Z"/>
+        </w:rPr>
+      </w:pPr>
+      <w:ins w:id="91210" w:author="Claude" w:date="2026-10-27T00:00:00Z">
+        <w:r>
+          <w:rPr>
+            <w:i/>
+            <w:iCs/>
+          </w:rPr>
+          <w:t xml:space="preserve">J. Serving What Was Evaluated</w:t>
+        </w:r>
+      </w:ins>
+    </w:p>
+    <w:p>
+      <w:pPr>
+        <w:spacing w:after="0" w:line="240"/>
+        <w:ind w:firstLine="202"/>
+        <w:jc w:val="both"/>
+        <w:rPr>
+          <w:ins w:id="91211" w:author="Claude" w:date="2026-10-27T00:00:00Z"/>
+        </w:rPr>
+      </w:pPr>
+      <w:ins w:id="91212" w:author="Claude" w:date="2026-10-27T00:00:00Z">
+        <w:r>
+          <w:t xml:space="preserve">A model is evidence only if the deployed model is the evaluated one. The five gradient-boosted models are exported as JSON and scored in plain Python in the API, with a test that the scores equal LightGBM's, missing values included; the embedding models are served from int8 weights checked to rank as the trained ones did. The live examples a visitor can run are held out from training. Serving also exposed a failure the held-out score did not: asked in a user's words how to defend against ransomware encrypting file shares, the mitigation model recommended one wrong defence, while the retrieval model read the question correctly as Data Encrypted for Impact (T1486). The deployed system now chains them, so every recommendation traces to a cited technique.</w:t>
+        </w:r>
+      </w:ins>
     </w:p>
     <w:p>
       <w:pPr>
@@ -11533,7 +14138,7 @@
         <w:rPr>
           <w:smallCaps/>
         </w:rPr>
-        <w:t xml:space="preserve">XVI. Limitations and Threats to Validity</w:t>
+        <w:t xml:space="preserve">XV. Discussion</w:t>
       </w:r>
     </w:p>
     <w:p>
@@ -11543,14 +14148,7 @@
         <w:jc w:val="both"/>
       </w:pPr>
       <w:r>
-        <w:rPr>
-          <w:b/>
-          <w:bCs/>
-        </w:rPr>
-        <w:t xml:space="preserve">The benchmark is self authored.</w:t>
-      </w:r>
-      <w:r>
-        <w:t xml:space="preserve"> One person wrote the scenarios, the answer key and the system being scored. Writing scenarios before the resolving logic, including negative and adversarial cases, and reporting failures first all help, but none of them remove the problem. Independent scenario authors are the only real fix.</w:t>
+        <w:t xml:space="preserve">Taken together, the four results support one claim and leave another open. The supported claim is about containment. On the cluster, the policy layer executed no wrong action (RQ1). Across the whole corpus it never let a forbidden action run alone (RQ2). An attacker in full control of the model could not cause a single execution or approval through the agent (RQ3). And real models under injection did not get anything past it either (RQ4). The open claim is about competence. Nothing here shows that the system diagnoses incidents well or resolves them quickly, and RQ1 and RQ2 both show it handing too much to people.</w:t>
       </w:r>
     </w:p>
     <w:p>
@@ -11560,14 +14158,7 @@
         <w:jc w:val="both"/>
       </w:pPr>
       <w:r>
-        <w:rPr>
-          <w:b/>
-          <w:bCs/>
-        </w:rPr>
-        <w:t xml:space="preserve">Diagnosis quality is not measured, and cannot be without the cluster.</w:t>
-      </w:r>
-      <w:r>
-        <w:t xml:space="preserve"> Every PIB scenario file names its own fault in its title and fault description, so a model shown the file would be paraphrasing an answer it was handed. The only legitimate input is the telemetry an injected fault produces, which exists only while the reference stack runs. The smaller replay scenarios do carry telemetry, but in four of the eight the metric names nearly spell out the root cause, two have no root cause because they are negative cases, and two have answer keys that are not diagnoses, so none can be scored. Root cause accuracy, detection precision and recall, and mean time to recovery remain defined but unreported.</w:t>
+        <w:t xml:space="preserve">Those two failure modes are not equally bad. A system that hands too much to people is annoying. A system that confidently executes the wrong action in production is dangerous. The runbook in RQ1 got more than half its executed actions wrong. The architecture got none wrong, and its over escalation has a clear, adjustable source: production adds 15 points, most incidents touch more than one entity, and an autonomous threshold of 30 is strict once those penalties apply. The isolate host denial in RQ4 shows the cost concretely. The thresholds and weights are parameters, and the benchmark is the intended tool for tuning them. What the architecture guarantees is that tuning can only move the line between autonomous and human; it cannot let the model move it.</w:t>
       </w:r>
     </w:p>
     <w:p>
@@ -11577,14 +14168,7 @@
         <w:jc w:val="both"/>
       </w:pPr>
       <w:r>
-        <w:rPr>
-          <w:b/>
-          <w:bCs/>
-        </w:rPr>
-        <w:t xml:space="preserve">Coverage and records.</w:t>
-      </w:r>
-      <w:r>
-        <w:t xml:space="preserve"> RQ1 covers 31 of 104 scenarios, and the subset is weighted toward cases whose right answer is to do nothing. The other 73 are excluded by name with a reason: eleven need a simulated adversary, eight a load generator, five would destroy real data, and most of the rest name recovery conditions the stateless stack cannot report. The records behind Table VII are not in the public repository. RQ2 covers all 104, but only at the policy level.</w:t>
+        <w:t xml:space="preserve">On novelty: none of the individual mechanisms is new. Policy gates, runbooks, safety shields [38] and retrieval with citations [27] all exist. The contribution is the combination, made checkable. In particular, RQ3 gives a bound that does not depend on any model's behaviour, which is the property recent work on structural injection defences argues for [32], [33]. Pashupatastra shows that bound holding in a deployed incident response system, with the attack surface enumerated rather than sampled. A broader lesson is that most of the safety properties are boring code: exact string matching, a frozen list of identifiers, a verdict with an expiry time, a learning function with one path. Each can be read and tested by someone who does not trust the model, which is the position an operator should be in.</w:t>
       </w:r>
     </w:p>
     <w:p>
@@ -11592,16 +14176,27 @@
         <w:spacing w:after="0" w:line="240"/>
         <w:ind w:firstLine="202"/>
         <w:jc w:val="both"/>
-      </w:pPr>
-      <w:r>
-        <w:rPr>
-          <w:b/>
-          <w:bCs/>
-        </w:rPr>
-        <w:t xml:space="preserve">Two of four arms produced no data.</w:t>
-      </w:r>
-      <w:r>
-        <w:t xml:space="preserve"> The human arm needs operators and the naive model arm needs the cluster. Both refuse to run rather than approximate.</w:t>
+        <w:rPr>
+          <w:ins w:id="91213" w:author="Claude" w:date="2026-10-27T00:00:00Z"/>
+        </w:rPr>
+      </w:pPr>
+      <w:ins w:id="91214" w:author="Claude" w:date="2026-10-27T00:00:00Z">
+        <w:r>
+          <w:t xml:space="preserve">The project's own models add a second, measured claim. On a benchmark it did not write, a small ranker trained on real incidents outperforms two general language models given identical evidence (RQ5), and a simulator, however carefully built, was no substitute for real data (RQ6). The models that did not earn a decision on their own are reported with the same prominence and remain advisory.</w:t>
+        </w:r>
+      </w:ins>
+    </w:p>
+    <w:p>
+      <w:pPr>
+        <w:keepNext/>
+        <w:spacing w:after="80" w:before="160"/>
+        <w:jc w:val="center"/>
+      </w:pPr>
+      <w:r>
+        <w:rPr>
+          <w:smallCaps/>
+        </w:rPr>
+        <w:t xml:space="preserve">XVI. Limitations and Threats to Validity</w:t>
       </w:r>
     </w:p>
     <w:p>
@@ -11615,10 +14210,10 @@
           <w:b/>
           <w:bCs/>
         </w:rPr>
-        <w:t xml:space="preserve">The models are small and the attacks are fixed.</w:t>
-      </w:r>
-      <w:r>
-        <w:t xml:space="preserve"> RQ4 used three local models of 7 to 8 billion parameters. The deployment's primary model and the production target are different, and larger models may follow injected instructions more readily, because they follow instructions better in general. The eight payloads were written in advance and do not adapt. An adaptive attacker of the kind AgentDojo models [31] has not been tested, although RQ3 bounds what any such attacker could achieve through the chat route.</w:t>
+        <w:t xml:space="preserve">The benchmark is self authored.</w:t>
+      </w:r>
+      <w:r>
+        <w:t xml:space="preserve"> One person wrote the scenarios, the answer key and the system being scored. Writing scenarios before the resolving logic, including negative and adversarial cases, and reporting failures first all help, but none of them remove the problem. Independent scenario authors are the only real fix.</w:t>
       </w:r>
     </w:p>
     <w:p>
@@ -11632,10 +14227,10 @@
           <w:b/>
           <w:bCs/>
         </w:rPr>
-        <w:t xml:space="preserve">No outside users.</w:t>
-      </w:r>
-      <w:r>
-        <w:t xml:space="preserve"> No security practitioner has used the system or reviewed its verdicts. Whether the verdict explanations actually help an operator decide, and whether the approval rate leads to fatigue, are questions only a user study can answer.</w:t>
+        <w:t xml:space="preserve">Diagnosis quality is not measured, and cannot be without the cluster.</w:t>
+      </w:r>
+      <w:r>
+        <w:t xml:space="preserve"> Every PIB scenario file names its own fault in its title and fault description, so a model shown the file would be paraphrasing an answer it was handed. The only legitimate input is the telemetry an injected fault produces, which exists only while the reference stack runs. The smaller replay scenarios do carry telemetry, but in four of the eight the metric names nearly spell out the root cause, two have no root cause because they are negative cases, and two have answer keys that are not diagnoses, so none can be scored. Root cause accuracy, detection precision and recall, and mean time to recovery remain defined but unreported.</w:t>
       </w:r>
     </w:p>
     <w:p>
@@ -11649,11 +14244,94 @@
           <w:b/>
           <w:bCs/>
         </w:rPr>
+        <w:t xml:space="preserve">Coverage and records.</w:t>
+      </w:r>
+      <w:r>
+        <w:t xml:space="preserve"> RQ1 covers 31 of 104 scenarios, and the subset is weighted toward cases whose right answer is to do nothing. The other 73 are excluded by name with a reason: eleven need a simulated adversary, eight a load generator, five would destroy real data, and most of the rest name recovery conditions the stateless stack cannot report. The records behind Table VII are not in the public repository. RQ2 covers all 104, but only at the policy level.</w:t>
+      </w:r>
+    </w:p>
+    <w:p>
+      <w:pPr>
+        <w:spacing w:after="0" w:line="240"/>
+        <w:ind w:firstLine="202"/>
+        <w:jc w:val="both"/>
+      </w:pPr>
+      <w:r>
+        <w:rPr>
+          <w:b/>
+          <w:bCs/>
+        </w:rPr>
+        <w:t xml:space="preserve">Two of four arms produced no data.</w:t>
+      </w:r>
+      <w:r>
+        <w:t xml:space="preserve"> The human arm needs operators and the naive model arm needs the cluster. Both refuse to run rather than approximate.</w:t>
+      </w:r>
+    </w:p>
+    <w:p>
+      <w:pPr>
+        <w:spacing w:after="0" w:line="240"/>
+        <w:ind w:firstLine="202"/>
+        <w:jc w:val="both"/>
+      </w:pPr>
+      <w:r>
+        <w:rPr>
+          <w:b/>
+          <w:bCs/>
+        </w:rPr>
+        <w:t xml:space="preserve">The models are small and the attacks are fixed.</w:t>
+      </w:r>
+      <w:r>
+        <w:t xml:space="preserve"> RQ4 used three local models of 7 to 8 billion parameters. The deployment's primary model and the production target are different, and larger models may follow injected instructions more readily, because they follow instructions better in general. The eight payloads were written in advance and do not adapt. An adaptive attacker of the kind AgentDojo models [31] has not been tested, although RQ3 bounds what any such attacker could achieve through the chat route.</w:t>
+      </w:r>
+    </w:p>
+    <w:p>
+      <w:pPr>
+        <w:spacing w:after="0" w:line="240"/>
+        <w:ind w:firstLine="202"/>
+        <w:jc w:val="both"/>
+      </w:pPr>
+      <w:r>
+        <w:rPr>
+          <w:b/>
+          <w:bCs/>
+        </w:rPr>
+        <w:t xml:space="preserve">No outside users.</w:t>
+      </w:r>
+      <w:r>
+        <w:t xml:space="preserve"> No security practitioner has used the system or reviewed its verdicts. Whether the verdict explanations actually help an operator decide, and whether the approval rate leads to fatigue, are questions only a user study can answer.</w:t>
+      </w:r>
+    </w:p>
+    <w:p>
+      <w:pPr>
+        <w:spacing w:after="0" w:line="240"/>
+        <w:ind w:firstLine="202"/>
+        <w:jc w:val="both"/>
+      </w:pPr>
+      <w:r>
+        <w:rPr>
+          <w:b/>
+          <w:bCs/>
+        </w:rPr>
         <w:t xml:space="preserve">Narrow environment and scripted demonstrations.</w:t>
       </w:r>
       <w:r>
         <w:t xml:space="preserve"> The evaluation covers one reference architecture. The public incidents are scripted and their confidences are chosen, not measured. The security topology in the public deployment records no dependency edges, so blast radius there has nothing to traverse.</w:t>
       </w:r>
+    </w:p>
+    <w:p>
+      <w:pPr>
+        <w:spacing w:after="0" w:line="240"/>
+        <w:ind w:firstLine="202"/>
+        <w:jc w:val="both"/>
+        <w:rPr>
+          <w:ins w:id="91215" w:author="Claude" w:date="2026-10-27T00:00:00Z"/>
+        </w:rPr>
+      </w:pPr>
+      <w:ins w:id="91216" w:author="Claude" w:date="2026-10-27T00:00:00Z">
+        <w:r>
+          <w:t xml:space="preserve">The models carry their own threats. A plain TF-IDF and logistic regression baseline, added after the public notebooks found it, scores R@1 0.646 against Brahmacharini's 0.614; a neural model is worth serving only where it beats the strongest simple baseline. Bigger was not better: a 20M-parameter transformer encoder trained from scratch on the same split reached R@1 0.391, against 0.614 for the bag-of-words encoder that is served. Gradient-boosted results move by a few hundredths between CI machines, so they are reported with seed spreads where it matters. The live cluster's steady load leaves near-flat baselines, and its 200 incidents were built by the same project; RCAEval is the independent check.</w:t>
+        </w:r>
+      </w:ins>
     </w:p>
     <w:p>
       <w:pPr>
@@ -11713,6 +14391,21 @@
     </w:p>
     <w:p>
       <w:pPr>
+        <w:spacing w:after="0" w:line="240"/>
+        <w:ind w:firstLine="202"/>
+        <w:jc w:val="both"/>
+        <w:rPr>
+          <w:ins w:id="91217" w:author="Claude" w:date="2026-10-27T00:00:00Z"/>
+        </w:rPr>
+      </w:pPr>
+      <w:ins w:id="91218" w:author="Claude" w:date="2026-10-27T00:00:00Z">
+        <w:r>
+          <w:t xml:space="preserve">Part of that work is now done. Root-cause accuracy has been measured on an external benchmark against real language models (RQ5), and sim-to-real on three systems (RQ6). What remains is the 20 labelled PIB incidents with answer keys written before any run, the head-to-head on them at N ≥ 3, and the escalation analysis they make possible.</w:t>
+        </w:r>
+      </w:ins>
+    </w:p>
+    <w:p>
+      <w:pPr>
         <w:keepNext/>
         <w:spacing w:after="80" w:before="160"/>
         <w:jc w:val="center"/>
@@ -11733,6 +14426,21 @@
       <w:r>
         <w:t xml:space="preserve">The source code, the PIB scenarios and the benchmark harness are available in the project repository [46]. The scripts and raw JSON records for RQ2 to RQ4, together with the analysis script that recomputes Tables VIII to X, are in the repository's docs/research/experiments folder. The records behind Table VII are not yet published. The public console, including the audit ledger, is available online [7].</w:t>
       </w:r>
+    </w:p>
+    <w:p>
+      <w:pPr>
+        <w:spacing w:after="0" w:line="240"/>
+        <w:ind w:firstLine="202"/>
+        <w:jc w:val="both"/>
+        <w:rPr>
+          <w:ins w:id="91219" w:author="Claude" w:date="2026-10-27T00:00:00Z"/>
+        </w:rPr>
+      </w:pPr>
+      <w:ins w:id="91220" w:author="Claude" w:date="2026-10-27T00:00:00Z">
+        <w:r>
+          <w:t xml:space="preserve">The nine models, their datasets and a reproducing notebook for each are published on Kaggle under the owner preetraval4518071604; models trained on research-use-only data are released for research use only.</w:t>
+        </w:r>
+      </w:ins>
     </w:p>
     <w:p>
       <w:pPr>

</xml_diff>

<commit_message>
docs(paper): IEEE paper names all nine models, adds the models-in-the-loop figure and the RQ5 chart (tracked changes)
Fig. 2 (new) shows where each model works; the author's Fig. 2 becomes Fig. 3 as a tracked change.
Skandamata's TF-IDF baseline (0.827 vs 0.792) recorded in its card, PAPER 7.2 and the IEEE limitations.

Co-Authored-By: Claude Opus 5.5 <noreply@anthropic.com>
</commit_message>
<xml_diff>
--- a/docs/research/Pashupatastra IEEE Paper.docx
+++ b/docs/research/Pashupatastra IEEE Paper.docx
@@ -86,7 +86,7 @@
         </w:rPr>
         <w:t xml:space="preserve">Language models can now read a security incident and suggest a fix in seconds. That is useful, and it is also the problem, because a confident wrong fix runs just as smoothly as a right one. This paper presents Pashupatastra, an implemented and publicly deployed system that carries security and infrastructure incidents through observation, correlation, diagnosis, authorization, execution and verification, and that keeps the language model out of the authorization step entirely. Its investigation agent, Sati, may only propose actions from a closed registry and may only cite records the system actually retrieved; citations are checked by exact match, and an answer with no valid citation is withheld. A deterministic policy engine prices each proposed action from a declared base risk plus context penalties that can only raise it, maps the price to one of four autonomy tiers, and issues a short lived verdict without which nothing executes. Every action declares its rollback and expected post state, and verification checks that state across a window of samples. I also introduce PIB, a 104 scenario benchmark that includes cases where the correct response is to do nothing or to hand off, and report four evaluations. On the 31 scenarios that run on the reference cluster, the architecture executed no incorrect action, where a threshold runbook got 6 of its 11 wrong, but it escalated every remediation case. Across all 104 scenarios, no forbidden action was scored autonomous in any of three contexts. In 147 turns where an attacker wrote every byte of the model output, nothing executed and every fabricated citation was caught. Against three local open weight models under indirect prompt injection, 216 attack turns produced no harmful proposal and no execution, though the payloads also failed against the models themselves. The results support a claim about containment, not about competence: diagnosis accuracy remains unmeasured, and the paper says why.</w:t>
       </w:r>
-      <w:ins w:id="91221" w:author="Claude" w:date="2026-10-27T00:00:00Z">
+      <w:ins w:id="91255" w:author="Claude" w:date="2026-10-27T00:00:00Z">
         <w:r>
           <w:t xml:space="preserve"> The nine models Sati runs on are trained in the project itself. On a pre-declared sample of an external root-cause benchmark, the project's ranker names the root first in 0.940 of cases, against 0.550 and 0.510 for two general language models given the same evidence.</w:t>
         </w:r>
@@ -304,10 +304,10 @@
         <w:ind w:firstLine="202"/>
         <w:jc w:val="both"/>
         <w:rPr>
-          <w:ins w:id="91000" w:author="Claude" w:date="2026-10-27T00:00:00Z"/>
-        </w:rPr>
-      </w:pPr>
-      <w:ins w:id="91001" w:author="Claude" w:date="2026-10-27T00:00:00Z">
+          <w:ins w:id="91004" w:author="Claude" w:date="2026-10-27T00:00:00Z"/>
+        </w:rPr>
+      </w:pPr>
+      <w:ins w:id="91005" w:author="Claude" w:date="2026-10-27T00:00:00Z">
         <w:r>
           <w:t xml:space="preserve">7) Nine models trained in this repository on public data, one for each stage of the loop, each evaluated with the split that keeps its test honest (by group, source, system, day or time) and against the strongest simple baseline, and served from the same exported weights that were evaluated.</w:t>
         </w:r>
@@ -3852,10 +3852,10 @@
         <w:keepNext/>
         <w:spacing w:after="40" w:before="80"/>
         <w:rPr>
-          <w:ins w:id="91002" w:author="Claude" w:date="2026-10-27T00:00:00Z"/>
-        </w:rPr>
-      </w:pPr>
-      <w:ins w:id="91003" w:author="Claude" w:date="2026-10-27T00:00:00Z">
+          <w:ins w:id="91006" w:author="Claude" w:date="2026-10-27T00:00:00Z"/>
+        </w:rPr>
+      </w:pPr>
+      <w:ins w:id="91007" w:author="Claude" w:date="2026-10-27T00:00:00Z">
         <w:r>
           <w:rPr>
             <w:i/>
@@ -3871,10 +3871,10 @@
         <w:ind w:firstLine="202"/>
         <w:jc w:val="both"/>
         <w:rPr>
-          <w:ins w:id="91004" w:author="Claude" w:date="2026-10-27T00:00:00Z"/>
-        </w:rPr>
-      </w:pPr>
-      <w:ins w:id="91005" w:author="Claude" w:date="2026-10-27T00:00:00Z">
+          <w:ins w:id="91008" w:author="Claude" w:date="2026-10-27T00:00:00Z"/>
+        </w:rPr>
+      </w:pPr>
+      <w:ins w:id="91009" w:author="Claude" w:date="2026-10-27T00:00:00Z">
         <w:r>
           <w:t xml:space="preserve">Since this paper's first draft the agent no longer depends on general language models for its judgements. Nine models are trained in the project's repository on public data, one for each part of the loop, named for the nine forms of Navadurga. Each is evaluated with a split chosen so the test measures something unseen: a held-out machine group, attacker, system, day or time, never a random split where that would leak. Each is compared with the strongest simple baseline found, and the results that went against the project are reported beside the rest (Table XI).</w:t>
         </w:r>
@@ -3882,14 +3882,234 @@
     </w:p>
     <w:p>
       <w:pPr>
+        <w:spacing w:after="0" w:line="240"/>
+        <w:ind w:firstLine="202"/>
+        <w:jc w:val="both"/>
+        <w:rPr>
+          <w:ins w:id="91010" w:author="Claude" w:date="2026-10-27T00:00:00Z"/>
+        </w:rPr>
+      </w:pPr>
+      <w:ins w:id="91011" w:author="Claude" w:date="2026-10-27T00:00:00Z">
+        <w:r>
+          <w:t xml:space="preserve">Fig. 2 shows where each model works in the loop, each named by its job first.</w:t>
+        </w:r>
+      </w:ins>
+    </w:p>
+    <w:p>
+      <w:pPr>
+        <w:keepNext/>
+        <w:spacing w:after="60" w:before="120"/>
+        <w:jc w:val="center"/>
+        <w:rPr>
+          <w:ins w:id="91012" w:author="Claude" w:date="2026-10-27T00:00:00Z"/>
+        </w:rPr>
+      </w:pPr>
+      <w:ins w:id="91013" w:author="Claude" w:date="2026-10-27T00:00:00Z">
+        <w:r>
+          <w:drawing>
+            <wp:inline distT="0" distB="0" distL="0" distR="0">
+              <wp:extent cx="3048000" cy="3483429"/>
+              <wp:effectExtent t="0" r="0" b="0" l="0"/>
+              <wp:docPr id="9101" name="Figure 2" descr="Where the nine models work in the incident loop. Each box on the right is one model, its job first and its name below. Dharma, the policy gate, is shaded and has no model: whatever the models conclude, an action still needs Dharma's verdict." title="Figure 2"/>
+              <wp:cNvGraphicFramePr>
+                <a:graphicFrameLocks xmlns:a="http://schemas.openxmlformats.org/drawingml/2006/main" noChangeAspect="1"/>
+              </wp:cNvGraphicFramePr>
+              <a:graphic xmlns:a="http://schemas.openxmlformats.org/drawingml/2006/main">
+                <a:graphicData uri="http://schemas.openxmlformats.org/drawingml/2006/picture">
+                  <pic:pic xmlns:pic="http://schemas.openxmlformats.org/drawingml/2006/picture">
+                    <pic:nvPicPr>
+                      <pic:cNvPr id="0" name="nine-models.png" descr=""/>
+                      <pic:cNvPicPr>
+                        <a:picLocks noChangeAspect="1" noChangeArrowheads="1"/>
+                      </pic:cNvPicPr>
+                    </pic:nvPicPr>
+                    <pic:blipFill>
+                      <a:blip r:embed="rIdClaude1" cstate="none"/>
+                      <a:srcRect/>
+                      <a:stretch>
+                        <a:fillRect/>
+                      </a:stretch>
+                    </pic:blipFill>
+                    <pic:spPr bwMode="auto">
+                      <a:xfrm>
+                        <a:off x="0" y="0"/>
+                        <a:ext cx="3048000" cy="3483429"/>
+                      </a:xfrm>
+                      <a:prstGeom prst="rect">
+                        <a:avLst/>
+                      </a:prstGeom>
+                    </pic:spPr>
+                  </pic:pic>
+                </a:graphicData>
+              </a:graphic>
+            </wp:inline>
+          </w:drawing>
+        </w:r>
+      </w:ins>
+    </w:p>
+    <w:p>
+      <w:pPr>
+        <w:spacing w:after="140"/>
+        <w:jc w:val="both"/>
+        <w:rPr>
+          <w:ins w:id="91014" w:author="Claude" w:date="2026-10-27T00:00:00Z"/>
+        </w:rPr>
+      </w:pPr>
+      <w:ins w:id="91015" w:author="Claude" w:date="2026-10-27T00:00:00Z">
+        <w:r>
+          <w:rPr>
+            <w:sz w:val="16"/>
+            <w:szCs w:val="16"/>
+          </w:rPr>
+          <w:t xml:space="preserve">Fig. 2. Where the nine models work in the incident loop. Each box on the right is one model, its job first and its name below. Dharma, the policy gate, is shaded and has no model: whatever the models conclude, an action still needs Dharma's verdict.</w:t>
+        </w:r>
+      </w:ins>
+    </w:p>
+    <w:p>
+      <w:pPr>
+        <w:spacing w:after="0" w:line="240"/>
+        <w:ind w:firstLine="202"/>
+        <w:jc w:val="both"/>
+        <w:rPr>
+          <w:ins w:id="91016" w:author="Claude" w:date="2026-10-27T00:00:00Z"/>
+        </w:rPr>
+      </w:pPr>
+      <w:ins w:id="91017" w:author="Claude" w:date="2026-10-27T00:00:00Z">
+        <w:r>
+          <w:t xml:space="preserve">Server metric anomalies (Shailaputri) scores each minute of a server's metrics. It is trained on SMD machine groups and tested on a group it never saw, and separately on NAB.</w:t>
+        </w:r>
+      </w:ins>
+    </w:p>
+    <w:p>
+      <w:pPr>
+        <w:spacing w:after="0" w:line="240"/>
+        <w:ind w:firstLine="202"/>
+        <w:jc w:val="both"/>
+        <w:rPr>
+          <w:ins w:id="91018" w:author="Claude" w:date="2026-10-27T00:00:00Z"/>
+        </w:rPr>
+      </w:pPr>
+      <w:ins w:id="91019" w:author="Claude" w:date="2026-10-27T00:00:00Z">
+        <w:r>
+          <w:t xml:space="preserve">Log session anomalies (Kalaratri) flags failing sessions from counts of their log templates, trained on the earlier part of HDFS and of BGL and tested on the later part.</w:t>
+        </w:r>
+      </w:ins>
+    </w:p>
+    <w:p>
+      <w:pPr>
+        <w:spacing w:after="0" w:line="240"/>
+        <w:ind w:firstLine="202"/>
+        <w:jc w:val="both"/>
+        <w:rPr>
+          <w:ins w:id="91020" w:author="Claude" w:date="2026-10-27T00:00:00Z"/>
+        </w:rPr>
+      </w:pPr>
+      <w:ins w:id="91021" w:author="Claude" w:date="2026-10-27T00:00:00Z">
+        <w:r>
+          <w:t xml:space="preserve">Network intrusion (Chandraghanta) flags attack flows. On CIC-IDS2017 it trains on Monday to Wednesday and is tested on Thursday and Friday, whose attack families it has not seen.</w:t>
+        </w:r>
+      </w:ins>
+    </w:p>
+    <w:p>
+      <w:pPr>
+        <w:spacing w:after="0" w:line="240"/>
+        <w:ind w:firstLine="202"/>
+        <w:jc w:val="both"/>
+        <w:rPr>
+          <w:ins w:id="91022" w:author="Claude" w:date="2026-10-27T00:00:00Z"/>
+        </w:rPr>
+      </w:pPr>
+      <w:ins w:id="91023" w:author="Claude" w:date="2026-10-27T00:00:00Z">
+        <w:r>
+          <w:t xml:space="preserve">Fusion (Siddhidatri) combines three detectors' scores into one alarm, on the same held-out servers.</w:t>
+        </w:r>
+      </w:ins>
+    </w:p>
+    <w:p>
+      <w:pPr>
+        <w:spacing w:after="0" w:line="240"/>
+        <w:ind w:firstLine="202"/>
+        <w:jc w:val="both"/>
+        <w:rPr>
+          <w:ins w:id="91024" w:author="Claude" w:date="2026-10-27T00:00:00Z"/>
+        </w:rPr>
+      </w:pPr>
+      <w:ins w:id="91025" w:author="Claude" w:date="2026-10-27T00:00:00Z">
+        <w:r>
+          <w:t xml:space="preserve">Root-cause service (Katyayani) ranks an incident's services by how likely each is the root, trained on RCAEval fault injections with whole systems held out.</w:t>
+        </w:r>
+      </w:ins>
+    </w:p>
+    <w:p>
+      <w:pPr>
+        <w:spacing w:after="0" w:line="240"/>
+        <w:ind w:firstLine="202"/>
+        <w:jc w:val="both"/>
+        <w:rPr>
+          <w:ins w:id="91026" w:author="Claude" w:date="2026-10-27T00:00:00Z"/>
+        </w:rPr>
+      </w:pPr>
+      <w:ins w:id="91027" w:author="Claude" w:date="2026-10-27T00:00:00Z">
+        <w:r>
+          <w:t xml:space="preserve">Behaviour to technique (Brahmacharini) maps an observed behaviour to its ATT&amp;CK technique and retrieves the passages that ground Sati's answers. Its test procedures describe groups and tools unseen in training.</w:t>
+        </w:r>
+      </w:ins>
+    </w:p>
+    <w:p>
+      <w:pPr>
+        <w:spacing w:after="0" w:line="240"/>
+        <w:ind w:firstLine="202"/>
+        <w:jc w:val="both"/>
+        <w:rPr>
+          <w:ins w:id="91028" w:author="Claude" w:date="2026-10-27T00:00:00Z"/>
+        </w:rPr>
+      </w:pPr>
+      <w:ins w:id="91029" w:author="Claude" w:date="2026-10-27T00:00:00Z">
+        <w:r>
+          <w:t xml:space="preserve">Answer from passages (Kushmanda) is a 17M-parameter language model trained from scratch. It writes an answer from retrieved passages and declines when none answers.</w:t>
+        </w:r>
+      </w:ins>
+    </w:p>
+    <w:p>
+      <w:pPr>
+        <w:spacing w:after="0" w:line="240"/>
+        <w:ind w:firstLine="202"/>
+        <w:jc w:val="both"/>
+        <w:rPr>
+          <w:ins w:id="91030" w:author="Claude" w:date="2026-10-27T00:00:00Z"/>
+        </w:rPr>
+      </w:pPr>
+      <w:ins w:id="91031" w:author="Claude" w:date="2026-10-27T00:00:00Z">
+        <w:r>
+          <w:t xml:space="preserve">Mitigations (Skandamata) ranks ATT&amp;CK's 44 mitigations for an observed behaviour, with the same split by source.</w:t>
+        </w:r>
+      </w:ins>
+    </w:p>
+    <w:p>
+      <w:pPr>
+        <w:spacing w:after="0" w:line="240"/>
+        <w:ind w:firstLine="202"/>
+        <w:jc w:val="both"/>
+        <w:rPr>
+          <w:ins w:id="91032" w:author="Claude" w:date="2026-10-27T00:00:00Z"/>
+        </w:rPr>
+      </w:pPr>
+      <w:ins w:id="91033" w:author="Claude" w:date="2026-10-27T00:00:00Z">
+        <w:r>
+          <w:t xml:space="preserve">Is it over (Mahagauri) reads a server's metrics after an incident and says, minute by minute, whether recovery has held. An early all-clear is the error that counts.</w:t>
+        </w:r>
+      </w:ins>
+    </w:p>
+    <w:p>
+      <w:pPr>
         <w:keepNext/>
         <w:spacing w:after="0" w:before="160"/>
         <w:jc w:val="center"/>
         <w:rPr>
-          <w:ins w:id="91006" w:author="Claude" w:date="2026-10-27T00:00:00Z"/>
-        </w:rPr>
-      </w:pPr>
-      <w:ins w:id="91007" w:author="Claude" w:date="2026-10-27T00:00:00Z">
+          <w:ins w:id="91034" w:author="Claude" w:date="2026-10-27T00:00:00Z"/>
+        </w:rPr>
+      </w:pPr>
+      <w:ins w:id="91035" w:author="Claude" w:date="2026-10-27T00:00:00Z">
         <w:r>
           <w:rPr>
             <w:smallCaps/>
@@ -3906,10 +4126,10 @@
         <w:spacing w:after="60"/>
         <w:jc w:val="center"/>
         <w:rPr>
-          <w:ins w:id="91008" w:author="Claude" w:date="2026-10-27T00:00:00Z"/>
-        </w:rPr>
-      </w:pPr>
-      <w:ins w:id="91009" w:author="Claude" w:date="2026-10-27T00:00:00Z">
+          <w:ins w:id="91036" w:author="Claude" w:date="2026-10-27T00:00:00Z"/>
+        </w:rPr>
+      </w:pPr>
+      <w:ins w:id="91037" w:author="Claude" w:date="2026-10-27T00:00:00Z">
         <w:r>
           <w:rPr>
             <w:smallCaps/>
@@ -3933,7 +4153,7 @@
       <w:tr>
         <w:trPr>
           <w:cantSplit/>
-          <w:ins w:id="91018" w:author="Claude" w:date="2026-10-27T00:00:00Z"/>
+          <w:ins w:id="91046" w:author="Claude" w:date="2026-10-27T00:00:00Z"/>
         </w:trPr>
         <w:tc>
           <w:tcPr>
@@ -3951,10 +4171,10 @@
             <w:pPr>
               <w:jc w:val="left"/>
               <w:rPr>
-                <w:ins w:id="91010" w:author="Claude" w:date="2026-10-27T00:00:00Z"/>
-              </w:rPr>
-            </w:pPr>
-            <w:ins w:id="91011" w:author="Claude" w:date="2026-10-27T00:00:00Z">
+                <w:ins w:id="91038" w:author="Claude" w:date="2026-10-27T00:00:00Z"/>
+              </w:rPr>
+            </w:pPr>
+            <w:ins w:id="91039" w:author="Claude" w:date="2026-10-27T00:00:00Z">
               <w:r>
                 <w:rPr>
                   <w:b/>
@@ -3983,10 +4203,10 @@
             <w:pPr>
               <w:jc w:val="center"/>
               <w:rPr>
-                <w:ins w:id="91012" w:author="Claude" w:date="2026-10-27T00:00:00Z"/>
-              </w:rPr>
-            </w:pPr>
-            <w:ins w:id="91013" w:author="Claude" w:date="2026-10-27T00:00:00Z">
+                <w:ins w:id="91040" w:author="Claude" w:date="2026-10-27T00:00:00Z"/>
+              </w:rPr>
+            </w:pPr>
+            <w:ins w:id="91041" w:author="Claude" w:date="2026-10-27T00:00:00Z">
               <w:r>
                 <w:rPr>
                   <w:b/>
@@ -4015,10 +4235,10 @@
             <w:pPr>
               <w:jc w:val="center"/>
               <w:rPr>
-                <w:ins w:id="91014" w:author="Claude" w:date="2026-10-27T00:00:00Z"/>
-              </w:rPr>
-            </w:pPr>
-            <w:ins w:id="91015" w:author="Claude" w:date="2026-10-27T00:00:00Z">
+                <w:ins w:id="91042" w:author="Claude" w:date="2026-10-27T00:00:00Z"/>
+              </w:rPr>
+            </w:pPr>
+            <w:ins w:id="91043" w:author="Claude" w:date="2026-10-27T00:00:00Z">
               <w:r>
                 <w:rPr>
                   <w:b/>
@@ -4047,10 +4267,10 @@
             <w:pPr>
               <w:jc w:val="center"/>
               <w:rPr>
-                <w:ins w:id="91016" w:author="Claude" w:date="2026-10-27T00:00:00Z"/>
-              </w:rPr>
-            </w:pPr>
-            <w:ins w:id="91017" w:author="Claude" w:date="2026-10-27T00:00:00Z">
+                <w:ins w:id="91044" w:author="Claude" w:date="2026-10-27T00:00:00Z"/>
+              </w:rPr>
+            </w:pPr>
+            <w:ins w:id="91045" w:author="Claude" w:date="2026-10-27T00:00:00Z">
               <w:r>
                 <w:rPr>
                   <w:b/>
@@ -4067,7 +4287,7 @@
       <w:tr>
         <w:trPr>
           <w:cantSplit/>
-          <w:ins w:id="91027" w:author="Claude" w:date="2026-10-27T00:00:00Z"/>
+          <w:ins w:id="91055" w:author="Claude" w:date="2026-10-27T00:00:00Z"/>
         </w:trPr>
         <w:tc>
           <w:tcPr>
@@ -4082,10 +4302,10 @@
             <w:pPr>
               <w:jc w:val="left"/>
               <w:rPr>
-                <w:ins w:id="91019" w:author="Claude" w:date="2026-10-27T00:00:00Z"/>
-              </w:rPr>
-            </w:pPr>
-            <w:ins w:id="91020" w:author="Claude" w:date="2026-10-27T00:00:00Z">
+                <w:ins w:id="91047" w:author="Claude" w:date="2026-10-27T00:00:00Z"/>
+              </w:rPr>
+            </w:pPr>
+            <w:ins w:id="91048" w:author="Claude" w:date="2026-10-27T00:00:00Z">
               <w:r>
                 <w:rPr>
                   <w:sz w:val="16"/>
@@ -4109,10 +4329,10 @@
             <w:pPr>
               <w:jc w:val="center"/>
               <w:rPr>
-                <w:ins w:id="91021" w:author="Claude" w:date="2026-10-27T00:00:00Z"/>
-              </w:rPr>
-            </w:pPr>
-            <w:ins w:id="91022" w:author="Claude" w:date="2026-10-27T00:00:00Z">
+                <w:ins w:id="91049" w:author="Claude" w:date="2026-10-27T00:00:00Z"/>
+              </w:rPr>
+            </w:pPr>
+            <w:ins w:id="91050" w:author="Claude" w:date="2026-10-27T00:00:00Z">
               <w:r>
                 <w:rPr>
                   <w:sz w:val="16"/>
@@ -4136,10 +4356,10 @@
             <w:pPr>
               <w:jc w:val="center"/>
               <w:rPr>
-                <w:ins w:id="91023" w:author="Claude" w:date="2026-10-27T00:00:00Z"/>
-              </w:rPr>
-            </w:pPr>
-            <w:ins w:id="91024" w:author="Claude" w:date="2026-10-27T00:00:00Z">
+                <w:ins w:id="91051" w:author="Claude" w:date="2026-10-27T00:00:00Z"/>
+              </w:rPr>
+            </w:pPr>
+            <w:ins w:id="91052" w:author="Claude" w:date="2026-10-27T00:00:00Z">
               <w:r>
                 <w:rPr>
                   <w:sz w:val="16"/>
@@ -4163,10 +4383,10 @@
             <w:pPr>
               <w:jc w:val="center"/>
               <w:rPr>
-                <w:ins w:id="91025" w:author="Claude" w:date="2026-10-27T00:00:00Z"/>
-              </w:rPr>
-            </w:pPr>
-            <w:ins w:id="91026" w:author="Claude" w:date="2026-10-27T00:00:00Z">
+                <w:ins w:id="91053" w:author="Claude" w:date="2026-10-27T00:00:00Z"/>
+              </w:rPr>
+            </w:pPr>
+            <w:ins w:id="91054" w:author="Claude" w:date="2026-10-27T00:00:00Z">
               <w:r>
                 <w:rPr>
                   <w:sz w:val="16"/>
@@ -4181,7 +4401,7 @@
       <w:tr>
         <w:trPr>
           <w:cantSplit/>
-          <w:ins w:id="91036" w:author="Claude" w:date="2026-10-27T00:00:00Z"/>
+          <w:ins w:id="91064" w:author="Claude" w:date="2026-10-27T00:00:00Z"/>
         </w:trPr>
         <w:tc>
           <w:tcPr>
@@ -4196,10 +4416,10 @@
             <w:pPr>
               <w:jc w:val="left"/>
               <w:rPr>
-                <w:ins w:id="91028" w:author="Claude" w:date="2026-10-27T00:00:00Z"/>
-              </w:rPr>
-            </w:pPr>
-            <w:ins w:id="91029" w:author="Claude" w:date="2026-10-27T00:00:00Z">
+                <w:ins w:id="91056" w:author="Claude" w:date="2026-10-27T00:00:00Z"/>
+              </w:rPr>
+            </w:pPr>
+            <w:ins w:id="91057" w:author="Claude" w:date="2026-10-27T00:00:00Z">
               <w:r>
                 <w:rPr>
                   <w:sz w:val="16"/>
@@ -4223,10 +4443,10 @@
             <w:pPr>
               <w:jc w:val="center"/>
               <w:rPr>
-                <w:ins w:id="91030" w:author="Claude" w:date="2026-10-27T00:00:00Z"/>
-              </w:rPr>
-            </w:pPr>
-            <w:ins w:id="91031" w:author="Claude" w:date="2026-10-27T00:00:00Z">
+                <w:ins w:id="91058" w:author="Claude" w:date="2026-10-27T00:00:00Z"/>
+              </w:rPr>
+            </w:pPr>
+            <w:ins w:id="91059" w:author="Claude" w:date="2026-10-27T00:00:00Z">
               <w:r>
                 <w:rPr>
                   <w:sz w:val="16"/>
@@ -4250,10 +4470,10 @@
             <w:pPr>
               <w:jc w:val="center"/>
               <w:rPr>
-                <w:ins w:id="91032" w:author="Claude" w:date="2026-10-27T00:00:00Z"/>
-              </w:rPr>
-            </w:pPr>
-            <w:ins w:id="91033" w:author="Claude" w:date="2026-10-27T00:00:00Z">
+                <w:ins w:id="91060" w:author="Claude" w:date="2026-10-27T00:00:00Z"/>
+              </w:rPr>
+            </w:pPr>
+            <w:ins w:id="91061" w:author="Claude" w:date="2026-10-27T00:00:00Z">
               <w:r>
                 <w:rPr>
                   <w:sz w:val="16"/>
@@ -4277,10 +4497,10 @@
             <w:pPr>
               <w:jc w:val="center"/>
               <w:rPr>
-                <w:ins w:id="91034" w:author="Claude" w:date="2026-10-27T00:00:00Z"/>
-              </w:rPr>
-            </w:pPr>
-            <w:ins w:id="91035" w:author="Claude" w:date="2026-10-27T00:00:00Z">
+                <w:ins w:id="91062" w:author="Claude" w:date="2026-10-27T00:00:00Z"/>
+              </w:rPr>
+            </w:pPr>
+            <w:ins w:id="91063" w:author="Claude" w:date="2026-10-27T00:00:00Z">
               <w:r>
                 <w:rPr>
                   <w:sz w:val="16"/>
@@ -4295,7 +4515,7 @@
       <w:tr>
         <w:trPr>
           <w:cantSplit/>
-          <w:ins w:id="91045" w:author="Claude" w:date="2026-10-27T00:00:00Z"/>
+          <w:ins w:id="91073" w:author="Claude" w:date="2026-10-27T00:00:00Z"/>
         </w:trPr>
         <w:tc>
           <w:tcPr>
@@ -4310,10 +4530,10 @@
             <w:pPr>
               <w:jc w:val="left"/>
               <w:rPr>
-                <w:ins w:id="91037" w:author="Claude" w:date="2026-10-27T00:00:00Z"/>
-              </w:rPr>
-            </w:pPr>
-            <w:ins w:id="91038" w:author="Claude" w:date="2026-10-27T00:00:00Z">
+                <w:ins w:id="91065" w:author="Claude" w:date="2026-10-27T00:00:00Z"/>
+              </w:rPr>
+            </w:pPr>
+            <w:ins w:id="91066" w:author="Claude" w:date="2026-10-27T00:00:00Z">
               <w:r>
                 <w:rPr>
                   <w:sz w:val="16"/>
@@ -4337,10 +4557,10 @@
             <w:pPr>
               <w:jc w:val="center"/>
               <w:rPr>
-                <w:ins w:id="91039" w:author="Claude" w:date="2026-10-27T00:00:00Z"/>
-              </w:rPr>
-            </w:pPr>
-            <w:ins w:id="91040" w:author="Claude" w:date="2026-10-27T00:00:00Z">
+                <w:ins w:id="91067" w:author="Claude" w:date="2026-10-27T00:00:00Z"/>
+              </w:rPr>
+            </w:pPr>
+            <w:ins w:id="91068" w:author="Claude" w:date="2026-10-27T00:00:00Z">
               <w:r>
                 <w:rPr>
                   <w:sz w:val="16"/>
@@ -4364,10 +4584,10 @@
             <w:pPr>
               <w:jc w:val="center"/>
               <w:rPr>
-                <w:ins w:id="91041" w:author="Claude" w:date="2026-10-27T00:00:00Z"/>
-              </w:rPr>
-            </w:pPr>
-            <w:ins w:id="91042" w:author="Claude" w:date="2026-10-27T00:00:00Z">
+                <w:ins w:id="91069" w:author="Claude" w:date="2026-10-27T00:00:00Z"/>
+              </w:rPr>
+            </w:pPr>
+            <w:ins w:id="91070" w:author="Claude" w:date="2026-10-27T00:00:00Z">
               <w:r>
                 <w:rPr>
                   <w:sz w:val="16"/>
@@ -4391,10 +4611,10 @@
             <w:pPr>
               <w:jc w:val="center"/>
               <w:rPr>
-                <w:ins w:id="91043" w:author="Claude" w:date="2026-10-27T00:00:00Z"/>
-              </w:rPr>
-            </w:pPr>
-            <w:ins w:id="91044" w:author="Claude" w:date="2026-10-27T00:00:00Z">
+                <w:ins w:id="91071" w:author="Claude" w:date="2026-10-27T00:00:00Z"/>
+              </w:rPr>
+            </w:pPr>
+            <w:ins w:id="91072" w:author="Claude" w:date="2026-10-27T00:00:00Z">
               <w:r>
                 <w:rPr>
                   <w:sz w:val="16"/>
@@ -4409,7 +4629,7 @@
       <w:tr>
         <w:trPr>
           <w:cantSplit/>
-          <w:ins w:id="91054" w:author="Claude" w:date="2026-10-27T00:00:00Z"/>
+          <w:ins w:id="91082" w:author="Claude" w:date="2026-10-27T00:00:00Z"/>
         </w:trPr>
         <w:tc>
           <w:tcPr>
@@ -4424,10 +4644,10 @@
             <w:pPr>
               <w:jc w:val="left"/>
               <w:rPr>
-                <w:ins w:id="91046" w:author="Claude" w:date="2026-10-27T00:00:00Z"/>
-              </w:rPr>
-            </w:pPr>
-            <w:ins w:id="91047" w:author="Claude" w:date="2026-10-27T00:00:00Z">
+                <w:ins w:id="91074" w:author="Claude" w:date="2026-10-27T00:00:00Z"/>
+              </w:rPr>
+            </w:pPr>
+            <w:ins w:id="91075" w:author="Claude" w:date="2026-10-27T00:00:00Z">
               <w:r>
                 <w:rPr>
                   <w:sz w:val="16"/>
@@ -4451,10 +4671,10 @@
             <w:pPr>
               <w:jc w:val="center"/>
               <w:rPr>
-                <w:ins w:id="91048" w:author="Claude" w:date="2026-10-27T00:00:00Z"/>
-              </w:rPr>
-            </w:pPr>
-            <w:ins w:id="91049" w:author="Claude" w:date="2026-10-27T00:00:00Z">
+                <w:ins w:id="91076" w:author="Claude" w:date="2026-10-27T00:00:00Z"/>
+              </w:rPr>
+            </w:pPr>
+            <w:ins w:id="91077" w:author="Claude" w:date="2026-10-27T00:00:00Z">
               <w:r>
                 <w:rPr>
                   <w:sz w:val="16"/>
@@ -4478,10 +4698,10 @@
             <w:pPr>
               <w:jc w:val="center"/>
               <w:rPr>
-                <w:ins w:id="91050" w:author="Claude" w:date="2026-10-27T00:00:00Z"/>
-              </w:rPr>
-            </w:pPr>
-            <w:ins w:id="91051" w:author="Claude" w:date="2026-10-27T00:00:00Z">
+                <w:ins w:id="91078" w:author="Claude" w:date="2026-10-27T00:00:00Z"/>
+              </w:rPr>
+            </w:pPr>
+            <w:ins w:id="91079" w:author="Claude" w:date="2026-10-27T00:00:00Z">
               <w:r>
                 <w:rPr>
                   <w:sz w:val="16"/>
@@ -4505,10 +4725,10 @@
             <w:pPr>
               <w:jc w:val="center"/>
               <w:rPr>
-                <w:ins w:id="91052" w:author="Claude" w:date="2026-10-27T00:00:00Z"/>
-              </w:rPr>
-            </w:pPr>
-            <w:ins w:id="91053" w:author="Claude" w:date="2026-10-27T00:00:00Z">
+                <w:ins w:id="91080" w:author="Claude" w:date="2026-10-27T00:00:00Z"/>
+              </w:rPr>
+            </w:pPr>
+            <w:ins w:id="91081" w:author="Claude" w:date="2026-10-27T00:00:00Z">
               <w:r>
                 <w:rPr>
                   <w:sz w:val="16"/>
@@ -4523,7 +4743,7 @@
       <w:tr>
         <w:trPr>
           <w:cantSplit/>
-          <w:ins w:id="91063" w:author="Claude" w:date="2026-10-27T00:00:00Z"/>
+          <w:ins w:id="91091" w:author="Claude" w:date="2026-10-27T00:00:00Z"/>
         </w:trPr>
         <w:tc>
           <w:tcPr>
@@ -4538,10 +4758,10 @@
             <w:pPr>
               <w:jc w:val="left"/>
               <w:rPr>
-                <w:ins w:id="91055" w:author="Claude" w:date="2026-10-27T00:00:00Z"/>
-              </w:rPr>
-            </w:pPr>
-            <w:ins w:id="91056" w:author="Claude" w:date="2026-10-27T00:00:00Z">
+                <w:ins w:id="91083" w:author="Claude" w:date="2026-10-27T00:00:00Z"/>
+              </w:rPr>
+            </w:pPr>
+            <w:ins w:id="91084" w:author="Claude" w:date="2026-10-27T00:00:00Z">
               <w:r>
                 <w:rPr>
                   <w:sz w:val="16"/>
@@ -4565,10 +4785,10 @@
             <w:pPr>
               <w:jc w:val="center"/>
               <w:rPr>
-                <w:ins w:id="91057" w:author="Claude" w:date="2026-10-27T00:00:00Z"/>
-              </w:rPr>
-            </w:pPr>
-            <w:ins w:id="91058" w:author="Claude" w:date="2026-10-27T00:00:00Z">
+                <w:ins w:id="91085" w:author="Claude" w:date="2026-10-27T00:00:00Z"/>
+              </w:rPr>
+            </w:pPr>
+            <w:ins w:id="91086" w:author="Claude" w:date="2026-10-27T00:00:00Z">
               <w:r>
                 <w:rPr>
                   <w:sz w:val="16"/>
@@ -4592,10 +4812,10 @@
             <w:pPr>
               <w:jc w:val="center"/>
               <w:rPr>
-                <w:ins w:id="91059" w:author="Claude" w:date="2026-10-27T00:00:00Z"/>
-              </w:rPr>
-            </w:pPr>
-            <w:ins w:id="91060" w:author="Claude" w:date="2026-10-27T00:00:00Z">
+                <w:ins w:id="91087" w:author="Claude" w:date="2026-10-27T00:00:00Z"/>
+              </w:rPr>
+            </w:pPr>
+            <w:ins w:id="91088" w:author="Claude" w:date="2026-10-27T00:00:00Z">
               <w:r>
                 <w:rPr>
                   <w:sz w:val="16"/>
@@ -4619,16 +4839,16 @@
             <w:pPr>
               <w:jc w:val="center"/>
               <w:rPr>
-                <w:ins w:id="91061" w:author="Claude" w:date="2026-10-27T00:00:00Z"/>
-              </w:rPr>
-            </w:pPr>
-            <w:ins w:id="91062" w:author="Claude" w:date="2026-10-27T00:00:00Z">
+                <w:ins w:id="91089" w:author="Claude" w:date="2026-10-27T00:00:00Z"/>
+              </w:rPr>
+            </w:pPr>
+            <w:ins w:id="91090" w:author="Claude" w:date="2026-10-27T00:00:00Z">
               <w:r>
                 <w:rPr>
                   <w:sz w:val="16"/>
                   <w:szCs w:val="16"/>
                 </w:rPr>
-                <w:t xml:space="preserve">BM25 0.537</w:t>
+                <w:t xml:space="preserve">BM25 0.537; TF-IDF LR 0.827</w:t>
               </w:r>
             </w:ins>
           </w:p>
@@ -4637,7 +4857,7 @@
       <w:tr>
         <w:trPr>
           <w:cantSplit/>
-          <w:ins w:id="91072" w:author="Claude" w:date="2026-10-27T00:00:00Z"/>
+          <w:ins w:id="91100" w:author="Claude" w:date="2026-10-27T00:00:00Z"/>
         </w:trPr>
         <w:tc>
           <w:tcPr>
@@ -4652,10 +4872,10 @@
             <w:pPr>
               <w:jc w:val="left"/>
               <w:rPr>
-                <w:ins w:id="91064" w:author="Claude" w:date="2026-10-27T00:00:00Z"/>
-              </w:rPr>
-            </w:pPr>
-            <w:ins w:id="91065" w:author="Claude" w:date="2026-10-27T00:00:00Z">
+                <w:ins w:id="91092" w:author="Claude" w:date="2026-10-27T00:00:00Z"/>
+              </w:rPr>
+            </w:pPr>
+            <w:ins w:id="91093" w:author="Claude" w:date="2026-10-27T00:00:00Z">
               <w:r>
                 <w:rPr>
                   <w:sz w:val="16"/>
@@ -4679,10 +4899,10 @@
             <w:pPr>
               <w:jc w:val="center"/>
               <w:rPr>
-                <w:ins w:id="91066" w:author="Claude" w:date="2026-10-27T00:00:00Z"/>
-              </w:rPr>
-            </w:pPr>
-            <w:ins w:id="91067" w:author="Claude" w:date="2026-10-27T00:00:00Z">
+                <w:ins w:id="91094" w:author="Claude" w:date="2026-10-27T00:00:00Z"/>
+              </w:rPr>
+            </w:pPr>
+            <w:ins w:id="91095" w:author="Claude" w:date="2026-10-27T00:00:00Z">
               <w:r>
                 <w:rPr>
                   <w:sz w:val="16"/>
@@ -4706,10 +4926,10 @@
             <w:pPr>
               <w:jc w:val="center"/>
               <w:rPr>
-                <w:ins w:id="91068" w:author="Claude" w:date="2026-10-27T00:00:00Z"/>
-              </w:rPr>
-            </w:pPr>
-            <w:ins w:id="91069" w:author="Claude" w:date="2026-10-27T00:00:00Z">
+                <w:ins w:id="91096" w:author="Claude" w:date="2026-10-27T00:00:00Z"/>
+              </w:rPr>
+            </w:pPr>
+            <w:ins w:id="91097" w:author="Claude" w:date="2026-10-27T00:00:00Z">
               <w:r>
                 <w:rPr>
                   <w:sz w:val="16"/>
@@ -4733,10 +4953,10 @@
             <w:pPr>
               <w:jc w:val="center"/>
               <w:rPr>
-                <w:ins w:id="91070" w:author="Claude" w:date="2026-10-27T00:00:00Z"/>
-              </w:rPr>
-            </w:pPr>
-            <w:ins w:id="91071" w:author="Claude" w:date="2026-10-27T00:00:00Z">
+                <w:ins w:id="91098" w:author="Claude" w:date="2026-10-27T00:00:00Z"/>
+              </w:rPr>
+            </w:pPr>
+            <w:ins w:id="91099" w:author="Claude" w:date="2026-10-27T00:00:00Z">
               <w:r>
                 <w:rPr>
                   <w:sz w:val="16"/>
@@ -4751,7 +4971,7 @@
       <w:tr>
         <w:trPr>
           <w:cantSplit/>
-          <w:ins w:id="91081" w:author="Claude" w:date="2026-10-27T00:00:00Z"/>
+          <w:ins w:id="91109" w:author="Claude" w:date="2026-10-27T00:00:00Z"/>
         </w:trPr>
         <w:tc>
           <w:tcPr>
@@ -4766,10 +4986,10 @@
             <w:pPr>
               <w:jc w:val="left"/>
               <w:rPr>
-                <w:ins w:id="91073" w:author="Claude" w:date="2026-10-27T00:00:00Z"/>
-              </w:rPr>
-            </w:pPr>
-            <w:ins w:id="91074" w:author="Claude" w:date="2026-10-27T00:00:00Z">
+                <w:ins w:id="91101" w:author="Claude" w:date="2026-10-27T00:00:00Z"/>
+              </w:rPr>
+            </w:pPr>
+            <w:ins w:id="91102" w:author="Claude" w:date="2026-10-27T00:00:00Z">
               <w:r>
                 <w:rPr>
                   <w:sz w:val="16"/>
@@ -4793,10 +5013,10 @@
             <w:pPr>
               <w:jc w:val="center"/>
               <w:rPr>
-                <w:ins w:id="91075" w:author="Claude" w:date="2026-10-27T00:00:00Z"/>
-              </w:rPr>
-            </w:pPr>
-            <w:ins w:id="91076" w:author="Claude" w:date="2026-10-27T00:00:00Z">
+                <w:ins w:id="91103" w:author="Claude" w:date="2026-10-27T00:00:00Z"/>
+              </w:rPr>
+            </w:pPr>
+            <w:ins w:id="91104" w:author="Claude" w:date="2026-10-27T00:00:00Z">
               <w:r>
                 <w:rPr>
                   <w:sz w:val="16"/>
@@ -4820,10 +5040,10 @@
             <w:pPr>
               <w:jc w:val="center"/>
               <w:rPr>
-                <w:ins w:id="91077" w:author="Claude" w:date="2026-10-27T00:00:00Z"/>
-              </w:rPr>
-            </w:pPr>
-            <w:ins w:id="91078" w:author="Claude" w:date="2026-10-27T00:00:00Z">
+                <w:ins w:id="91105" w:author="Claude" w:date="2026-10-27T00:00:00Z"/>
+              </w:rPr>
+            </w:pPr>
+            <w:ins w:id="91106" w:author="Claude" w:date="2026-10-27T00:00:00Z">
               <w:r>
                 <w:rPr>
                   <w:sz w:val="16"/>
@@ -4847,10 +5067,10 @@
             <w:pPr>
               <w:jc w:val="center"/>
               <w:rPr>
-                <w:ins w:id="91079" w:author="Claude" w:date="2026-10-27T00:00:00Z"/>
-              </w:rPr>
-            </w:pPr>
-            <w:ins w:id="91080" w:author="Claude" w:date="2026-10-27T00:00:00Z">
+                <w:ins w:id="91107" w:author="Claude" w:date="2026-10-27T00:00:00Z"/>
+              </w:rPr>
+            </w:pPr>
+            <w:ins w:id="91108" w:author="Claude" w:date="2026-10-27T00:00:00Z">
               <w:r>
                 <w:rPr>
                   <w:sz w:val="16"/>
@@ -4865,7 +5085,7 @@
       <w:tr>
         <w:trPr>
           <w:cantSplit/>
-          <w:ins w:id="91090" w:author="Claude" w:date="2026-10-27T00:00:00Z"/>
+          <w:ins w:id="91118" w:author="Claude" w:date="2026-10-27T00:00:00Z"/>
         </w:trPr>
         <w:tc>
           <w:tcPr>
@@ -4880,10 +5100,10 @@
             <w:pPr>
               <w:jc w:val="left"/>
               <w:rPr>
-                <w:ins w:id="91082" w:author="Claude" w:date="2026-10-27T00:00:00Z"/>
-              </w:rPr>
-            </w:pPr>
-            <w:ins w:id="91083" w:author="Claude" w:date="2026-10-27T00:00:00Z">
+                <w:ins w:id="91110" w:author="Claude" w:date="2026-10-27T00:00:00Z"/>
+              </w:rPr>
+            </w:pPr>
+            <w:ins w:id="91111" w:author="Claude" w:date="2026-10-27T00:00:00Z">
               <w:r>
                 <w:rPr>
                   <w:sz w:val="16"/>
@@ -4907,10 +5127,10 @@
             <w:pPr>
               <w:jc w:val="center"/>
               <w:rPr>
-                <w:ins w:id="91084" w:author="Claude" w:date="2026-10-27T00:00:00Z"/>
-              </w:rPr>
-            </w:pPr>
-            <w:ins w:id="91085" w:author="Claude" w:date="2026-10-27T00:00:00Z">
+                <w:ins w:id="91112" w:author="Claude" w:date="2026-10-27T00:00:00Z"/>
+              </w:rPr>
+            </w:pPr>
+            <w:ins w:id="91113" w:author="Claude" w:date="2026-10-27T00:00:00Z">
               <w:r>
                 <w:rPr>
                   <w:sz w:val="16"/>
@@ -4934,10 +5154,10 @@
             <w:pPr>
               <w:jc w:val="center"/>
               <w:rPr>
-                <w:ins w:id="91086" w:author="Claude" w:date="2026-10-27T00:00:00Z"/>
-              </w:rPr>
-            </w:pPr>
-            <w:ins w:id="91087" w:author="Claude" w:date="2026-10-27T00:00:00Z">
+                <w:ins w:id="91114" w:author="Claude" w:date="2026-10-27T00:00:00Z"/>
+              </w:rPr>
+            </w:pPr>
+            <w:ins w:id="91115" w:author="Claude" w:date="2026-10-27T00:00:00Z">
               <w:r>
                 <w:rPr>
                   <w:sz w:val="16"/>
@@ -4961,10 +5181,10 @@
             <w:pPr>
               <w:jc w:val="center"/>
               <w:rPr>
-                <w:ins w:id="91088" w:author="Claude" w:date="2026-10-27T00:00:00Z"/>
-              </w:rPr>
-            </w:pPr>
-            <w:ins w:id="91089" w:author="Claude" w:date="2026-10-27T00:00:00Z">
+                <w:ins w:id="91116" w:author="Claude" w:date="2026-10-27T00:00:00Z"/>
+              </w:rPr>
+            </w:pPr>
+            <w:ins w:id="91117" w:author="Claude" w:date="2026-10-27T00:00:00Z">
               <w:r>
                 <w:rPr>
                   <w:sz w:val="16"/>
@@ -4979,7 +5199,7 @@
       <w:tr>
         <w:trPr>
           <w:cantSplit/>
-          <w:ins w:id="91099" w:author="Claude" w:date="2026-10-27T00:00:00Z"/>
+          <w:ins w:id="91127" w:author="Claude" w:date="2026-10-27T00:00:00Z"/>
         </w:trPr>
         <w:tc>
           <w:tcPr>
@@ -4996,10 +5216,10 @@
             <w:pPr>
               <w:jc w:val="left"/>
               <w:rPr>
-                <w:ins w:id="91091" w:author="Claude" w:date="2026-10-27T00:00:00Z"/>
-              </w:rPr>
-            </w:pPr>
-            <w:ins w:id="91092" w:author="Claude" w:date="2026-10-27T00:00:00Z">
+                <w:ins w:id="91119" w:author="Claude" w:date="2026-10-27T00:00:00Z"/>
+              </w:rPr>
+            </w:pPr>
+            <w:ins w:id="91120" w:author="Claude" w:date="2026-10-27T00:00:00Z">
               <w:r>
                 <w:rPr>
                   <w:sz w:val="16"/>
@@ -5025,10 +5245,10 @@
             <w:pPr>
               <w:jc w:val="center"/>
               <w:rPr>
-                <w:ins w:id="91093" w:author="Claude" w:date="2026-10-27T00:00:00Z"/>
-              </w:rPr>
-            </w:pPr>
-            <w:ins w:id="91094" w:author="Claude" w:date="2026-10-27T00:00:00Z">
+                <w:ins w:id="91121" w:author="Claude" w:date="2026-10-27T00:00:00Z"/>
+              </w:rPr>
+            </w:pPr>
+            <w:ins w:id="91122" w:author="Claude" w:date="2026-10-27T00:00:00Z">
               <w:r>
                 <w:rPr>
                   <w:sz w:val="16"/>
@@ -5054,10 +5274,10 @@
             <w:pPr>
               <w:jc w:val="center"/>
               <w:rPr>
-                <w:ins w:id="91095" w:author="Claude" w:date="2026-10-27T00:00:00Z"/>
-              </w:rPr>
-            </w:pPr>
-            <w:ins w:id="91096" w:author="Claude" w:date="2026-10-27T00:00:00Z">
+                <w:ins w:id="91123" w:author="Claude" w:date="2026-10-27T00:00:00Z"/>
+              </w:rPr>
+            </w:pPr>
+            <w:ins w:id="91124" w:author="Claude" w:date="2026-10-27T00:00:00Z">
               <w:r>
                 <w:rPr>
                   <w:sz w:val="16"/>
@@ -5083,10 +5303,10 @@
             <w:pPr>
               <w:jc w:val="center"/>
               <w:rPr>
-                <w:ins w:id="91097" w:author="Claude" w:date="2026-10-27T00:00:00Z"/>
-              </w:rPr>
-            </w:pPr>
-            <w:ins w:id="91098" w:author="Claude" w:date="2026-10-27T00:00:00Z">
+                <w:ins w:id="91125" w:author="Claude" w:date="2026-10-27T00:00:00Z"/>
+              </w:rPr>
+            </w:pPr>
+            <w:ins w:id="91126" w:author="Claude" w:date="2026-10-27T00:00:00Z">
               <w:r>
                 <w:rPr>
                   <w:sz w:val="16"/>
@@ -5105,10 +5325,10 @@
         <w:ind w:firstLine="202"/>
         <w:jc w:val="both"/>
         <w:rPr>
-          <w:ins w:id="91100" w:author="Claude" w:date="2026-10-27T00:00:00Z"/>
-        </w:rPr>
-      </w:pPr>
-      <w:ins w:id="91101" w:author="Claude" w:date="2026-10-27T00:00:00Z">
+          <w:ins w:id="91128" w:author="Claude" w:date="2026-10-27T00:00:00Z"/>
+        </w:rPr>
+      </w:pPr>
+      <w:ins w:id="91129" w:author="Claude" w:date="2026-10-27T00:00:00Z">
         <w:r>
           <w:t xml:space="preserve">Two of the nine do not yet earn a decision on their own. Mahagauri, the recovery verifier, stays within its safety budget only by rarely confirming recovery, and Siddhidatri's fusion of three detectors buys recall with false alarms. Both remain advisory: a person decides.</w:t>
         </w:r>
@@ -7037,7 +7257,20 @@
         <w:jc w:val="both"/>
       </w:pPr>
       <w:r>
-        <w:t xml:space="preserve">This section follows the credential stuffing scenario through the system, using the records the console shows. Fig. 2 summarises it.</w:t>
+        <w:t xml:space="preserve">This section follows the credential stuffing scenario through the system, using the records the console shows. </w:t>
+      </w:r>
+      <w:del w:id="91000" w:author="Claude" w:date="2026-10-27T00:00:00Z">
+        <w:r>
+          <w:delText>Fig. 2</w:delText>
+        </w:r>
+      </w:del>
+      <w:ins w:id="91001" w:author="Claude" w:date="2026-10-27T00:00:00Z">
+        <w:r>
+          <w:t>Fig. 3</w:t>
+        </w:r>
+      </w:ins>
+      <w:r>
+        <w:t xml:space="preserve"> summarises it.</w:t>
       </w:r>
     </w:p>
     <w:p>
@@ -7092,12 +7325,30 @@
         <w:spacing w:after="140"/>
         <w:jc w:val="both"/>
       </w:pPr>
-      <w:r>
-        <w:rPr>
-          <w:sz w:val="16"/>
-          <w:szCs w:val="16"/>
-        </w:rPr>
-        <w:t xml:space="preserve">Fig. 2. The credential stuffing scenario. Four events from three entities are correlated into one incident, the travelling user explanation is ruled out by the impossible travel event, and the proposed session revocation lands in the approval tier with an effective risk of 46.</w:t>
+      <w:del w:id="91002" w:author="Claude" w:date="2026-10-27T00:00:00Z">
+        <w:r>
+          <w:rPr>
+            <w:sz w:val="16"/>
+            <w:szCs w:val="16"/>
+          </w:rPr>
+          <w:delText>Fig. 2</w:delText>
+        </w:r>
+      </w:del>
+      <w:ins w:id="91003" w:author="Claude" w:date="2026-10-27T00:00:00Z">
+        <w:r>
+          <w:rPr>
+            <w:sz w:val="16"/>
+            <w:szCs w:val="16"/>
+          </w:rPr>
+          <w:t>Fig. 3</w:t>
+        </w:r>
+      </w:ins>
+      <w:r>
+        <w:rPr>
+          <w:sz w:val="16"/>
+          <w:szCs w:val="16"/>
+        </w:rPr>
+        <w:t xml:space="preserve">. The credential stuffing scenario. Four events from three entities are correlated into one incident, the travelling user explanation is ruled out by the impossible travel event, and the proposed session revocation lands in the approval tier with an effective risk of 46.</w:t>
       </w:r>
     </w:p>
     <w:p>
@@ -12772,10 +13023,10 @@
         <w:keepNext/>
         <w:spacing w:after="40" w:before="80"/>
         <w:rPr>
-          <w:ins w:id="91102" w:author="Claude" w:date="2026-10-27T00:00:00Z"/>
-        </w:rPr>
-      </w:pPr>
-      <w:ins w:id="91103" w:author="Claude" w:date="2026-10-27T00:00:00Z">
+          <w:ins w:id="91130" w:author="Claude" w:date="2026-10-27T00:00:00Z"/>
+        </w:rPr>
+      </w:pPr>
+      <w:ins w:id="91131" w:author="Claude" w:date="2026-10-27T00:00:00Z">
         <w:r>
           <w:rPr>
             <w:i/>
@@ -12791,10 +13042,10 @@
         <w:ind w:firstLine="202"/>
         <w:jc w:val="both"/>
         <w:rPr>
-          <w:ins w:id="91104" w:author="Claude" w:date="2026-10-27T00:00:00Z"/>
-        </w:rPr>
-      </w:pPr>
-      <w:ins w:id="91105" w:author="Claude" w:date="2026-10-27T00:00:00Z">
+          <w:ins w:id="91132" w:author="Claude" w:date="2026-10-27T00:00:00Z"/>
+        </w:rPr>
+      </w:pPr>
+      <w:ins w:id="91133" w:author="Claude" w:date="2026-10-27T00:00:00Z">
         <w:r>
           <w:t xml:space="preserve">RQ5 asks whether a small model trained on real incidents diagnoses better than general language models given the same evidence, on a benchmark this project did not write. The cases come from RCAEval: fault injections on real microservice deployments, labelled by the injected root service. A sample of 100 Online Boutique and Sock Shop cases was declared and hash-locked before any run. Every diagnoser received the same per-service evidence, built without the label, and was scored by the same harness. Katyayani was trained only on other systems. The language models ran through the AI Gateway at temperature 0.2 (Table XII).</w:t>
         </w:r>
@@ -12806,10 +13057,10 @@
         <w:spacing w:after="0" w:before="160"/>
         <w:jc w:val="center"/>
         <w:rPr>
-          <w:ins w:id="91106" w:author="Claude" w:date="2026-10-27T00:00:00Z"/>
-        </w:rPr>
-      </w:pPr>
-      <w:ins w:id="91107" w:author="Claude" w:date="2026-10-27T00:00:00Z">
+          <w:ins w:id="91134" w:author="Claude" w:date="2026-10-27T00:00:00Z"/>
+        </w:rPr>
+      </w:pPr>
+      <w:ins w:id="91135" w:author="Claude" w:date="2026-10-27T00:00:00Z">
         <w:r>
           <w:rPr>
             <w:smallCaps/>
@@ -12826,10 +13077,10 @@
         <w:spacing w:after="60"/>
         <w:jc w:val="center"/>
         <w:rPr>
-          <w:ins w:id="91108" w:author="Claude" w:date="2026-10-27T00:00:00Z"/>
-        </w:rPr>
-      </w:pPr>
-      <w:ins w:id="91109" w:author="Claude" w:date="2026-10-27T00:00:00Z">
+          <w:ins w:id="91136" w:author="Claude" w:date="2026-10-27T00:00:00Z"/>
+        </w:rPr>
+      </w:pPr>
+      <w:ins w:id="91137" w:author="Claude" w:date="2026-10-27T00:00:00Z">
         <w:r>
           <w:rPr>
             <w:smallCaps/>
@@ -12853,7 +13104,7 @@
       <w:tr>
         <w:trPr>
           <w:cantSplit/>
-          <w:ins w:id="91118" w:author="Claude" w:date="2026-10-27T00:00:00Z"/>
+          <w:ins w:id="91146" w:author="Claude" w:date="2026-10-27T00:00:00Z"/>
         </w:trPr>
         <w:tc>
           <w:tcPr>
@@ -12871,10 +13122,10 @@
             <w:pPr>
               <w:jc w:val="left"/>
               <w:rPr>
-                <w:ins w:id="91110" w:author="Claude" w:date="2026-10-27T00:00:00Z"/>
-              </w:rPr>
-            </w:pPr>
-            <w:ins w:id="91111" w:author="Claude" w:date="2026-10-27T00:00:00Z">
+                <w:ins w:id="91138" w:author="Claude" w:date="2026-10-27T00:00:00Z"/>
+              </w:rPr>
+            </w:pPr>
+            <w:ins w:id="91139" w:author="Claude" w:date="2026-10-27T00:00:00Z">
               <w:r>
                 <w:rPr>
                   <w:b/>
@@ -12903,10 +13154,10 @@
             <w:pPr>
               <w:jc w:val="center"/>
               <w:rPr>
-                <w:ins w:id="91112" w:author="Claude" w:date="2026-10-27T00:00:00Z"/>
-              </w:rPr>
-            </w:pPr>
-            <w:ins w:id="91113" w:author="Claude" w:date="2026-10-27T00:00:00Z">
+                <w:ins w:id="91140" w:author="Claude" w:date="2026-10-27T00:00:00Z"/>
+              </w:rPr>
+            </w:pPr>
+            <w:ins w:id="91141" w:author="Claude" w:date="2026-10-27T00:00:00Z">
               <w:r>
                 <w:rPr>
                   <w:b/>
@@ -12935,10 +13186,10 @@
             <w:pPr>
               <w:jc w:val="center"/>
               <w:rPr>
-                <w:ins w:id="91114" w:author="Claude" w:date="2026-10-27T00:00:00Z"/>
-              </w:rPr>
-            </w:pPr>
-            <w:ins w:id="91115" w:author="Claude" w:date="2026-10-27T00:00:00Z">
+                <w:ins w:id="91142" w:author="Claude" w:date="2026-10-27T00:00:00Z"/>
+              </w:rPr>
+            </w:pPr>
+            <w:ins w:id="91143" w:author="Claude" w:date="2026-10-27T00:00:00Z">
               <w:r>
                 <w:rPr>
                   <w:b/>
@@ -12967,10 +13218,10 @@
             <w:pPr>
               <w:jc w:val="center"/>
               <w:rPr>
-                <w:ins w:id="91116" w:author="Claude" w:date="2026-10-27T00:00:00Z"/>
-              </w:rPr>
-            </w:pPr>
-            <w:ins w:id="91117" w:author="Claude" w:date="2026-10-27T00:00:00Z">
+                <w:ins w:id="91144" w:author="Claude" w:date="2026-10-27T00:00:00Z"/>
+              </w:rPr>
+            </w:pPr>
+            <w:ins w:id="91145" w:author="Claude" w:date="2026-10-27T00:00:00Z">
               <w:r>
                 <w:rPr>
                   <w:b/>
@@ -12987,7 +13238,7 @@
       <w:tr>
         <w:trPr>
           <w:cantSplit/>
-          <w:ins w:id="91127" w:author="Claude" w:date="2026-10-27T00:00:00Z"/>
+          <w:ins w:id="91155" w:author="Claude" w:date="2026-10-27T00:00:00Z"/>
         </w:trPr>
         <w:tc>
           <w:tcPr>
@@ -13002,10 +13253,10 @@
             <w:pPr>
               <w:jc w:val="left"/>
               <w:rPr>
-                <w:ins w:id="91119" w:author="Claude" w:date="2026-10-27T00:00:00Z"/>
-              </w:rPr>
-            </w:pPr>
-            <w:ins w:id="91120" w:author="Claude" w:date="2026-10-27T00:00:00Z">
+                <w:ins w:id="91147" w:author="Claude" w:date="2026-10-27T00:00:00Z"/>
+              </w:rPr>
+            </w:pPr>
+            <w:ins w:id="91148" w:author="Claude" w:date="2026-10-27T00:00:00Z">
               <w:r>
                 <w:rPr>
                   <w:sz w:val="16"/>
@@ -13029,10 +13280,10 @@
             <w:pPr>
               <w:jc w:val="center"/>
               <w:rPr>
-                <w:ins w:id="91121" w:author="Claude" w:date="2026-10-27T00:00:00Z"/>
-              </w:rPr>
-            </w:pPr>
-            <w:ins w:id="91122" w:author="Claude" w:date="2026-10-27T00:00:00Z">
+                <w:ins w:id="91149" w:author="Claude" w:date="2026-10-27T00:00:00Z"/>
+              </w:rPr>
+            </w:pPr>
+            <w:ins w:id="91150" w:author="Claude" w:date="2026-10-27T00:00:00Z">
               <w:r>
                 <w:rPr>
                   <w:sz w:val="16"/>
@@ -13056,10 +13307,10 @@
             <w:pPr>
               <w:jc w:val="center"/>
               <w:rPr>
-                <w:ins w:id="91123" w:author="Claude" w:date="2026-10-27T00:00:00Z"/>
-              </w:rPr>
-            </w:pPr>
-            <w:ins w:id="91124" w:author="Claude" w:date="2026-10-27T00:00:00Z">
+                <w:ins w:id="91151" w:author="Claude" w:date="2026-10-27T00:00:00Z"/>
+              </w:rPr>
+            </w:pPr>
+            <w:ins w:id="91152" w:author="Claude" w:date="2026-10-27T00:00:00Z">
               <w:r>
                 <w:rPr>
                   <w:sz w:val="16"/>
@@ -13083,10 +13334,10 @@
             <w:pPr>
               <w:jc w:val="center"/>
               <w:rPr>
-                <w:ins w:id="91125" w:author="Claude" w:date="2026-10-27T00:00:00Z"/>
-              </w:rPr>
-            </w:pPr>
-            <w:ins w:id="91126" w:author="Claude" w:date="2026-10-27T00:00:00Z">
+                <w:ins w:id="91153" w:author="Claude" w:date="2026-10-27T00:00:00Z"/>
+              </w:rPr>
+            </w:pPr>
+            <w:ins w:id="91154" w:author="Claude" w:date="2026-10-27T00:00:00Z">
               <w:r>
                 <w:rPr>
                   <w:sz w:val="16"/>
@@ -13101,7 +13352,7 @@
       <w:tr>
         <w:trPr>
           <w:cantSplit/>
-          <w:ins w:id="91136" w:author="Claude" w:date="2026-10-27T00:00:00Z"/>
+          <w:ins w:id="91164" w:author="Claude" w:date="2026-10-27T00:00:00Z"/>
         </w:trPr>
         <w:tc>
           <w:tcPr>
@@ -13116,10 +13367,10 @@
             <w:pPr>
               <w:jc w:val="left"/>
               <w:rPr>
-                <w:ins w:id="91128" w:author="Claude" w:date="2026-10-27T00:00:00Z"/>
-              </w:rPr>
-            </w:pPr>
-            <w:ins w:id="91129" w:author="Claude" w:date="2026-10-27T00:00:00Z">
+                <w:ins w:id="91156" w:author="Claude" w:date="2026-10-27T00:00:00Z"/>
+              </w:rPr>
+            </w:pPr>
+            <w:ins w:id="91157" w:author="Claude" w:date="2026-10-27T00:00:00Z">
               <w:r>
                 <w:rPr>
                   <w:sz w:val="16"/>
@@ -13143,10 +13394,10 @@
             <w:pPr>
               <w:jc w:val="center"/>
               <w:rPr>
-                <w:ins w:id="91130" w:author="Claude" w:date="2026-10-27T00:00:00Z"/>
-              </w:rPr>
-            </w:pPr>
-            <w:ins w:id="91131" w:author="Claude" w:date="2026-10-27T00:00:00Z">
+                <w:ins w:id="91158" w:author="Claude" w:date="2026-10-27T00:00:00Z"/>
+              </w:rPr>
+            </w:pPr>
+            <w:ins w:id="91159" w:author="Claude" w:date="2026-10-27T00:00:00Z">
               <w:r>
                 <w:rPr>
                   <w:sz w:val="16"/>
@@ -13170,10 +13421,10 @@
             <w:pPr>
               <w:jc w:val="center"/>
               <w:rPr>
-                <w:ins w:id="91132" w:author="Claude" w:date="2026-10-27T00:00:00Z"/>
-              </w:rPr>
-            </w:pPr>
-            <w:ins w:id="91133" w:author="Claude" w:date="2026-10-27T00:00:00Z">
+                <w:ins w:id="91160" w:author="Claude" w:date="2026-10-27T00:00:00Z"/>
+              </w:rPr>
+            </w:pPr>
+            <w:ins w:id="91161" w:author="Claude" w:date="2026-10-27T00:00:00Z">
               <w:r>
                 <w:rPr>
                   <w:sz w:val="16"/>
@@ -13197,10 +13448,10 @@
             <w:pPr>
               <w:jc w:val="center"/>
               <w:rPr>
-                <w:ins w:id="91134" w:author="Claude" w:date="2026-10-27T00:00:00Z"/>
-              </w:rPr>
-            </w:pPr>
-            <w:ins w:id="91135" w:author="Claude" w:date="2026-10-27T00:00:00Z">
+                <w:ins w:id="91162" w:author="Claude" w:date="2026-10-27T00:00:00Z"/>
+              </w:rPr>
+            </w:pPr>
+            <w:ins w:id="91163" w:author="Claude" w:date="2026-10-27T00:00:00Z">
               <w:r>
                 <w:rPr>
                   <w:sz w:val="16"/>
@@ -13215,7 +13466,7 @@
       <w:tr>
         <w:trPr>
           <w:cantSplit/>
-          <w:ins w:id="91145" w:author="Claude" w:date="2026-10-27T00:00:00Z"/>
+          <w:ins w:id="91173" w:author="Claude" w:date="2026-10-27T00:00:00Z"/>
         </w:trPr>
         <w:tc>
           <w:tcPr>
@@ -13230,10 +13481,10 @@
             <w:pPr>
               <w:jc w:val="left"/>
               <w:rPr>
-                <w:ins w:id="91137" w:author="Claude" w:date="2026-10-27T00:00:00Z"/>
-              </w:rPr>
-            </w:pPr>
-            <w:ins w:id="91138" w:author="Claude" w:date="2026-10-27T00:00:00Z">
+                <w:ins w:id="91165" w:author="Claude" w:date="2026-10-27T00:00:00Z"/>
+              </w:rPr>
+            </w:pPr>
+            <w:ins w:id="91166" w:author="Claude" w:date="2026-10-27T00:00:00Z">
               <w:r>
                 <w:rPr>
                   <w:sz w:val="16"/>
@@ -13257,10 +13508,10 @@
             <w:pPr>
               <w:jc w:val="center"/>
               <w:rPr>
-                <w:ins w:id="91139" w:author="Claude" w:date="2026-10-27T00:00:00Z"/>
-              </w:rPr>
-            </w:pPr>
-            <w:ins w:id="91140" w:author="Claude" w:date="2026-10-27T00:00:00Z">
+                <w:ins w:id="91167" w:author="Claude" w:date="2026-10-27T00:00:00Z"/>
+              </w:rPr>
+            </w:pPr>
+            <w:ins w:id="91168" w:author="Claude" w:date="2026-10-27T00:00:00Z">
               <w:r>
                 <w:rPr>
                   <w:sz w:val="16"/>
@@ -13284,10 +13535,10 @@
             <w:pPr>
               <w:jc w:val="center"/>
               <w:rPr>
-                <w:ins w:id="91141" w:author="Claude" w:date="2026-10-27T00:00:00Z"/>
-              </w:rPr>
-            </w:pPr>
-            <w:ins w:id="91142" w:author="Claude" w:date="2026-10-27T00:00:00Z">
+                <w:ins w:id="91169" w:author="Claude" w:date="2026-10-27T00:00:00Z"/>
+              </w:rPr>
+            </w:pPr>
+            <w:ins w:id="91170" w:author="Claude" w:date="2026-10-27T00:00:00Z">
               <w:r>
                 <w:rPr>
                   <w:sz w:val="16"/>
@@ -13311,10 +13562,10 @@
             <w:pPr>
               <w:jc w:val="center"/>
               <w:rPr>
-                <w:ins w:id="91143" w:author="Claude" w:date="2026-10-27T00:00:00Z"/>
-              </w:rPr>
-            </w:pPr>
-            <w:ins w:id="91144" w:author="Claude" w:date="2026-10-27T00:00:00Z">
+                <w:ins w:id="91171" w:author="Claude" w:date="2026-10-27T00:00:00Z"/>
+              </w:rPr>
+            </w:pPr>
+            <w:ins w:id="91172" w:author="Claude" w:date="2026-10-27T00:00:00Z">
               <w:r>
                 <w:rPr>
                   <w:sz w:val="16"/>
@@ -13329,7 +13580,7 @@
       <w:tr>
         <w:trPr>
           <w:cantSplit/>
-          <w:ins w:id="91154" w:author="Claude" w:date="2026-10-27T00:00:00Z"/>
+          <w:ins w:id="91182" w:author="Claude" w:date="2026-10-27T00:00:00Z"/>
         </w:trPr>
         <w:tc>
           <w:tcPr>
@@ -13346,10 +13597,10 @@
             <w:pPr>
               <w:jc w:val="left"/>
               <w:rPr>
-                <w:ins w:id="91146" w:author="Claude" w:date="2026-10-27T00:00:00Z"/>
-              </w:rPr>
-            </w:pPr>
-            <w:ins w:id="91147" w:author="Claude" w:date="2026-10-27T00:00:00Z">
+                <w:ins w:id="91174" w:author="Claude" w:date="2026-10-27T00:00:00Z"/>
+              </w:rPr>
+            </w:pPr>
+            <w:ins w:id="91175" w:author="Claude" w:date="2026-10-27T00:00:00Z">
               <w:r>
                 <w:rPr>
                   <w:sz w:val="16"/>
@@ -13375,10 +13626,10 @@
             <w:pPr>
               <w:jc w:val="center"/>
               <w:rPr>
-                <w:ins w:id="91148" w:author="Claude" w:date="2026-10-27T00:00:00Z"/>
-              </w:rPr>
-            </w:pPr>
-            <w:ins w:id="91149" w:author="Claude" w:date="2026-10-27T00:00:00Z">
+                <w:ins w:id="91176" w:author="Claude" w:date="2026-10-27T00:00:00Z"/>
+              </w:rPr>
+            </w:pPr>
+            <w:ins w:id="91177" w:author="Claude" w:date="2026-10-27T00:00:00Z">
               <w:r>
                 <w:rPr>
                   <w:sz w:val="16"/>
@@ -13404,10 +13655,10 @@
             <w:pPr>
               <w:jc w:val="center"/>
               <w:rPr>
-                <w:ins w:id="91150" w:author="Claude" w:date="2026-10-27T00:00:00Z"/>
-              </w:rPr>
-            </w:pPr>
-            <w:ins w:id="91151" w:author="Claude" w:date="2026-10-27T00:00:00Z">
+                <w:ins w:id="91178" w:author="Claude" w:date="2026-10-27T00:00:00Z"/>
+              </w:rPr>
+            </w:pPr>
+            <w:ins w:id="91179" w:author="Claude" w:date="2026-10-27T00:00:00Z">
               <w:r>
                 <w:rPr>
                   <w:sz w:val="16"/>
@@ -13433,10 +13684,10 @@
             <w:pPr>
               <w:jc w:val="center"/>
               <w:rPr>
-                <w:ins w:id="91152" w:author="Claude" w:date="2026-10-27T00:00:00Z"/>
-              </w:rPr>
-            </w:pPr>
-            <w:ins w:id="91153" w:author="Claude" w:date="2026-10-27T00:00:00Z">
+                <w:ins w:id="91180" w:author="Claude" w:date="2026-10-27T00:00:00Z"/>
+              </w:rPr>
+            </w:pPr>
+            <w:ins w:id="91181" w:author="Claude" w:date="2026-10-27T00:00:00Z">
               <w:r>
                 <w:rPr>
                   <w:sz w:val="16"/>
@@ -13455,10 +13706,10 @@
         <w:ind w:firstLine="202"/>
         <w:jc w:val="both"/>
         <w:rPr>
-          <w:ins w:id="91155" w:author="Claude" w:date="2026-10-27T00:00:00Z"/>
-        </w:rPr>
-      </w:pPr>
-      <w:ins w:id="91156" w:author="Claude" w:date="2026-10-27T00:00:00Z">
+          <w:ins w:id="91183" w:author="Claude" w:date="2026-10-27T00:00:00Z"/>
+        </w:rPr>
+      </w:pPr>
+      <w:ins w:id="91184" w:author="Claude" w:date="2026-10-27T00:00:00Z">
         <w:r>
           <w:t xml:space="preserve">Paired on the same cases with exact McNemar tests and Holm's correction, Katyayani is better than every other diagnoser (largest corrected p 2e-07). Neither language model beats the no-learning rule of naming the loudest service. The models are 7 to 8 billion parameters on CPU, run once each; a frontier model behind the same Gateway is the obvious next arm.</w:t>
         </w:r>
@@ -13467,12 +13718,82 @@
     <w:p>
       <w:pPr>
         <w:keepNext/>
+        <w:spacing w:after="60" w:before="120"/>
+        <w:jc w:val="center"/>
+        <w:rPr>
+          <w:ins w:id="91185" w:author="Claude" w:date="2026-10-27T00:00:00Z"/>
+        </w:rPr>
+      </w:pPr>
+      <w:ins w:id="91186" w:author="Claude" w:date="2026-10-27T00:00:00Z">
+        <w:r>
+          <w:drawing>
+            <wp:inline distT="0" distB="0" distL="0" distR="0">
+              <wp:extent cx="3048000" cy="1654629"/>
+              <wp:effectExtent t="0" r="0" b="0" l="0"/>
+              <wp:docPr id="9102" name="Figure 4" descr="RQ5: the share of the 100 pre-declared RCAEval cases in which each diagnoser ranks the injected root service first, with 95% Wilson intervals. The simulator-trained ranker is the RQ6 contrast." title="Figure 4"/>
+              <wp:cNvGraphicFramePr>
+                <a:graphicFrameLocks xmlns:a="http://schemas.openxmlformats.org/drawingml/2006/main" noChangeAspect="1"/>
+              </wp:cNvGraphicFramePr>
+              <a:graphic xmlns:a="http://schemas.openxmlformats.org/drawingml/2006/main">
+                <a:graphicData uri="http://schemas.openxmlformats.org/drawingml/2006/picture">
+                  <pic:pic xmlns:pic="http://schemas.openxmlformats.org/drawingml/2006/picture">
+                    <pic:nvPicPr>
+                      <pic:cNvPr id="0" name="rq5-rca.png" descr=""/>
+                      <pic:cNvPicPr>
+                        <a:picLocks noChangeAspect="1" noChangeArrowheads="1"/>
+                      </pic:cNvPicPr>
+                    </pic:nvPicPr>
+                    <pic:blipFill>
+                      <a:blip r:embed="rIdClaude2" cstate="none"/>
+                      <a:srcRect/>
+                      <a:stretch>
+                        <a:fillRect/>
+                      </a:stretch>
+                    </pic:blipFill>
+                    <pic:spPr bwMode="auto">
+                      <a:xfrm>
+                        <a:off x="0" y="0"/>
+                        <a:ext cx="3048000" cy="1654629"/>
+                      </a:xfrm>
+                      <a:prstGeom prst="rect">
+                        <a:avLst/>
+                      </a:prstGeom>
+                    </pic:spPr>
+                  </pic:pic>
+                </a:graphicData>
+              </a:graphic>
+            </wp:inline>
+          </w:drawing>
+        </w:r>
+      </w:ins>
+    </w:p>
+    <w:p>
+      <w:pPr>
+        <w:spacing w:after="140"/>
+        <w:jc w:val="both"/>
+        <w:rPr>
+          <w:ins w:id="91187" w:author="Claude" w:date="2026-10-27T00:00:00Z"/>
+        </w:rPr>
+      </w:pPr>
+      <w:ins w:id="91188" w:author="Claude" w:date="2026-10-27T00:00:00Z">
+        <w:r>
+          <w:rPr>
+            <w:sz w:val="16"/>
+            <w:szCs w:val="16"/>
+          </w:rPr>
+          <w:t xml:space="preserve">Fig. 4. RQ5: the share of the 100 pre-declared RCAEval cases in which each diagnoser ranks the injected root service first, with 95% Wilson intervals. The simulator-trained ranker is the RQ6 contrast.</w:t>
+        </w:r>
+      </w:ins>
+    </w:p>
+    <w:p>
+      <w:pPr>
+        <w:keepNext/>
         <w:spacing w:after="40" w:before="80"/>
         <w:rPr>
-          <w:ins w:id="91157" w:author="Claude" w:date="2026-10-27T00:00:00Z"/>
-        </w:rPr>
-      </w:pPr>
-      <w:ins w:id="91158" w:author="Claude" w:date="2026-10-27T00:00:00Z">
+          <w:ins w:id="91189" w:author="Claude" w:date="2026-10-27T00:00:00Z"/>
+        </w:rPr>
+      </w:pPr>
+      <w:ins w:id="91190" w:author="Claude" w:date="2026-10-27T00:00:00Z">
         <w:r>
           <w:rPr>
             <w:i/>
@@ -13488,10 +13809,10 @@
         <w:ind w:firstLine="202"/>
         <w:jc w:val="both"/>
         <w:rPr>
-          <w:ins w:id="91159" w:author="Claude" w:date="2026-10-27T00:00:00Z"/>
-        </w:rPr>
-      </w:pPr>
-      <w:ins w:id="91160" w:author="Claude" w:date="2026-10-27T00:00:00Z">
+          <w:ins w:id="91191" w:author="Claude" w:date="2026-10-27T00:00:00Z"/>
+        </w:rPr>
+      </w:pPr>
+      <w:ins w:id="91192" w:author="Claude" w:date="2026-10-27T00:00:00Z">
         <w:r>
           <w:t xml:space="preserve">RQ6 asks whether a root-cause model trained on synthetic incidents works on real ones. The same ranker was trained twice: on 50,000 incidents from the project's simulator, and on real fault injections. It was tested, each system held out in turn, on two RCAEval systems and on a third built for this test: 200 faults injected on a real Kubernetes cluster from a plan committed before any run. The features are the event-level ones the deployed API can compute (Table XIII).</w:t>
         </w:r>
@@ -13503,10 +13824,10 @@
         <w:spacing w:after="0" w:before="160"/>
         <w:jc w:val="center"/>
         <w:rPr>
-          <w:ins w:id="91161" w:author="Claude" w:date="2026-10-27T00:00:00Z"/>
-        </w:rPr>
-      </w:pPr>
-      <w:ins w:id="91162" w:author="Claude" w:date="2026-10-27T00:00:00Z">
+          <w:ins w:id="91193" w:author="Claude" w:date="2026-10-27T00:00:00Z"/>
+        </w:rPr>
+      </w:pPr>
+      <w:ins w:id="91194" w:author="Claude" w:date="2026-10-27T00:00:00Z">
         <w:r>
           <w:rPr>
             <w:smallCaps/>
@@ -13523,10 +13844,10 @@
         <w:spacing w:after="60"/>
         <w:jc w:val="center"/>
         <w:rPr>
-          <w:ins w:id="91163" w:author="Claude" w:date="2026-10-27T00:00:00Z"/>
-        </w:rPr>
-      </w:pPr>
-      <w:ins w:id="91164" w:author="Claude" w:date="2026-10-27T00:00:00Z">
+          <w:ins w:id="91195" w:author="Claude" w:date="2026-10-27T00:00:00Z"/>
+        </w:rPr>
+      </w:pPr>
+      <w:ins w:id="91196" w:author="Claude" w:date="2026-10-27T00:00:00Z">
         <w:r>
           <w:rPr>
             <w:smallCaps/>
@@ -13550,7 +13871,7 @@
       <w:tr>
         <w:trPr>
           <w:cantSplit/>
-          <w:ins w:id="91173" w:author="Claude" w:date="2026-10-27T00:00:00Z"/>
+          <w:ins w:id="91205" w:author="Claude" w:date="2026-10-27T00:00:00Z"/>
         </w:trPr>
         <w:tc>
           <w:tcPr>
@@ -13568,10 +13889,10 @@
             <w:pPr>
               <w:jc w:val="left"/>
               <w:rPr>
-                <w:ins w:id="91165" w:author="Claude" w:date="2026-10-27T00:00:00Z"/>
-              </w:rPr>
-            </w:pPr>
-            <w:ins w:id="91166" w:author="Claude" w:date="2026-10-27T00:00:00Z">
+                <w:ins w:id="91197" w:author="Claude" w:date="2026-10-27T00:00:00Z"/>
+              </w:rPr>
+            </w:pPr>
+            <w:ins w:id="91198" w:author="Claude" w:date="2026-10-27T00:00:00Z">
               <w:r>
                 <w:rPr>
                   <w:b/>
@@ -13600,10 +13921,10 @@
             <w:pPr>
               <w:jc w:val="center"/>
               <w:rPr>
-                <w:ins w:id="91167" w:author="Claude" w:date="2026-10-27T00:00:00Z"/>
-              </w:rPr>
-            </w:pPr>
-            <w:ins w:id="91168" w:author="Claude" w:date="2026-10-27T00:00:00Z">
+                <w:ins w:id="91199" w:author="Claude" w:date="2026-10-27T00:00:00Z"/>
+              </w:rPr>
+            </w:pPr>
+            <w:ins w:id="91200" w:author="Claude" w:date="2026-10-27T00:00:00Z">
               <w:r>
                 <w:rPr>
                   <w:b/>
@@ -13632,10 +13953,10 @@
             <w:pPr>
               <w:jc w:val="center"/>
               <w:rPr>
-                <w:ins w:id="91169" w:author="Claude" w:date="2026-10-27T00:00:00Z"/>
-              </w:rPr>
-            </w:pPr>
-            <w:ins w:id="91170" w:author="Claude" w:date="2026-10-27T00:00:00Z">
+                <w:ins w:id="91201" w:author="Claude" w:date="2026-10-27T00:00:00Z"/>
+              </w:rPr>
+            </w:pPr>
+            <w:ins w:id="91202" w:author="Claude" w:date="2026-10-27T00:00:00Z">
               <w:r>
                 <w:rPr>
                   <w:b/>
@@ -13664,10 +13985,10 @@
             <w:pPr>
               <w:jc w:val="center"/>
               <w:rPr>
-                <w:ins w:id="91171" w:author="Claude" w:date="2026-10-27T00:00:00Z"/>
-              </w:rPr>
-            </w:pPr>
-            <w:ins w:id="91172" w:author="Claude" w:date="2026-10-27T00:00:00Z">
+                <w:ins w:id="91203" w:author="Claude" w:date="2026-10-27T00:00:00Z"/>
+              </w:rPr>
+            </w:pPr>
+            <w:ins w:id="91204" w:author="Claude" w:date="2026-10-27T00:00:00Z">
               <w:r>
                 <w:rPr>
                   <w:b/>
@@ -13684,7 +14005,7 @@
       <w:tr>
         <w:trPr>
           <w:cantSplit/>
-          <w:ins w:id="91182" w:author="Claude" w:date="2026-10-27T00:00:00Z"/>
+          <w:ins w:id="91214" w:author="Claude" w:date="2026-10-27T00:00:00Z"/>
         </w:trPr>
         <w:tc>
           <w:tcPr>
@@ -13699,10 +14020,10 @@
             <w:pPr>
               <w:jc w:val="left"/>
               <w:rPr>
-                <w:ins w:id="91174" w:author="Claude" w:date="2026-10-27T00:00:00Z"/>
-              </w:rPr>
-            </w:pPr>
-            <w:ins w:id="91175" w:author="Claude" w:date="2026-10-27T00:00:00Z">
+                <w:ins w:id="91206" w:author="Claude" w:date="2026-10-27T00:00:00Z"/>
+              </w:rPr>
+            </w:pPr>
+            <w:ins w:id="91207" w:author="Claude" w:date="2026-10-27T00:00:00Z">
               <w:r>
                 <w:rPr>
                   <w:sz w:val="16"/>
@@ -13726,10 +14047,10 @@
             <w:pPr>
               <w:jc w:val="center"/>
               <w:rPr>
-                <w:ins w:id="91176" w:author="Claude" w:date="2026-10-27T00:00:00Z"/>
-              </w:rPr>
-            </w:pPr>
-            <w:ins w:id="91177" w:author="Claude" w:date="2026-10-27T00:00:00Z">
+                <w:ins w:id="91208" w:author="Claude" w:date="2026-10-27T00:00:00Z"/>
+              </w:rPr>
+            </w:pPr>
+            <w:ins w:id="91209" w:author="Claude" w:date="2026-10-27T00:00:00Z">
               <w:r>
                 <w:rPr>
                   <w:sz w:val="16"/>
@@ -13753,10 +14074,10 @@
             <w:pPr>
               <w:jc w:val="center"/>
               <w:rPr>
-                <w:ins w:id="91178" w:author="Claude" w:date="2026-10-27T00:00:00Z"/>
-              </w:rPr>
-            </w:pPr>
-            <w:ins w:id="91179" w:author="Claude" w:date="2026-10-27T00:00:00Z">
+                <w:ins w:id="91210" w:author="Claude" w:date="2026-10-27T00:00:00Z"/>
+              </w:rPr>
+            </w:pPr>
+            <w:ins w:id="91211" w:author="Claude" w:date="2026-10-27T00:00:00Z">
               <w:r>
                 <w:rPr>
                   <w:sz w:val="16"/>
@@ -13780,10 +14101,10 @@
             <w:pPr>
               <w:jc w:val="center"/>
               <w:rPr>
-                <w:ins w:id="91180" w:author="Claude" w:date="2026-10-27T00:00:00Z"/>
-              </w:rPr>
-            </w:pPr>
-            <w:ins w:id="91181" w:author="Claude" w:date="2026-10-27T00:00:00Z">
+                <w:ins w:id="91212" w:author="Claude" w:date="2026-10-27T00:00:00Z"/>
+              </w:rPr>
+            </w:pPr>
+            <w:ins w:id="91213" w:author="Claude" w:date="2026-10-27T00:00:00Z">
               <w:r>
                 <w:rPr>
                   <w:sz w:val="16"/>
@@ -13798,7 +14119,7 @@
       <w:tr>
         <w:trPr>
           <w:cantSplit/>
-          <w:ins w:id="91191" w:author="Claude" w:date="2026-10-27T00:00:00Z"/>
+          <w:ins w:id="91223" w:author="Claude" w:date="2026-10-27T00:00:00Z"/>
         </w:trPr>
         <w:tc>
           <w:tcPr>
@@ -13813,10 +14134,10 @@
             <w:pPr>
               <w:jc w:val="left"/>
               <w:rPr>
-                <w:ins w:id="91183" w:author="Claude" w:date="2026-10-27T00:00:00Z"/>
-              </w:rPr>
-            </w:pPr>
-            <w:ins w:id="91184" w:author="Claude" w:date="2026-10-27T00:00:00Z">
+                <w:ins w:id="91215" w:author="Claude" w:date="2026-10-27T00:00:00Z"/>
+              </w:rPr>
+            </w:pPr>
+            <w:ins w:id="91216" w:author="Claude" w:date="2026-10-27T00:00:00Z">
               <w:r>
                 <w:rPr>
                   <w:sz w:val="16"/>
@@ -13840,10 +14161,10 @@
             <w:pPr>
               <w:jc w:val="center"/>
               <w:rPr>
-                <w:ins w:id="91185" w:author="Claude" w:date="2026-10-27T00:00:00Z"/>
-              </w:rPr>
-            </w:pPr>
-            <w:ins w:id="91186" w:author="Claude" w:date="2026-10-27T00:00:00Z">
+                <w:ins w:id="91217" w:author="Claude" w:date="2026-10-27T00:00:00Z"/>
+              </w:rPr>
+            </w:pPr>
+            <w:ins w:id="91218" w:author="Claude" w:date="2026-10-27T00:00:00Z">
               <w:r>
                 <w:rPr>
                   <w:sz w:val="16"/>
@@ -13867,10 +14188,10 @@
             <w:pPr>
               <w:jc w:val="center"/>
               <w:rPr>
-                <w:ins w:id="91187" w:author="Claude" w:date="2026-10-27T00:00:00Z"/>
-              </w:rPr>
-            </w:pPr>
-            <w:ins w:id="91188" w:author="Claude" w:date="2026-10-27T00:00:00Z">
+                <w:ins w:id="91219" w:author="Claude" w:date="2026-10-27T00:00:00Z"/>
+              </w:rPr>
+            </w:pPr>
+            <w:ins w:id="91220" w:author="Claude" w:date="2026-10-27T00:00:00Z">
               <w:r>
                 <w:rPr>
                   <w:sz w:val="16"/>
@@ -13894,10 +14215,10 @@
             <w:pPr>
               <w:jc w:val="center"/>
               <w:rPr>
-                <w:ins w:id="91189" w:author="Claude" w:date="2026-10-27T00:00:00Z"/>
-              </w:rPr>
-            </w:pPr>
-            <w:ins w:id="91190" w:author="Claude" w:date="2026-10-27T00:00:00Z">
+                <w:ins w:id="91221" w:author="Claude" w:date="2026-10-27T00:00:00Z"/>
+              </w:rPr>
+            </w:pPr>
+            <w:ins w:id="91222" w:author="Claude" w:date="2026-10-27T00:00:00Z">
               <w:r>
                 <w:rPr>
                   <w:sz w:val="16"/>
@@ -13912,7 +14233,7 @@
       <w:tr>
         <w:trPr>
           <w:cantSplit/>
-          <w:ins w:id="91200" w:author="Claude" w:date="2026-10-27T00:00:00Z"/>
+          <w:ins w:id="91232" w:author="Claude" w:date="2026-10-27T00:00:00Z"/>
         </w:trPr>
         <w:tc>
           <w:tcPr>
@@ -13929,10 +14250,10 @@
             <w:pPr>
               <w:jc w:val="left"/>
               <w:rPr>
-                <w:ins w:id="91192" w:author="Claude" w:date="2026-10-27T00:00:00Z"/>
-              </w:rPr>
-            </w:pPr>
-            <w:ins w:id="91193" w:author="Claude" w:date="2026-10-27T00:00:00Z">
+                <w:ins w:id="91224" w:author="Claude" w:date="2026-10-27T00:00:00Z"/>
+              </w:rPr>
+            </w:pPr>
+            <w:ins w:id="91225" w:author="Claude" w:date="2026-10-27T00:00:00Z">
               <w:r>
                 <w:rPr>
                   <w:sz w:val="16"/>
@@ -13958,10 +14279,10 @@
             <w:pPr>
               <w:jc w:val="center"/>
               <w:rPr>
-                <w:ins w:id="91194" w:author="Claude" w:date="2026-10-27T00:00:00Z"/>
-              </w:rPr>
-            </w:pPr>
-            <w:ins w:id="91195" w:author="Claude" w:date="2026-10-27T00:00:00Z">
+                <w:ins w:id="91226" w:author="Claude" w:date="2026-10-27T00:00:00Z"/>
+              </w:rPr>
+            </w:pPr>
+            <w:ins w:id="91227" w:author="Claude" w:date="2026-10-27T00:00:00Z">
               <w:r>
                 <w:rPr>
                   <w:sz w:val="16"/>
@@ -13987,10 +14308,10 @@
             <w:pPr>
               <w:jc w:val="center"/>
               <w:rPr>
-                <w:ins w:id="91196" w:author="Claude" w:date="2026-10-27T00:00:00Z"/>
-              </w:rPr>
-            </w:pPr>
-            <w:ins w:id="91197" w:author="Claude" w:date="2026-10-27T00:00:00Z">
+                <w:ins w:id="91228" w:author="Claude" w:date="2026-10-27T00:00:00Z"/>
+              </w:rPr>
+            </w:pPr>
+            <w:ins w:id="91229" w:author="Claude" w:date="2026-10-27T00:00:00Z">
               <w:r>
                 <w:rPr>
                   <w:sz w:val="16"/>
@@ -14016,10 +14337,10 @@
             <w:pPr>
               <w:jc w:val="center"/>
               <w:rPr>
-                <w:ins w:id="91198" w:author="Claude" w:date="2026-10-27T00:00:00Z"/>
-              </w:rPr>
-            </w:pPr>
-            <w:ins w:id="91199" w:author="Claude" w:date="2026-10-27T00:00:00Z">
+                <w:ins w:id="91230" w:author="Claude" w:date="2026-10-27T00:00:00Z"/>
+              </w:rPr>
+            </w:pPr>
+            <w:ins w:id="91231" w:author="Claude" w:date="2026-10-27T00:00:00Z">
               <w:r>
                 <w:rPr>
                   <w:sz w:val="16"/>
@@ -14038,10 +14359,10 @@
         <w:ind w:firstLine="202"/>
         <w:jc w:val="both"/>
         <w:rPr>
-          <w:ins w:id="91201" w:author="Claude" w:date="2026-10-27T00:00:00Z"/>
-        </w:rPr>
-      </w:pPr>
-      <w:ins w:id="91202" w:author="Claude" w:date="2026-10-27T00:00:00Z">
+          <w:ins w:id="91233" w:author="Claude" w:date="2026-10-27T00:00:00Z"/>
+        </w:rPr>
+      </w:pPr>
+      <w:ins w:id="91234" w:author="Claude" w:date="2026-10-27T00:00:00Z">
         <w:r>
           <w:t xml:space="preserve">The simulator taught topology-first reasoning, and on real faults the culprit is usually the service that moved most. Trained on RCAEval alone, the ranker names the root first in 0.895 of the live-cluster incidents it never saw. Synthetic data is at most an augmentation here, not a substitute. Zero-shot on raw RCAEval series, the simulator-trained ranker scores 0.490 on Online Boutique and 0.265 on Sock Shop.</w:t>
         </w:r>
@@ -14052,10 +14373,10 @@
         <w:keepNext/>
         <w:spacing w:after="40" w:before="80"/>
         <w:rPr>
-          <w:ins w:id="91203" w:author="Claude" w:date="2026-10-27T00:00:00Z"/>
-        </w:rPr>
-      </w:pPr>
-      <w:ins w:id="91204" w:author="Claude" w:date="2026-10-27T00:00:00Z">
+          <w:ins w:id="91235" w:author="Claude" w:date="2026-10-27T00:00:00Z"/>
+        </w:rPr>
+      </w:pPr>
+      <w:ins w:id="91236" w:author="Claude" w:date="2026-10-27T00:00:00Z">
         <w:r>
           <w:rPr>
             <w:i/>
@@ -14071,10 +14392,10 @@
         <w:ind w:firstLine="202"/>
         <w:jc w:val="both"/>
         <w:rPr>
-          <w:ins w:id="91205" w:author="Claude" w:date="2026-10-27T00:00:00Z"/>
-        </w:rPr>
-      </w:pPr>
-      <w:ins w:id="91206" w:author="Claude" w:date="2026-10-27T00:00:00Z">
+          <w:ins w:id="91237" w:author="Claude" w:date="2026-10-27T00:00:00Z"/>
+        </w:rPr>
+      </w:pPr>
+      <w:ins w:id="91238" w:author="Claude" w:date="2026-10-27T00:00:00Z">
         <w:r>
           <w:t xml:space="preserve">How a model is tested decides its headline. On CIC-IDS2017 the intrusion detector scores F1 0.997 on a random split and 0.453 when the test days hold only attack families it never saw. Its operating point mattered more than its architecture: with the threshold set for a 1% false-alarm rate on validation flows, unseen-day F1 rises to 0.604 and recall from 0.294 to 0.448. On log sessions, Kalaratri reaches F1 0.966 on HDFS but 0.355 on BGL, where failures are rarer: one log dataset alone flatters the task.</w:t>
         </w:r>
@@ -14086,10 +14407,10 @@
         <w:ind w:firstLine="202"/>
         <w:jc w:val="both"/>
         <w:rPr>
-          <w:ins w:id="91207" w:author="Claude" w:date="2026-10-27T00:00:00Z"/>
-        </w:rPr>
-      </w:pPr>
-      <w:ins w:id="91208" w:author="Claude" w:date="2026-10-27T00:00:00Z">
+          <w:ins w:id="91239" w:author="Claude" w:date="2026-10-27T00:00:00Z"/>
+        </w:rPr>
+      </w:pPr>
+      <w:ins w:id="91240" w:author="Claude" w:date="2026-10-27T00:00:00Z">
         <w:r>
           <w:t xml:space="preserve">Kushmanda, a 17M-parameter language model trained from scratch, answers from retrieved passages well (ROUGE-L 0.938 on required actions) and declines on 0.543 of questions no passage answers, but copies an exact technique identifier on only 0.528 of lookups. Constrained decoding makes every output valid and raises that to 0.604. In the system, identifiers come from retrieval and the model writes around them.</w:t>
         </w:r>
@@ -14100,10 +14421,10 @@
         <w:keepNext/>
         <w:spacing w:after="40" w:before="80"/>
         <w:rPr>
-          <w:ins w:id="91209" w:author="Claude" w:date="2026-10-27T00:00:00Z"/>
-        </w:rPr>
-      </w:pPr>
-      <w:ins w:id="91210" w:author="Claude" w:date="2026-10-27T00:00:00Z">
+          <w:ins w:id="91241" w:author="Claude" w:date="2026-10-27T00:00:00Z"/>
+        </w:rPr>
+      </w:pPr>
+      <w:ins w:id="91242" w:author="Claude" w:date="2026-10-27T00:00:00Z">
         <w:r>
           <w:rPr>
             <w:i/>
@@ -14119,10 +14440,10 @@
         <w:ind w:firstLine="202"/>
         <w:jc w:val="both"/>
         <w:rPr>
-          <w:ins w:id="91211" w:author="Claude" w:date="2026-10-27T00:00:00Z"/>
-        </w:rPr>
-      </w:pPr>
-      <w:ins w:id="91212" w:author="Claude" w:date="2026-10-27T00:00:00Z">
+          <w:ins w:id="91243" w:author="Claude" w:date="2026-10-27T00:00:00Z"/>
+        </w:rPr>
+      </w:pPr>
+      <w:ins w:id="91244" w:author="Claude" w:date="2026-10-27T00:00:00Z">
         <w:r>
           <w:t xml:space="preserve">A model is evidence only if the deployed model is the evaluated one. The five gradient-boosted models are exported as JSON and scored in plain Python in the API, with a test that the scores equal LightGBM's, missing values included; the embedding models are served from int8 weights checked to rank as the trained ones did. The live examples a visitor can run are held out from training. Serving also exposed a failure the held-out score did not: asked in a user's words how to defend against ransomware encrypting file shares, the mitigation model recommended one wrong defence, while the retrieval model read the question correctly as Data Encrypted for Impact (T1486). The deployed system now chains them, so every recommendation traces to a cited technique.</w:t>
         </w:r>
@@ -14130,6 +14451,21 @@
     </w:p>
     <w:p>
       <w:pPr>
+        <w:spacing w:after="0" w:line="240"/>
+        <w:ind w:firstLine="202"/>
+        <w:jc w:val="both"/>
+        <w:rPr>
+          <w:ins w:id="91245" w:author="Claude" w:date="2026-10-27T00:00:00Z"/>
+        </w:rPr>
+      </w:pPr>
+      <w:ins w:id="91246" w:author="Claude" w:date="2026-10-27T00:00:00Z">
+        <w:r>
+          <w:t xml:space="preserve">Kalaratri and Chandraghanta run live on held-out test examples, with the truth shown beside each answer. Kalaratri is right on 24 of 24 log sessions. Chandraghanta is right on 11 of 16 flows from the unseen days, two per family; the families it misses on the test days it also misses live. Both are trained on research-use-only data and are served for research use only.</w:t>
+        </w:r>
+      </w:ins>
+    </w:p>
+    <w:p>
+      <w:pPr>
         <w:keepNext/>
         <w:spacing w:after="80" w:before="160"/>
         <w:jc w:val="center"/>
@@ -14177,10 +14513,10 @@
         <w:ind w:firstLine="202"/>
         <w:jc w:val="both"/>
         <w:rPr>
-          <w:ins w:id="91213" w:author="Claude" w:date="2026-10-27T00:00:00Z"/>
-        </w:rPr>
-      </w:pPr>
-      <w:ins w:id="91214" w:author="Claude" w:date="2026-10-27T00:00:00Z">
+          <w:ins w:id="91247" w:author="Claude" w:date="2026-10-27T00:00:00Z"/>
+        </w:rPr>
+      </w:pPr>
+      <w:ins w:id="91248" w:author="Claude" w:date="2026-10-27T00:00:00Z">
         <w:r>
           <w:t xml:space="preserve">The project's own models add a second, measured claim. On a benchmark it did not write, a small ranker trained on real incidents outperforms two general language models given identical evidence (RQ5), and a simulator, however carefully built, was no substitute for real data (RQ6). The models that did not earn a decision on their own are reported with the same prominence and remain advisory.</w:t>
         </w:r>
@@ -14324,12 +14660,12 @@
         <w:ind w:firstLine="202"/>
         <w:jc w:val="both"/>
         <w:rPr>
-          <w:ins w:id="91215" w:author="Claude" w:date="2026-10-27T00:00:00Z"/>
-        </w:rPr>
-      </w:pPr>
-      <w:ins w:id="91216" w:author="Claude" w:date="2026-10-27T00:00:00Z">
+          <w:ins w:id="91249" w:author="Claude" w:date="2026-10-27T00:00:00Z"/>
+        </w:rPr>
+      </w:pPr>
+      <w:ins w:id="91250" w:author="Claude" w:date="2026-10-27T00:00:00Z">
         <w:r>
-          <w:t xml:space="preserve">The models carry their own threats. A plain TF-IDF and logistic regression baseline, added after the public notebooks found it, scores R@1 0.646 against Brahmacharini's 0.614; a neural model is worth serving only where it beats the strongest simple baseline. Bigger was not better: a 20M-parameter transformer encoder trained from scratch on the same split reached R@1 0.391, against 0.614 for the bag-of-words encoder that is served. Gradient-boosted results move by a few hundredths between CI machines, so they are reported with seed spreads where it matters. The live cluster's steady load leaves near-flat baselines, and its 200 incidents were built by the same project; RCAEval is the independent check.</w:t>
+          <w:t xml:space="preserve">The models carry their own threats. A plain TF-IDF and logistic regression baseline, added after the public notebooks found it, scores R@1 0.646 against Brahmacharini's 0.614 and hit@1 0.827 against Skandamata's 0.792; a neural model is worth serving only where it beats the strongest simple baseline. Bigger was not better: a 20M-parameter transformer encoder trained from scratch on the same split reached R@1 0.391, against 0.614 for the bag-of-words encoder that is served. Gradient-boosted results move by a few hundredths between CI machines, so they are reported with seed spreads where it matters. The live cluster's steady load leaves near-flat baselines, and its 200 incidents were built by the same project; RCAEval is the independent check.</w:t>
         </w:r>
       </w:ins>
     </w:p>
@@ -14395,10 +14731,10 @@
         <w:ind w:firstLine="202"/>
         <w:jc w:val="both"/>
         <w:rPr>
-          <w:ins w:id="91217" w:author="Claude" w:date="2026-10-27T00:00:00Z"/>
-        </w:rPr>
-      </w:pPr>
-      <w:ins w:id="91218" w:author="Claude" w:date="2026-10-27T00:00:00Z">
+          <w:ins w:id="91251" w:author="Claude" w:date="2026-10-27T00:00:00Z"/>
+        </w:rPr>
+      </w:pPr>
+      <w:ins w:id="91252" w:author="Claude" w:date="2026-10-27T00:00:00Z">
         <w:r>
           <w:t xml:space="preserve">Part of that work is now done. Root-cause accuracy has been measured on an external benchmark against real language models (RQ5), and sim-to-real on three systems (RQ6). What remains is the 20 labelled PIB incidents with answer keys written before any run, the head-to-head on them at N ≥ 3, and the escalation analysis they make possible.</w:t>
         </w:r>
@@ -14433,10 +14769,10 @@
         <w:ind w:firstLine="202"/>
         <w:jc w:val="both"/>
         <w:rPr>
-          <w:ins w:id="91219" w:author="Claude" w:date="2026-10-27T00:00:00Z"/>
-        </w:rPr>
-      </w:pPr>
-      <w:ins w:id="91220" w:author="Claude" w:date="2026-10-27T00:00:00Z">
+          <w:ins w:id="91253" w:author="Claude" w:date="2026-10-27T00:00:00Z"/>
+        </w:rPr>
+      </w:pPr>
+      <w:ins w:id="91254" w:author="Claude" w:date="2026-10-27T00:00:00Z">
         <w:r>
           <w:t xml:space="preserve">The nine models, their datasets and a reproducing notebook for each are published on Kaggle under the owner preetraval4518071604; models trained on research-use-only data are released for research use only.</w:t>
         </w:r>

</xml_diff>

<commit_message>
feat(api): answer 'which technique is this?' from the fused Brahmacharini ranking; defences keep retrieval
The fused ranking misread a defence question (file shares -> Network Share Discovery), so it serves only the
behaviour-description task it was measured on. Card, PAPER 7.4 and the IEEE paper record the served-design result.

Co-Authored-By: Claude Opus 5.5 <noreply@anthropic.com>
</commit_message>
<xml_diff>
--- a/docs/research/Pashupatastra IEEE Paper.docx
+++ b/docs/research/Pashupatastra IEEE Paper.docx
@@ -86,7 +86,7 @@
         </w:rPr>
         <w:t xml:space="preserve">Language models can now read a security incident and suggest a fix in seconds. That is useful, and it is also the problem, because a confident wrong fix runs just as smoothly as a right one. This paper presents Pashupatastra, an implemented and publicly deployed system that carries security and infrastructure incidents through observation, correlation, diagnosis, authorization, execution and verification, and that keeps the language model out of the authorization step entirely. Its investigation agent, Sati, may only propose actions from a closed registry and may only cite records the system actually retrieved; citations are checked by exact match, and an answer with no valid citation is withheld. A deterministic policy engine prices each proposed action from a declared base risk plus context penalties that can only raise it, maps the price to one of four autonomy tiers, and issues a short lived verdict without which nothing executes. Every action declares its rollback and expected post state, and verification checks that state across a window of samples. I also introduce PIB, a 104 scenario benchmark that includes cases where the correct response is to do nothing or to hand off, and report four evaluations. On the 31 scenarios that run on the reference cluster, the architecture executed no incorrect action, where a threshold runbook got 6 of its 11 wrong, but it escalated every remediation case. Across all 104 scenarios, no forbidden action was scored autonomous in any of three contexts. In 147 turns where an attacker wrote every byte of the model output, nothing executed and every fabricated citation was caught. Against three local open weight models under indirect prompt injection, 216 attack turns produced no harmful proposal and no execution, though the payloads also failed against the models themselves. The results support a claim about containment, not about competence: diagnosis accuracy remains unmeasured, and the paper says why.</w:t>
       </w:r>
-      <w:ins w:id="91255" w:author="Claude" w:date="2026-10-27T00:00:00Z">
+      <w:ins w:id="91257" w:author="Claude" w:date="2026-10-27T00:00:00Z">
         <w:r>
           <w:t xml:space="preserve"> The nine models Sati runs on are trained in the project itself. On a pre-declared sample of an external root-cause benchmark, the project's ranker names the root first in 0.940 of cases, against 0.550 and 0.510 for two general language models given the same evidence.</w:t>
         </w:r>
@@ -14460,6 +14460,21 @@
       </w:pPr>
       <w:ins w:id="91246" w:author="Claude" w:date="2026-10-27T00:00:00Z">
         <w:r>
+          <w:t xml:space="preserve">The served retriever is smaller than the evaluated one, so its design was measured too: trained on the training sources and quantised as served, it ranks the right technique first for 0.556 of held-out behaviours, against 0.614 for the full model. Fused with the TF-IDF classifier pruned to 400 int8 weights per technique, it reaches 0.650, and the API answers "which technique is this?" from it. It does not pick the technique whose defences are listed: asked how to defend against ransomware encrypting file shares, it put Network Share Discovery first, where retrieval names Data Encrypted for Impact.</w:t>
+        </w:r>
+      </w:ins>
+    </w:p>
+    <w:p>
+      <w:pPr>
+        <w:spacing w:after="0" w:line="240"/>
+        <w:ind w:firstLine="202"/>
+        <w:jc w:val="both"/>
+        <w:rPr>
+          <w:ins w:id="91247" w:author="Claude" w:date="2026-10-27T00:00:00Z"/>
+        </w:rPr>
+      </w:pPr>
+      <w:ins w:id="91248" w:author="Claude" w:date="2026-10-27T00:00:00Z">
+        <w:r>
           <w:t xml:space="preserve">Kalaratri and Chandraghanta run live on held-out test examples, with the truth shown beside each answer. Kalaratri is right on 24 of 24 log sessions. Chandraghanta is right on 11 of 16 flows from the unseen days, two per family; the families it misses on the test days it also misses live. Both are trained on research-use-only data and are served for research use only.</w:t>
         </w:r>
       </w:ins>
@@ -14513,10 +14528,10 @@
         <w:ind w:firstLine="202"/>
         <w:jc w:val="both"/>
         <w:rPr>
-          <w:ins w:id="91247" w:author="Claude" w:date="2026-10-27T00:00:00Z"/>
-        </w:rPr>
-      </w:pPr>
-      <w:ins w:id="91248" w:author="Claude" w:date="2026-10-27T00:00:00Z">
+          <w:ins w:id="91249" w:author="Claude" w:date="2026-10-27T00:00:00Z"/>
+        </w:rPr>
+      </w:pPr>
+      <w:ins w:id="91250" w:author="Claude" w:date="2026-10-27T00:00:00Z">
         <w:r>
           <w:t xml:space="preserve">The project's own models add a second, measured claim. On a benchmark it did not write, a small ranker trained on real incidents outperforms two general language models given identical evidence (RQ5), and a simulator, however carefully built, was no substitute for real data (RQ6). The models that did not earn a decision on their own are reported with the same prominence and remain advisory.</w:t>
         </w:r>
@@ -14660,10 +14675,10 @@
         <w:ind w:firstLine="202"/>
         <w:jc w:val="both"/>
         <w:rPr>
-          <w:ins w:id="91249" w:author="Claude" w:date="2026-10-27T00:00:00Z"/>
-        </w:rPr>
-      </w:pPr>
-      <w:ins w:id="91250" w:author="Claude" w:date="2026-10-27T00:00:00Z">
+          <w:ins w:id="91251" w:author="Claude" w:date="2026-10-27T00:00:00Z"/>
+        </w:rPr>
+      </w:pPr>
+      <w:ins w:id="91252" w:author="Claude" w:date="2026-10-27T00:00:00Z">
         <w:r>
           <w:t xml:space="preserve">The models carry their own threats. A plain TF-IDF and logistic regression baseline, added after the public notebooks found it, scores R@1 0.646 against Brahmacharini's 0.614 and hit@1 0.827 against Skandamata's 0.792; fusing it with Brahmacharini, with the weight chosen on validation sources, reaches R@1 0.673; a neural model is worth serving only where it beats the strongest simple baseline. Bigger was not better: a 20M-parameter transformer encoder trained from scratch on the same split reached R@1 0.391, against 0.614 for the bag-of-words encoder that is served. Gradient-boosted results move by a few hundredths between CI machines, so they are reported with seed spreads where it matters. The live cluster's steady load leaves near-flat baselines, and its 200 incidents were built by the same project; RCAEval is the independent check.</w:t>
         </w:r>
@@ -14731,10 +14746,10 @@
         <w:ind w:firstLine="202"/>
         <w:jc w:val="both"/>
         <w:rPr>
-          <w:ins w:id="91251" w:author="Claude" w:date="2026-10-27T00:00:00Z"/>
-        </w:rPr>
-      </w:pPr>
-      <w:ins w:id="91252" w:author="Claude" w:date="2026-10-27T00:00:00Z">
+          <w:ins w:id="91253" w:author="Claude" w:date="2026-10-27T00:00:00Z"/>
+        </w:rPr>
+      </w:pPr>
+      <w:ins w:id="91254" w:author="Claude" w:date="2026-10-27T00:00:00Z">
         <w:r>
           <w:t xml:space="preserve">Part of that work is now done. Root-cause accuracy has been measured on an external benchmark against real language models (RQ5), and sim-to-real on three systems (RQ6). What remains is the 20 labelled PIB incidents with answer keys written before any run, the head-to-head on them at N ≥ 3, and the escalation analysis they make possible.</w:t>
         </w:r>
@@ -14769,10 +14784,10 @@
         <w:ind w:firstLine="202"/>
         <w:jc w:val="both"/>
         <w:rPr>
-          <w:ins w:id="91253" w:author="Claude" w:date="2026-10-27T00:00:00Z"/>
-        </w:rPr>
-      </w:pPr>
-      <w:ins w:id="91254" w:author="Claude" w:date="2026-10-27T00:00:00Z">
+          <w:ins w:id="91255" w:author="Claude" w:date="2026-10-27T00:00:00Z"/>
+        </w:rPr>
+      </w:pPr>
+      <w:ins w:id="91256" w:author="Claude" w:date="2026-10-27T00:00:00Z">
         <w:r>
           <w:t xml:space="preserve">The nine models, their datasets and a reproducing notebook for each are published on Kaggle under the owner preetraval4518071604; models trained on research-use-only data are released for research use only.</w:t>
         </w:r>

</xml_diff>

<commit_message>
docs(paper): IEEE paper refreshed to run 40800238527 (tracked changes)
Co-Authored-By: Claude Opus 5.5 <noreply@anthropic.com>
</commit_message>
<xml_diff>
--- a/docs/research/Pashupatastra IEEE Paper.docx
+++ b/docs/research/Pashupatastra IEEE Paper.docx
@@ -4821,7 +4821,7 @@
                   <w:sz w:val="16"/>
                   <w:szCs w:val="16"/>
                 </w:rPr>
-                <w:t xml:space="preserve">hit@1 0.792</w:t>
+                <w:t xml:space="preserve">hit@1 0.787</w:t>
               </w:r>
             </w:ins>
           </w:p>
@@ -5163,7 +5163,7 @@
                   <w:sz w:val="16"/>
                   <w:szCs w:val="16"/>
                 </w:rPr>
-                <w:t xml:space="preserve">early 0.021, confirmed 0.092</w:t>
+                <w:t xml:space="preserve">early 0.021, confirmed 0.095</w:t>
               </w:r>
             </w:ins>
           </w:p>
@@ -14170,7 +14170,7 @@
                   <w:sz w:val="16"/>
                   <w:szCs w:val="16"/>
                 </w:rPr>
-                <w:t xml:space="preserve">0.845</w:t>
+                <w:t xml:space="preserve">0.849</w:t>
               </w:r>
             </w:ins>
           </w:p>
@@ -14680,7 +14680,7 @@
       </w:pPr>
       <w:ins w:id="91252" w:author="Claude" w:date="2026-10-27T00:00:00Z">
         <w:r>
-          <w:t xml:space="preserve">The models carry their own threats. A plain TF-IDF and logistic regression baseline, added after the public notebooks found it, scores R@1 0.646 against Brahmacharini's 0.614 and hit@1 0.827 against Skandamata's 0.792; fusing it with Brahmacharini, with the weight chosen on validation sources, reaches R@1 0.673; a neural model is worth serving only where it beats the strongest simple baseline. Bigger was not better: a 20M-parameter transformer encoder trained from scratch on the same split reached R@1 0.391, against 0.614 for the bag-of-words encoder that is served. Gradient-boosted results move by a few hundredths between CI machines, so they are reported with seed spreads where it matters. The live cluster's steady load leaves near-flat baselines, and its 200 incidents were built by the same project; RCAEval is the independent check.</w:t>
+          <w:t xml:space="preserve">The models carry their own threats. A plain TF-IDF and logistic regression baseline, added after the public notebooks found it, scores R@1 0.646 against Brahmacharini's 0.614 and hit@1 0.827 against Skandamata's 0.787; fusing it with Brahmacharini, with the weight chosen on validation sources, reaches R@1 0.673; a neural model is worth serving only where it beats the strongest simple baseline. Bigger was not better: a 20M-parameter transformer encoder trained from scratch on the same split reached R@1 0.391, against 0.614 for the bag-of-words encoder that is served. Gradient-boosted results move by a few hundredths between CI machines, so they are reported with seed spreads where it matters. The live cluster's steady load leaves near-flat baselines, and its 200 incidents were built by the same project; RCAEval is the independent check.</w:t>
         </w:r>
       </w:ins>
     </w:p>

</xml_diff>

<commit_message>
docs(paper): IEEE paper refreshed to the latest runs (tracked changes)
Co-Authored-By: Claude Opus 5.5 <noreply@anthropic.com>
</commit_message>
<xml_diff>
--- a/docs/research/Pashupatastra IEEE Paper.docx
+++ b/docs/research/Pashupatastra IEEE Paper.docx
@@ -5283,7 +5283,7 @@
                   <w:sz w:val="16"/>
                   <w:szCs w:val="16"/>
                 </w:rPr>
-                <w:t xml:space="preserve">F1 0.534, 47.9 FA/1k</w:t>
+                <w:t xml:space="preserve">F1 0.537, 47.8 FA/1k</w:t>
               </w:r>
             </w:ins>
           </w:p>
@@ -5312,7 +5312,7 @@
                   <w:sz w:val="16"/>
                   <w:szCs w:val="16"/>
                 </w:rPr>
-                <w:t xml:space="preserve">Shailaputri 0.530, 4.0</w:t>
+                <w:t xml:space="preserve">Shailaputri 0.539, 3.8</w:t>
               </w:r>
             </w:ins>
           </w:p>

</xml_diff>

<commit_message>
docs(paper): serving rules (gated by the run's own measurement; every live verdict says why) in PAPER 7.4 and the IEEE paper; Shailaputri NAB to the 0.2.0 retrain
Co-Authored-By: Claude Opus 5.5 <noreply@anthropic.com>
</commit_message>
<xml_diff>
--- a/docs/research/Pashupatastra IEEE Paper.docx
+++ b/docs/research/Pashupatastra IEEE Paper.docx
@@ -86,7 +86,7 @@
         </w:rPr>
         <w:t xml:space="preserve">Language models can now read a security incident and suggest a fix in seconds. That is useful, and it is also the problem, because a confident wrong fix runs just as smoothly as a right one. This paper presents Pashupatastra, an implemented and publicly deployed system that carries security and infrastructure incidents through observation, correlation, diagnosis, authorization, execution and verification, and that keeps the language model out of the authorization step entirely. Its investigation agent, Sati, may only propose actions from a closed registry and may only cite records the system actually retrieved; citations are checked by exact match, and an answer with no valid citation is withheld. A deterministic policy engine prices each proposed action from a declared base risk plus context penalties that can only raise it, maps the price to one of four autonomy tiers, and issues a short lived verdict without which nothing executes. Every action declares its rollback and expected post state, and verification checks that state across a window of samples. I also introduce PIB, a 104 scenario benchmark that includes cases where the correct response is to do nothing or to hand off, and report four evaluations. On the 31 scenarios that run on the reference cluster, the architecture executed no incorrect action, where a threshold runbook got 6 of its 11 wrong, but it escalated every remediation case. Across all 104 scenarios, no forbidden action was scored autonomous in any of three contexts. In 147 turns where an attacker wrote every byte of the model output, nothing executed and every fabricated citation was caught. Against three local open weight models under indirect prompt injection, 216 attack turns produced no harmful proposal and no execution, though the payloads also failed against the models themselves. The results support a claim about containment, not about competence: diagnosis accuracy remains unmeasured, and the paper says why.</w:t>
       </w:r>
-      <w:ins w:id="91257" w:author="Claude" w:date="2026-10-27T00:00:00Z">
+      <w:ins w:id="91259" w:author="Claude" w:date="2026-10-27T00:00:00Z">
         <w:r>
           <w:t xml:space="preserve"> The nine models Sati runs on are trained in the project itself. On a pre-declared sample of an external root-cause benchmark, the project's ranker names the root first in 0.940 of cases, against 0.550 and 0.510 for two general language models given the same evidence.</w:t>
         </w:r>
@@ -14170,7 +14170,7 @@
                   <w:sz w:val="16"/>
                   <w:szCs w:val="16"/>
                 </w:rPr>
-                <w:t xml:space="preserve">0.849</w:t>
+                <w:t xml:space="preserve">0.845</w:t>
               </w:r>
             </w:ins>
           </w:p>
@@ -14475,6 +14475,21 @@
       </w:pPr>
       <w:ins w:id="91248" w:author="Claude" w:date="2026-10-27T00:00:00Z">
         <w:r>
+          <w:t xml:space="preserve">Two rules keep what is served honest. A model is served only where its own training run measured it better: the export of Skandamata's TF-IDF classifier carries a flag set from that run's held-out comparison, and the API orders mitigations by it only when the flag is set. And every live verdict says why: for the tree models, each present feature is set to missing in turn and the change in log-odds is reported, which needs no internal model state. Features that matter only together can each look small, and the interface says so.</w:t>
+        </w:r>
+      </w:ins>
+    </w:p>
+    <w:p>
+      <w:pPr>
+        <w:spacing w:after="0" w:line="240"/>
+        <w:ind w:firstLine="202"/>
+        <w:jc w:val="both"/>
+        <w:rPr>
+          <w:ins w:id="91249" w:author="Claude" w:date="2026-10-27T00:00:00Z"/>
+        </w:rPr>
+      </w:pPr>
+      <w:ins w:id="91250" w:author="Claude" w:date="2026-10-27T00:00:00Z">
+        <w:r>
           <w:t xml:space="preserve">Kalaratri and Chandraghanta run live on held-out test examples, with the truth shown beside each answer. Kalaratri is right on 24 of 24 log sessions. Chandraghanta is right on 11 of 16 flows from the unseen days, two per family; the families it misses on the test days it also misses live. Both are trained on research-use-only data and are served for research use only.</w:t>
         </w:r>
       </w:ins>
@@ -14528,10 +14543,10 @@
         <w:ind w:firstLine="202"/>
         <w:jc w:val="both"/>
         <w:rPr>
-          <w:ins w:id="91249" w:author="Claude" w:date="2026-10-27T00:00:00Z"/>
-        </w:rPr>
-      </w:pPr>
-      <w:ins w:id="91250" w:author="Claude" w:date="2026-10-27T00:00:00Z">
+          <w:ins w:id="91251" w:author="Claude" w:date="2026-10-27T00:00:00Z"/>
+        </w:rPr>
+      </w:pPr>
+      <w:ins w:id="91252" w:author="Claude" w:date="2026-10-27T00:00:00Z">
         <w:r>
           <w:t xml:space="preserve">The project's own models add a second, measured claim. On a benchmark it did not write, a small ranker trained on real incidents outperforms two general language models given identical evidence (RQ5), and a simulator, however carefully built, was no substitute for real data (RQ6). The models that did not earn a decision on their own are reported with the same prominence and remain advisory.</w:t>
         </w:r>
@@ -14675,10 +14690,10 @@
         <w:ind w:firstLine="202"/>
         <w:jc w:val="both"/>
         <w:rPr>
-          <w:ins w:id="91251" w:author="Claude" w:date="2026-10-27T00:00:00Z"/>
-        </w:rPr>
-      </w:pPr>
-      <w:ins w:id="91252" w:author="Claude" w:date="2026-10-27T00:00:00Z">
+          <w:ins w:id="91253" w:author="Claude" w:date="2026-10-27T00:00:00Z"/>
+        </w:rPr>
+      </w:pPr>
+      <w:ins w:id="91254" w:author="Claude" w:date="2026-10-27T00:00:00Z">
         <w:r>
           <w:t xml:space="preserve">The models carry their own threats. A plain TF-IDF and logistic regression baseline, added after the public notebooks found it, scores R@1 0.646 against Brahmacharini's 0.614 and hit@1 0.827 against Skandamata's 0.787; fusing it with Brahmacharini, with the weight chosen on validation sources, reaches R@1 0.673; a neural model is worth serving only where it beats the strongest simple baseline. Bigger was not better: a 20M-parameter transformer encoder trained from scratch on the same split reached R@1 0.391, against 0.614 for the bag-of-words encoder that is served. Gradient-boosted results move by a few hundredths between CI machines, so they are reported with seed spreads where it matters. The live cluster's steady load leaves near-flat baselines, and its 200 incidents were built by the same project; RCAEval is the independent check.</w:t>
         </w:r>
@@ -14746,10 +14761,10 @@
         <w:ind w:firstLine="202"/>
         <w:jc w:val="both"/>
         <w:rPr>
-          <w:ins w:id="91253" w:author="Claude" w:date="2026-10-27T00:00:00Z"/>
-        </w:rPr>
-      </w:pPr>
-      <w:ins w:id="91254" w:author="Claude" w:date="2026-10-27T00:00:00Z">
+          <w:ins w:id="91255" w:author="Claude" w:date="2026-10-27T00:00:00Z"/>
+        </w:rPr>
+      </w:pPr>
+      <w:ins w:id="91256" w:author="Claude" w:date="2026-10-27T00:00:00Z">
         <w:r>
           <w:t xml:space="preserve">Part of that work is now done. Root-cause accuracy has been measured on an external benchmark against real language models (RQ5), and sim-to-real on three systems (RQ6). What remains is the 20 labelled PIB incidents with answer keys written before any run, the head-to-head on them at N ≥ 3, and the escalation analysis they make possible.</w:t>
         </w:r>
@@ -14784,10 +14799,10 @@
         <w:ind w:firstLine="202"/>
         <w:jc w:val="both"/>
         <w:rPr>
-          <w:ins w:id="91255" w:author="Claude" w:date="2026-10-27T00:00:00Z"/>
-        </w:rPr>
-      </w:pPr>
-      <w:ins w:id="91256" w:author="Claude" w:date="2026-10-27T00:00:00Z">
+          <w:ins w:id="91257" w:author="Claude" w:date="2026-10-27T00:00:00Z"/>
+        </w:rPr>
+      </w:pPr>
+      <w:ins w:id="91258" w:author="Claude" w:date="2026-10-27T00:00:00Z">
         <w:r>
           <w:t xml:space="preserve">The nine models, their datasets and a reproducing notebook for each are published on Kaggle under the owner preetraval4518071604; models trained on research-use-only data are released for research use only.</w:t>
         </w:r>

</xml_diff>

<commit_message>
feat(web): specialist answers drawn as verdicts; docs to the 0.2.0 retrain
A run on held-out data in Sati AI now opens with a picture of its verdict:
score against threshold for Kalaratri and Chandraghanta (probabilities on
log-odds), Katyayani's top five with the true root marked, and the incident
minute by minute for the server models. Every value is the live response's.

The retrain moved Skandamata (0.790, fused 0.824) and Shailaputri on NAB
(0.430 [0.394, 0.474]); cards, PAPER.md, the Kaggle text and the IEEE paper
match again. RP-94.

Co-Authored-By: Claude Opus 5.5 <noreply@anthropic.com>
</commit_message>
<xml_diff>
--- a/docs/research/Pashupatastra IEEE Paper.docx
+++ b/docs/research/Pashupatastra IEEE Paper.docx
@@ -4821,7 +4821,7 @@
                   <w:sz w:val="16"/>
                   <w:szCs w:val="16"/>
                 </w:rPr>
-                <w:t xml:space="preserve">hit@1 0.787</w:t>
+                <w:t xml:space="preserve">hit@1 0.790</w:t>
               </w:r>
             </w:ins>
           </w:p>
@@ -14695,7 +14695,7 @@
       </w:pPr>
       <w:ins w:id="91254" w:author="Claude" w:date="2026-10-27T00:00:00Z">
         <w:r>
-          <w:t xml:space="preserve">The models carry their own threats. A plain TF-IDF and logistic regression baseline, added after the public notebooks found it, scores R@1 0.646 against Brahmacharini's 0.614 and hit@1 0.827 against Skandamata's 0.787; fusing it with Brahmacharini, with the weight chosen on validation sources, reaches R@1 0.673; a neural model is worth serving only where it beats the strongest simple baseline. Bigger was not better: a 20M-parameter transformer encoder trained from scratch on the same split reached R@1 0.391, against 0.614 for the bag-of-words encoder that is served. Gradient-boosted results move by a few hundredths between CI machines, so they are reported with seed spreads where it matters. The live cluster's steady load leaves near-flat baselines, and its 200 incidents were built by the same project; RCAEval is the independent check.</w:t>
+          <w:t xml:space="preserve">The models carry their own threats. A plain TF-IDF and logistic regression baseline, added after the public notebooks found it, scores R@1 0.646 against Brahmacharini's 0.614 and hit@1 0.827 against Skandamata's 0.790; fusing it with Brahmacharini, with the weight chosen on validation sources, reaches R@1 0.673; a neural model is worth serving only where it beats the strongest simple baseline. Bigger was not better: a 20M-parameter transformer encoder trained from scratch on the same split reached R@1 0.391, against 0.614 for the bag-of-words encoder that is served. Gradient-boosted results move by a few hundredths between CI machines, so they are reported with seed spreads where it matters. The live cluster's steady load leaves near-flat baselines, and its 200 incidents were built by the same project; RCAEval is the independent check.</w:t>
         </w:r>
       </w:ins>
     </w:p>

</xml_diff>